<commit_message>
Update Handbuch und Software Dokumentation: Version 1.1.0
</commit_message>
<xml_diff>
--- a/doc/Software Dokumentation.docx
+++ b/doc/Software Dokumentation.docx
@@ -126,7 +126,7 @@
                                   <w:sdtEndPr/>
                                   <w:sdtContent>
                                     <w:r>
-                                      <w:t>Kreuzbergweg 1a</w:t>
+                                      <w:t>Paul-Dietrich-Straße 14</w:t>
                                     </w:r>
                                     <w:r>
                                       <w:br/>
@@ -235,7 +235,7 @@
                             <w:sdtEndPr/>
                             <w:sdtContent>
                               <w:r>
-                                <w:t>Kreuzbergweg 1a</w:t>
+                                <w:t>Paul-Dietrich-Straße 14</w:t>
                               </w:r>
                               <w:r>
                                 <w:br/>
@@ -341,7 +341,10 @@
                                   <w:ind w:left="0"/>
                                 </w:pPr>
                                 <w:r>
-                                  <w:t>TRudi 1.0</w:t>
+                                  <w:t>TRudi 1.</w:t>
+                                </w:r>
+                                <w:r>
+                                  <w:t>1.0</w:t>
                                 </w:r>
                               </w:p>
                               <w:p>
@@ -422,7 +425,10 @@
                             <w:ind w:left="0"/>
                           </w:pPr>
                           <w:r>
-                            <w:t>TRudi 1.0</w:t>
+                            <w:t>TRudi 1.</w:t>
+                          </w:r>
+                          <w:r>
+                            <w:t>1.0</w:t>
                           </w:r>
                         </w:p>
                         <w:p>
@@ -963,16 +969,67 @@
               <w:t xml:space="preserve"> </w:t>
             </w:r>
             <w:r>
-              <w:t>und Node.js</w:t>
-            </w:r>
-            <w:r>
-              <w:t>-Version</w:t>
-            </w:r>
-            <w:r>
-              <w:t xml:space="preserve"> </w:t>
+              <w:t xml:space="preserve">und Node.js-Version </w:t>
             </w:r>
             <w:r>
               <w:t>angepasst</w:t>
+            </w:r>
+          </w:p>
+        </w:tc>
+      </w:tr>
+      <w:tr>
+        <w:tc>
+          <w:tcPr>
+            <w:cnfStyle w:val="001000000000" w:firstRow="0" w:lastRow="0" w:firstColumn="1" w:lastColumn="0" w:oddVBand="0" w:evenVBand="0" w:oddHBand="0" w:evenHBand="0" w:firstRowFirstColumn="0" w:firstRowLastColumn="0" w:lastRowFirstColumn="0" w:lastRowLastColumn="0"/>
+            <w:tcW w:w="1276" w:type="dxa"/>
+          </w:tcPr>
+          <w:p>
+            <w:r>
+              <w:t>1.5</w:t>
+            </w:r>
+          </w:p>
+        </w:tc>
+        <w:tc>
+          <w:tcPr>
+            <w:tcW w:w="1701" w:type="dxa"/>
+          </w:tcPr>
+          <w:p>
+            <w:pPr>
+              <w:cnfStyle w:val="000000000000" w:firstRow="0" w:lastRow="0" w:firstColumn="0" w:lastColumn="0" w:oddVBand="0" w:evenVBand="0" w:oddHBand="0" w:evenHBand="0" w:firstRowFirstColumn="0" w:firstRowLastColumn="0" w:lastRowFirstColumn="0" w:lastRowLastColumn="0"/>
+            </w:pPr>
+            <w:r>
+              <w:t>21.11.2018</w:t>
+            </w:r>
+          </w:p>
+        </w:tc>
+        <w:tc>
+          <w:tcPr>
+            <w:tcW w:w="1559" w:type="dxa"/>
+          </w:tcPr>
+          <w:p>
+            <w:pPr>
+              <w:cnfStyle w:val="000000000000" w:firstRow="0" w:lastRow="0" w:firstColumn="0" w:lastColumn="0" w:oddVBand="0" w:evenVBand="0" w:oddHBand="0" w:evenHBand="0" w:firstRowFirstColumn="0" w:firstRowLastColumn="0" w:lastRowFirstColumn="0" w:lastRowLastColumn="0"/>
+            </w:pPr>
+            <w:r>
+              <w:t>T. Müller</w:t>
+            </w:r>
+          </w:p>
+        </w:tc>
+        <w:tc>
+          <w:tcPr>
+            <w:tcW w:w="4526" w:type="dxa"/>
+          </w:tcPr>
+          <w:p>
+            <w:pPr>
+              <w:cnfStyle w:val="000000000000" w:firstRow="0" w:lastRow="0" w:firstColumn="0" w:lastColumn="0" w:oddVBand="0" w:evenVBand="0" w:oddHBand="0" w:evenHBand="0" w:firstRowFirstColumn="0" w:firstRowLastColumn="0" w:lastRowFirstColumn="0" w:lastRowLastColumn="0"/>
+            </w:pPr>
+            <w:proofErr w:type="spellStart"/>
+            <w:r>
+              <w:t>TRuDI</w:t>
+            </w:r>
+            <w:proofErr w:type="spellEnd"/>
+            <w:r>
+              <w:t xml:space="preserve"> Version 1.1.0</w:t>
             </w:r>
           </w:p>
         </w:tc>
@@ -2924,7 +2981,6 @@
               <w:b/>
               <w:bCs/>
             </w:rPr>
-            <w:lastRenderedPageBreak/>
             <w:fldChar w:fldCharType="end"/>
           </w:r>
         </w:p>
@@ -2965,10 +3021,24 @@
     </w:p>
     <w:p>
       <w:r>
-        <w:t xml:space="preserve">Die TRuDI </w:t>
-      </w:r>
-      <w:r>
-        <w:t xml:space="preserve">1.0 </w:t>
+        <w:t xml:space="preserve">Die </w:t>
+      </w:r>
+      <w:proofErr w:type="spellStart"/>
+      <w:r>
+        <w:t>TRuDI</w:t>
+      </w:r>
+      <w:proofErr w:type="spellEnd"/>
+      <w:r>
+        <w:t xml:space="preserve"> </w:t>
+      </w:r>
+      <w:r>
+        <w:t>1.</w:t>
+      </w:r>
+      <w:r>
+        <w:t>1.0</w:t>
+      </w:r>
+      <w:r>
+        <w:t xml:space="preserve"> </w:t>
       </w:r>
       <w:r>
         <w:t xml:space="preserve">Anwendung </w:t>
@@ -3007,15 +3077,7 @@
       </w:r>
       <w:proofErr w:type="spellEnd"/>
       <w:r>
-        <w:t xml:space="preserve"> selbst wiederum nutzt den </w:t>
-      </w:r>
-      <w:proofErr w:type="spellStart"/>
-      <w:r>
-        <w:t>Chromium</w:t>
-      </w:r>
-      <w:proofErr w:type="spellEnd"/>
-      <w:r>
-        <w:t xml:space="preserve"> Browser für das Rendern von den in HTML beschriebenen Dialogen. </w:t>
+        <w:t xml:space="preserve"> selbst wiederum nutzt den Chromium Browser für das Rendern von den in HTML beschriebenen Dialogen. </w:t>
       </w:r>
       <w:r>
         <w:t>D</w:t>
@@ -3252,13 +3314,8 @@
                                 </w:r>
                                 <w:proofErr w:type="spellEnd"/>
                                 <w:r>
-                                  <w:t xml:space="preserve"> </w:t>
+                                  <w:t xml:space="preserve"> des Backendprozess</w:t>
                                 </w:r>
-                                <w:proofErr w:type="gramStart"/>
-                                <w:r>
-                                  <w:t>des Backendprozess</w:t>
-                                </w:r>
-                                <w:proofErr w:type="gramEnd"/>
                               </w:p>
                               <w:p>
                                 <w:r>
@@ -3483,7 +3540,15 @@
                       <w:txbxContent>
                         <w:p>
                           <w:r>
-                            <w:t>- Start und Stop des Backendprozess</w:t>
+                            <w:t xml:space="preserve">- Start und </w:t>
+                          </w:r>
+                          <w:proofErr w:type="spellStart"/>
+                          <w:r>
+                            <w:t>Stop</w:t>
+                          </w:r>
+                          <w:proofErr w:type="spellEnd"/>
+                          <w:r>
+                            <w:t xml:space="preserve"> des Backendprozess</w:t>
                           </w:r>
                         </w:p>
                         <w:p>
@@ -3526,7 +3591,15 @@
                     <w:txbxContent>
                       <w:p>
                         <w:r>
-                          <w:t>&lt;&lt;uses&gt;&gt;</w:t>
+                          <w:t>&lt;&lt;</w:t>
+                        </w:r>
+                        <w:proofErr w:type="spellStart"/>
+                        <w:r>
+                          <w:t>uses</w:t>
+                        </w:r>
+                        <w:proofErr w:type="spellEnd"/>
+                        <w:r>
+                          <w:t>&gt;&gt;</w:t>
                         </w:r>
                       </w:p>
                     </w:txbxContent>
@@ -3602,14 +3675,36 @@
                             <w:r>
                               <w:t xml:space="preserve">Abbildung </w:t>
                             </w:r>
-                            <w:fldSimple w:instr=" SEQ Abbildung \* ARABIC ">
-                              <w:r>
-                                <w:rPr>
-                                  <w:noProof/>
-                                </w:rPr>
-                                <w:t>1</w:t>
-                              </w:r>
-                            </w:fldSimple>
+                            <w:r>
+                              <w:rPr>
+                                <w:noProof/>
+                              </w:rPr>
+                              <w:fldChar w:fldCharType="begin"/>
+                            </w:r>
+                            <w:r>
+                              <w:rPr>
+                                <w:noProof/>
+                              </w:rPr>
+                              <w:instrText xml:space="preserve"> SEQ Abbildung \* ARABIC </w:instrText>
+                            </w:r>
+                            <w:r>
+                              <w:rPr>
+                                <w:noProof/>
+                              </w:rPr>
+                              <w:fldChar w:fldCharType="separate"/>
+                            </w:r>
+                            <w:r>
+                              <w:rPr>
+                                <w:noProof/>
+                              </w:rPr>
+                              <w:t>1</w:t>
+                            </w:r>
+                            <w:r>
+                              <w:rPr>
+                                <w:noProof/>
+                              </w:rPr>
+                              <w:fldChar w:fldCharType="end"/>
+                            </w:r>
                             <w:r>
                               <w:t xml:space="preserve"> Softwarestruktur</w:t>
                             </w:r>
@@ -3647,12 +3742,21 @@
                         <w:t xml:space="preserve">Abbildung </w:t>
                       </w:r>
                       <w:r>
+                        <w:rPr>
+                          <w:noProof/>
+                        </w:rPr>
                         <w:fldChar w:fldCharType="begin"/>
                       </w:r>
                       <w:r>
+                        <w:rPr>
+                          <w:noProof/>
+                        </w:rPr>
                         <w:instrText xml:space="preserve"> SEQ Abbildung \* ARABIC </w:instrText>
                       </w:r>
                       <w:r>
+                        <w:rPr>
+                          <w:noProof/>
+                        </w:rPr>
                         <w:fldChar w:fldCharType="separate"/>
                       </w:r>
                       <w:r>
@@ -3694,14 +3798,36 @@
       <w:r>
         <w:t xml:space="preserve">Tabelle </w:t>
       </w:r>
-      <w:fldSimple w:instr=" SEQ Tabelle \* ARABIC ">
-        <w:r>
-          <w:rPr>
-            <w:noProof/>
-          </w:rPr>
-          <w:t>1</w:t>
-        </w:r>
-      </w:fldSimple>
+      <w:r>
+        <w:rPr>
+          <w:noProof/>
+        </w:rPr>
+        <w:fldChar w:fldCharType="begin"/>
+      </w:r>
+      <w:r>
+        <w:rPr>
+          <w:noProof/>
+        </w:rPr>
+        <w:instrText xml:space="preserve"> SEQ Tabelle \* ARABIC </w:instrText>
+      </w:r>
+      <w:r>
+        <w:rPr>
+          <w:noProof/>
+        </w:rPr>
+        <w:fldChar w:fldCharType="separate"/>
+      </w:r>
+      <w:r>
+        <w:rPr>
+          <w:noProof/>
+        </w:rPr>
+        <w:t>1</w:t>
+      </w:r>
+      <w:r>
+        <w:rPr>
+          <w:noProof/>
+        </w:rPr>
+        <w:fldChar w:fldCharType="end"/>
+      </w:r>
       <w:r>
         <w:t xml:space="preserve"> </w:t>
       </w:r>
@@ -3974,8 +4100,6 @@
             <w:r>
               <w:t>8.11.1</w:t>
             </w:r>
-            <w:bookmarkStart w:id="2" w:name="_GoBack"/>
-            <w:bookmarkEnd w:id="2"/>
           </w:p>
         </w:tc>
         <w:tc>
@@ -3999,11 +4123,9 @@
             <w:tcW w:w="2961" w:type="dxa"/>
           </w:tcPr>
           <w:p>
-            <w:proofErr w:type="spellStart"/>
             <w:r>
               <w:t>Chromium</w:t>
             </w:r>
-            <w:proofErr w:type="spellEnd"/>
           </w:p>
         </w:tc>
         <w:tc>
@@ -4132,22 +4254,22 @@
       <w:pPr>
         <w:pStyle w:val="berschrift1"/>
       </w:pPr>
-      <w:bookmarkStart w:id="3" w:name="_Toc495435548"/>
+      <w:bookmarkStart w:id="2" w:name="_Toc495435548"/>
       <w:r>
         <w:lastRenderedPageBreak/>
         <w:t>Frontend</w:t>
       </w:r>
-      <w:bookmarkEnd w:id="3"/>
+      <w:bookmarkEnd w:id="2"/>
     </w:p>
     <w:p>
       <w:pPr>
         <w:pStyle w:val="berschrift2"/>
       </w:pPr>
-      <w:bookmarkStart w:id="4" w:name="_Toc495435549"/>
+      <w:bookmarkStart w:id="3" w:name="_Toc495435549"/>
       <w:r>
         <w:t>Starten und Beenden der Anwendung</w:t>
       </w:r>
-      <w:bookmarkEnd w:id="4"/>
+      <w:bookmarkEnd w:id="3"/>
     </w:p>
     <w:p>
       <w:pPr>
@@ -4202,14 +4324,36 @@
       <w:r>
         <w:t xml:space="preserve">Abbildung </w:t>
       </w:r>
-      <w:fldSimple w:instr=" SEQ Abbildung \* ARABIC ">
-        <w:r>
-          <w:rPr>
-            <w:noProof/>
-          </w:rPr>
-          <w:t>2</w:t>
-        </w:r>
-      </w:fldSimple>
+      <w:r>
+        <w:rPr>
+          <w:noProof/>
+        </w:rPr>
+        <w:fldChar w:fldCharType="begin"/>
+      </w:r>
+      <w:r>
+        <w:rPr>
+          <w:noProof/>
+        </w:rPr>
+        <w:instrText xml:space="preserve"> SEQ Abbildung \* ARABIC </w:instrText>
+      </w:r>
+      <w:r>
+        <w:rPr>
+          <w:noProof/>
+        </w:rPr>
+        <w:fldChar w:fldCharType="separate"/>
+      </w:r>
+      <w:r>
+        <w:rPr>
+          <w:noProof/>
+        </w:rPr>
+        <w:t>2</w:t>
+      </w:r>
+      <w:r>
+        <w:rPr>
+          <w:noProof/>
+        </w:rPr>
+        <w:fldChar w:fldCharType="end"/>
+      </w:r>
       <w:r>
         <w:t xml:space="preserve"> Lebenszyklus Frontend</w:t>
       </w:r>
@@ -4221,16 +4365,16 @@
       <w:pPr>
         <w:pStyle w:val="berschrift3"/>
       </w:pPr>
-      <w:bookmarkStart w:id="5" w:name="_Ref493159432"/>
-      <w:bookmarkStart w:id="6" w:name="_Toc495435550"/>
+      <w:bookmarkStart w:id="4" w:name="_Ref493159432"/>
+      <w:bookmarkStart w:id="5" w:name="_Toc495435550"/>
       <w:r>
         <w:t>Implementierung</w:t>
       </w:r>
       <w:r>
         <w:t xml:space="preserve"> Integritätscheck</w:t>
       </w:r>
+      <w:bookmarkEnd w:id="4"/>
       <w:bookmarkEnd w:id="5"/>
-      <w:bookmarkEnd w:id="6"/>
     </w:p>
     <w:p>
       <w:r>
@@ -4351,7 +4495,7 @@
           <w:lang w:val="en-US"/>
         </w:rPr>
       </w:pPr>
-      <w:bookmarkStart w:id="7" w:name="_Toc495435551"/>
+      <w:bookmarkStart w:id="6" w:name="_Toc495435551"/>
       <w:r>
         <w:rPr>
           <w:lang w:val="en-US"/>
@@ -4378,7 +4522,7 @@
         </w:rPr>
         <w:t>des Backends</w:t>
       </w:r>
-      <w:bookmarkEnd w:id="7"/>
+      <w:bookmarkEnd w:id="6"/>
     </w:p>
     <w:p>
       <w:r>
@@ -4550,13 +4694,13 @@
       <w:pPr>
         <w:pStyle w:val="berschrift3"/>
       </w:pPr>
-      <w:bookmarkStart w:id="8" w:name="_Ref493159554"/>
-      <w:bookmarkStart w:id="9" w:name="_Toc495435552"/>
+      <w:bookmarkStart w:id="7" w:name="_Ref493159554"/>
+      <w:bookmarkStart w:id="8" w:name="_Toc495435552"/>
       <w:r>
         <w:t>Identität der Software</w:t>
       </w:r>
+      <w:bookmarkEnd w:id="7"/>
       <w:bookmarkEnd w:id="8"/>
-      <w:bookmarkEnd w:id="9"/>
     </w:p>
     <w:p>
       <w:r>
@@ -4634,27 +4778,27 @@
       <w:pPr>
         <w:pStyle w:val="berschrift1"/>
       </w:pPr>
-      <w:bookmarkStart w:id="10" w:name="_Ref493150984"/>
-      <w:bookmarkStart w:id="11" w:name="_Toc495435553"/>
+      <w:bookmarkStart w:id="9" w:name="_Ref493150984"/>
+      <w:bookmarkStart w:id="10" w:name="_Toc495435553"/>
       <w:r>
         <w:lastRenderedPageBreak/>
         <w:t>Benutzeroberfläche</w:t>
       </w:r>
+      <w:bookmarkEnd w:id="9"/>
       <w:bookmarkEnd w:id="10"/>
-      <w:bookmarkEnd w:id="11"/>
     </w:p>
     <w:p>
       <w:pPr>
         <w:pStyle w:val="berschrift2"/>
       </w:pPr>
-      <w:bookmarkStart w:id="12" w:name="_Toc495435554"/>
+      <w:bookmarkStart w:id="11" w:name="_Toc495435554"/>
       <w:r>
         <w:t xml:space="preserve">Übersicht der </w:t>
       </w:r>
       <w:r>
         <w:t>Ansichten</w:t>
       </w:r>
-      <w:bookmarkEnd w:id="12"/>
+      <w:bookmarkEnd w:id="11"/>
     </w:p>
     <w:p>
       <w:pPr>
@@ -4687,14 +4831,36 @@
       <w:r>
         <w:t xml:space="preserve">Abbildung </w:t>
       </w:r>
-      <w:fldSimple w:instr=" SEQ Abbildung \* ARABIC ">
-        <w:r>
-          <w:rPr>
-            <w:noProof/>
-          </w:rPr>
-          <w:t>3</w:t>
-        </w:r>
-      </w:fldSimple>
+      <w:r>
+        <w:rPr>
+          <w:noProof/>
+        </w:rPr>
+        <w:fldChar w:fldCharType="begin"/>
+      </w:r>
+      <w:r>
+        <w:rPr>
+          <w:noProof/>
+        </w:rPr>
+        <w:instrText xml:space="preserve"> SEQ Abbildung \* ARABIC </w:instrText>
+      </w:r>
+      <w:r>
+        <w:rPr>
+          <w:noProof/>
+        </w:rPr>
+        <w:fldChar w:fldCharType="separate"/>
+      </w:r>
+      <w:r>
+        <w:rPr>
+          <w:noProof/>
+        </w:rPr>
+        <w:t>3</w:t>
+      </w:r>
+      <w:r>
+        <w:rPr>
+          <w:noProof/>
+        </w:rPr>
+        <w:fldChar w:fldCharType="end"/>
+      </w:r>
       <w:r>
         <w:t xml:space="preserve"> Hierarchie der Anwendungsdialoge</w:t>
       </w:r>
@@ -4703,11 +4869,11 @@
       <w:pPr>
         <w:pStyle w:val="berschrift2"/>
       </w:pPr>
-      <w:bookmarkStart w:id="13" w:name="_Toc495435555"/>
+      <w:bookmarkStart w:id="12" w:name="_Toc495435555"/>
       <w:r>
         <w:t>Beschreibung der Ansichten</w:t>
       </w:r>
-      <w:bookmarkEnd w:id="13"/>
+      <w:bookmarkEnd w:id="12"/>
     </w:p>
     <w:p>
       <w:r>
@@ -4729,18 +4895,18 @@
       <w:pPr>
         <w:pStyle w:val="berschrift2"/>
       </w:pPr>
-      <w:bookmarkStart w:id="14" w:name="_Toc495435556"/>
+      <w:bookmarkStart w:id="13" w:name="_Toc495435556"/>
       <w:r>
         <w:lastRenderedPageBreak/>
         <w:t>Backend</w:t>
       </w:r>
-      <w:bookmarkEnd w:id="14"/>
+      <w:bookmarkEnd w:id="13"/>
     </w:p>
     <w:p>
       <w:pPr>
         <w:pStyle w:val="berschrift3"/>
       </w:pPr>
-      <w:bookmarkStart w:id="15" w:name="_Toc495435557"/>
+      <w:bookmarkStart w:id="14" w:name="_Toc495435557"/>
       <w:r>
         <w:t xml:space="preserve">Übersicht der Komponenten des </w:t>
       </w:r>
@@ -4748,7 +4914,7 @@
       <w:r>
         <w:t>Backends</w:t>
       </w:r>
-      <w:bookmarkEnd w:id="15"/>
+      <w:bookmarkEnd w:id="14"/>
       <w:proofErr w:type="spellEnd"/>
     </w:p>
     <w:p>
@@ -4817,16 +4983,46 @@
       <w:r>
         <w:t xml:space="preserve">Abbildung </w:t>
       </w:r>
-      <w:fldSimple w:instr=" SEQ Abbildung \* ARABIC ">
-        <w:r>
-          <w:rPr>
-            <w:noProof/>
-          </w:rPr>
-          <w:t>4</w:t>
-        </w:r>
-      </w:fldSimple>
-      <w:r>
-        <w:t xml:space="preserve"> Pakete des TRuDI </w:t>
+      <w:r>
+        <w:rPr>
+          <w:noProof/>
+        </w:rPr>
+        <w:fldChar w:fldCharType="begin"/>
+      </w:r>
+      <w:r>
+        <w:rPr>
+          <w:noProof/>
+        </w:rPr>
+        <w:instrText xml:space="preserve"> SEQ Abbildung \* ARABIC </w:instrText>
+      </w:r>
+      <w:r>
+        <w:rPr>
+          <w:noProof/>
+        </w:rPr>
+        <w:fldChar w:fldCharType="separate"/>
+      </w:r>
+      <w:r>
+        <w:rPr>
+          <w:noProof/>
+        </w:rPr>
+        <w:t>4</w:t>
+      </w:r>
+      <w:r>
+        <w:rPr>
+          <w:noProof/>
+        </w:rPr>
+        <w:fldChar w:fldCharType="end"/>
+      </w:r>
+      <w:r>
+        <w:t xml:space="preserve"> Pakete des </w:t>
+      </w:r>
+      <w:proofErr w:type="spellStart"/>
+      <w:r>
+        <w:t>TRuDI</w:t>
+      </w:r>
+      <w:proofErr w:type="spellEnd"/>
+      <w:r>
+        <w:t xml:space="preserve"> </w:t>
       </w:r>
       <w:proofErr w:type="spellStart"/>
       <w:r>
@@ -5014,17 +5210,17 @@
       <w:pPr>
         <w:pStyle w:val="berschrift3"/>
       </w:pPr>
-      <w:bookmarkStart w:id="16" w:name="_Ref493157556"/>
-      <w:bookmarkStart w:id="17" w:name="_Ref493157576"/>
-      <w:bookmarkStart w:id="18" w:name="_Ref493157593"/>
-      <w:bookmarkStart w:id="19" w:name="_Toc495435558"/>
+      <w:bookmarkStart w:id="15" w:name="_Ref493157556"/>
+      <w:bookmarkStart w:id="16" w:name="_Ref493157576"/>
+      <w:bookmarkStart w:id="17" w:name="_Ref493157593"/>
+      <w:bookmarkStart w:id="18" w:name="_Toc495435558"/>
       <w:r>
         <w:t>Gerätekommunikation</w:t>
       </w:r>
+      <w:bookmarkEnd w:id="15"/>
       <w:bookmarkEnd w:id="16"/>
       <w:bookmarkEnd w:id="17"/>
       <w:bookmarkEnd w:id="18"/>
-      <w:bookmarkEnd w:id="19"/>
     </w:p>
     <w:p>
       <w:r>
@@ -5151,20 +5347,11 @@
             <w:pPr>
               <w:cnfStyle w:val="000000100000" w:firstRow="0" w:lastRow="0" w:firstColumn="0" w:lastColumn="0" w:oddVBand="0" w:evenVBand="0" w:oddHBand="1" w:evenHBand="0" w:firstRowFirstColumn="0" w:firstRowLastColumn="0" w:lastRowFirstColumn="0" w:lastRowLastColumn="0"/>
             </w:pPr>
-            <w:hyperlink r:id="rId25" w:history="1">
-              <w:proofErr w:type="spellStart"/>
-              <w:r>
-                <w:rPr>
-                  <w:rStyle w:val="Hyperlink"/>
-                  <w:rFonts w:ascii="Consolas" w:hAnsi="Consolas" w:cs="Consolas"/>
-                  <w:kern w:val="0"/>
-                  <w:sz w:val="19"/>
-                  <w:szCs w:val="19"/>
-                </w:rPr>
-                <w:t>HanAdapterPpc</w:t>
-              </w:r>
-              <w:proofErr w:type="spellEnd"/>
-            </w:hyperlink>
+            <w:proofErr w:type="spellStart"/>
+            <w:r>
+              <w:t>HanAdapterPpc</w:t>
+            </w:r>
+            <w:proofErr w:type="spellEnd"/>
           </w:p>
         </w:tc>
       </w:tr>
@@ -5199,25 +5386,13 @@
           </w:tcPr>
           <w:p>
             <w:pPr>
-              <w:tabs>
-                <w:tab w:val="left" w:pos="1095"/>
-              </w:tabs>
               <w:cnfStyle w:val="000000000000" w:firstRow="0" w:lastRow="0" w:firstColumn="0" w:lastColumn="0" w:oddVBand="0" w:evenVBand="0" w:oddHBand="0" w:evenHBand="0" w:firstRowFirstColumn="0" w:firstRowLastColumn="0" w:lastRowFirstColumn="0" w:lastRowLastColumn="0"/>
             </w:pPr>
-            <w:hyperlink r:id="rId26" w:history="1">
-              <w:proofErr w:type="spellStart"/>
-              <w:r>
-                <w:rPr>
-                  <w:rStyle w:val="Hyperlink"/>
-                  <w:rFonts w:ascii="Consolas" w:hAnsi="Consolas" w:cs="Consolas"/>
-                  <w:kern w:val="0"/>
-                  <w:sz w:val="19"/>
-                  <w:szCs w:val="19"/>
-                </w:rPr>
-                <w:t>HanAdapterThebenAG</w:t>
-              </w:r>
-              <w:proofErr w:type="spellEnd"/>
-            </w:hyperlink>
+            <w:proofErr w:type="spellStart"/>
+            <w:r>
+              <w:t>HanAdapterThebenAG</w:t>
+            </w:r>
+            <w:proofErr w:type="spellEnd"/>
           </w:p>
         </w:tc>
       </w:tr>
@@ -5262,20 +5437,11 @@
             <w:pPr>
               <w:cnfStyle w:val="000000100000" w:firstRow="0" w:lastRow="0" w:firstColumn="0" w:lastColumn="0" w:oddVBand="0" w:evenVBand="0" w:oddHBand="1" w:evenHBand="0" w:firstRowFirstColumn="0" w:firstRowLastColumn="0" w:lastRowFirstColumn="0" w:lastRowLastColumn="0"/>
             </w:pPr>
-            <w:hyperlink r:id="rId27" w:history="1">
-              <w:proofErr w:type="spellStart"/>
-              <w:r>
-                <w:rPr>
-                  <w:rStyle w:val="Hyperlink"/>
-                  <w:rFonts w:ascii="Consolas" w:hAnsi="Consolas" w:cs="Consolas"/>
-                  <w:kern w:val="0"/>
-                  <w:sz w:val="19"/>
-                  <w:szCs w:val="19"/>
-                </w:rPr>
-                <w:t>HanAdapterLandisGyr</w:t>
-              </w:r>
-              <w:proofErr w:type="spellEnd"/>
-            </w:hyperlink>
+            <w:proofErr w:type="spellStart"/>
+            <w:r>
+              <w:t>HanAdapterLandisGyr</w:t>
+            </w:r>
+            <w:proofErr w:type="spellEnd"/>
           </w:p>
         </w:tc>
       </w:tr>
@@ -5317,20 +5483,11 @@
             <w:pPr>
               <w:cnfStyle w:val="000000000000" w:firstRow="0" w:lastRow="0" w:firstColumn="0" w:lastColumn="0" w:oddVBand="0" w:evenVBand="0" w:oddHBand="0" w:evenHBand="0" w:firstRowFirstColumn="0" w:firstRowLastColumn="0" w:lastRowFirstColumn="0" w:lastRowLastColumn="0"/>
             </w:pPr>
-            <w:hyperlink r:id="rId28" w:history="1">
-              <w:proofErr w:type="spellStart"/>
-              <w:r>
-                <w:rPr>
-                  <w:rStyle w:val="Hyperlink"/>
-                  <w:rFonts w:ascii="Consolas" w:hAnsi="Consolas" w:cs="Consolas"/>
-                  <w:kern w:val="0"/>
-                  <w:sz w:val="19"/>
-                  <w:szCs w:val="19"/>
-                </w:rPr>
-                <w:t>HanAdapterDrNeuhaus</w:t>
-              </w:r>
-              <w:proofErr w:type="spellEnd"/>
-            </w:hyperlink>
+            <w:proofErr w:type="spellStart"/>
+            <w:r>
+              <w:t>HanAdapterDrNeuhaus</w:t>
+            </w:r>
+            <w:proofErr w:type="spellEnd"/>
           </w:p>
         </w:tc>
       </w:tr>
@@ -5375,23 +5532,13 @@
           </w:tcPr>
           <w:p>
             <w:pPr>
-              <w:keepNext/>
               <w:cnfStyle w:val="000000100000" w:firstRow="0" w:lastRow="0" w:firstColumn="0" w:lastColumn="0" w:oddVBand="0" w:evenVBand="0" w:oddHBand="1" w:evenHBand="0" w:firstRowFirstColumn="0" w:firstRowLastColumn="0" w:lastRowFirstColumn="0" w:lastRowLastColumn="0"/>
             </w:pPr>
-            <w:hyperlink r:id="rId29" w:history="1">
-              <w:proofErr w:type="spellStart"/>
-              <w:r>
-                <w:rPr>
-                  <w:rStyle w:val="Hyperlink"/>
-                  <w:rFonts w:ascii="Consolas" w:hAnsi="Consolas" w:cs="Consolas"/>
-                  <w:kern w:val="0"/>
-                  <w:sz w:val="19"/>
-                  <w:szCs w:val="19"/>
-                </w:rPr>
-                <w:t>HanAdapterKiwigrid</w:t>
-              </w:r>
-              <w:proofErr w:type="spellEnd"/>
-            </w:hyperlink>
+            <w:proofErr w:type="spellStart"/>
+            <w:r>
+              <w:t>HanAdapterKiwigrid</w:t>
+            </w:r>
+            <w:proofErr w:type="spellEnd"/>
           </w:p>
         </w:tc>
       </w:tr>
@@ -5432,9 +5579,99 @@
           </w:tcPr>
           <w:p>
             <w:pPr>
+              <w:cnfStyle w:val="000000000000" w:firstRow="0" w:lastRow="0" w:firstColumn="0" w:lastColumn="0" w:oddVBand="0" w:evenVBand="0" w:oddHBand="0" w:evenHBand="0" w:firstRowFirstColumn="0" w:firstRowLastColumn="0" w:lastRowFirstColumn="0" w:lastRowLastColumn="0"/>
+            </w:pPr>
+          </w:p>
+        </w:tc>
+      </w:tr>
+      <w:tr>
+        <w:trPr>
+          <w:cnfStyle w:val="000000100000" w:firstRow="0" w:lastRow="0" w:firstColumn="0" w:lastColumn="0" w:oddVBand="0" w:evenVBand="0" w:oddHBand="1" w:evenHBand="0" w:firstRowFirstColumn="0" w:firstRowLastColumn="0" w:lastRowFirstColumn="0" w:lastRowLastColumn="0"/>
+        </w:trPr>
+        <w:tc>
+          <w:tcPr>
+            <w:cnfStyle w:val="001000000000" w:firstRow="0" w:lastRow="0" w:firstColumn="1" w:lastColumn="0" w:oddVBand="0" w:evenVBand="0" w:oddHBand="0" w:evenHBand="0" w:firstRowFirstColumn="0" w:firstRowLastColumn="0" w:lastRowFirstColumn="0" w:lastRowLastColumn="0"/>
+            <w:tcW w:w="1586" w:type="dxa"/>
+          </w:tcPr>
+          <w:p>
+            <w:r>
+              <w:t>EFR</w:t>
+            </w:r>
+          </w:p>
+        </w:tc>
+        <w:tc>
+          <w:tcPr>
+            <w:tcW w:w="3371" w:type="dxa"/>
+          </w:tcPr>
+          <w:p>
+            <w:pPr>
+              <w:cnfStyle w:val="000000100000" w:firstRow="0" w:lastRow="0" w:firstColumn="0" w:lastColumn="0" w:oddVBand="0" w:evenVBand="0" w:oddHBand="1" w:evenHBand="0" w:firstRowFirstColumn="0" w:firstRowLastColumn="0" w:lastRowFirstColumn="0" w:lastRowLastColumn="0"/>
+            </w:pPr>
+            <w:r>
+              <w:t>EFR - Europäische Funk-Rundsteuerung GmbH</w:t>
+            </w:r>
+          </w:p>
+        </w:tc>
+        <w:tc>
+          <w:tcPr>
+            <w:tcW w:w="4089" w:type="dxa"/>
+          </w:tcPr>
+          <w:p>
+            <w:pPr>
+              <w:cnfStyle w:val="000000100000" w:firstRow="0" w:lastRow="0" w:firstColumn="0" w:lastColumn="0" w:oddVBand="0" w:evenVBand="0" w:oddHBand="1" w:evenHBand="0" w:firstRowFirstColumn="0" w:firstRowLastColumn="0" w:lastRowFirstColumn="0" w:lastRowLastColumn="0"/>
+            </w:pPr>
+            <w:proofErr w:type="spellStart"/>
+            <w:r>
+              <w:t>HanAdapterEfr</w:t>
+            </w:r>
+            <w:proofErr w:type="spellEnd"/>
+          </w:p>
+        </w:tc>
+      </w:tr>
+      <w:tr>
+        <w:tc>
+          <w:tcPr>
+            <w:cnfStyle w:val="001000000000" w:firstRow="0" w:lastRow="0" w:firstColumn="1" w:lastColumn="0" w:oddVBand="0" w:evenVBand="0" w:oddHBand="0" w:evenHBand="0" w:firstRowFirstColumn="0" w:firstRowLastColumn="0" w:lastRowFirstColumn="0" w:lastRowLastColumn="0"/>
+            <w:tcW w:w="1586" w:type="dxa"/>
+          </w:tcPr>
+          <w:p>
+            <w:r>
+              <w:t>DGY</w:t>
+            </w:r>
+          </w:p>
+        </w:tc>
+        <w:tc>
+          <w:tcPr>
+            <w:tcW w:w="3371" w:type="dxa"/>
+          </w:tcPr>
+          <w:p>
+            <w:pPr>
+              <w:cnfStyle w:val="000000000000" w:firstRow="0" w:lastRow="0" w:firstColumn="0" w:lastColumn="0" w:oddVBand="0" w:evenVBand="0" w:oddHBand="0" w:evenHBand="0" w:firstRowFirstColumn="0" w:firstRowLastColumn="0" w:lastRowFirstColumn="0" w:lastRowLastColumn="0"/>
+            </w:pPr>
+            <w:proofErr w:type="spellStart"/>
+            <w:r>
+              <w:t>Discovergy</w:t>
+            </w:r>
+            <w:proofErr w:type="spellEnd"/>
+            <w:r>
+              <w:t xml:space="preserve"> GmbH</w:t>
+            </w:r>
+          </w:p>
+        </w:tc>
+        <w:tc>
+          <w:tcPr>
+            <w:tcW w:w="4089" w:type="dxa"/>
+          </w:tcPr>
+          <w:p>
+            <w:pPr>
               <w:keepNext/>
               <w:cnfStyle w:val="000000000000" w:firstRow="0" w:lastRow="0" w:firstColumn="0" w:lastColumn="0" w:oddVBand="0" w:evenVBand="0" w:oddHBand="0" w:evenHBand="0" w:firstRowFirstColumn="0" w:firstRowLastColumn="0" w:lastRowFirstColumn="0" w:lastRowLastColumn="0"/>
             </w:pPr>
+            <w:proofErr w:type="spellStart"/>
+            <w:r>
+              <w:t>HanAdapterDiscovergy</w:t>
+            </w:r>
+            <w:proofErr w:type="spellEnd"/>
           </w:p>
         </w:tc>
       </w:tr>
@@ -5446,20 +5683,44 @@
       <w:r>
         <w:t xml:space="preserve">Tabelle </w:t>
       </w:r>
-      <w:fldSimple w:instr=" SEQ Tabelle \* ARABIC ">
-        <w:r>
-          <w:rPr>
-            <w:noProof/>
-          </w:rPr>
-          <w:t>2</w:t>
-        </w:r>
-      </w:fldSimple>
+      <w:r>
+        <w:rPr>
+          <w:noProof/>
+        </w:rPr>
+        <w:fldChar w:fldCharType="begin"/>
+      </w:r>
+      <w:r>
+        <w:rPr>
+          <w:noProof/>
+        </w:rPr>
+        <w:instrText xml:space="preserve"> SEQ Tabelle \* ARABIC </w:instrText>
+      </w:r>
+      <w:r>
+        <w:rPr>
+          <w:noProof/>
+        </w:rPr>
+        <w:fldChar w:fldCharType="separate"/>
+      </w:r>
+      <w:r>
+        <w:rPr>
+          <w:noProof/>
+        </w:rPr>
+        <w:t>2</w:t>
+      </w:r>
+      <w:r>
+        <w:rPr>
+          <w:noProof/>
+        </w:rPr>
+        <w:fldChar w:fldCharType="end"/>
+      </w:r>
       <w:r>
         <w:t xml:space="preserve"> </w:t>
       </w:r>
       <w:r>
         <w:t>Liste der HAN Adapter</w:t>
       </w:r>
+      <w:bookmarkStart w:id="19" w:name="_GoBack"/>
+      <w:bookmarkEnd w:id="19"/>
     </w:p>
     <w:p>
       <w:r>
@@ -5479,7 +5740,7 @@
       <w:r>
         <w:t xml:space="preserve">und der darin enthaltenen Implementierung von </w:t>
       </w:r>
-      <w:hyperlink r:id="rId30" w:history="1">
+      <w:hyperlink r:id="rId25" w:history="1">
         <w:proofErr w:type="spellStart"/>
         <w:r>
           <w:rPr>
@@ -5614,7 +5875,7 @@
       <w:r>
         <w:t xml:space="preserve">Namespace und Name der Klasse welche </w:t>
       </w:r>
-      <w:hyperlink r:id="rId31" w:history="1">
+      <w:hyperlink r:id="rId26" w:history="1">
         <w:proofErr w:type="spellStart"/>
         <w:r>
           <w:rPr>
@@ -6037,6 +6298,7 @@
     </w:p>
     <w:p>
       <w:r>
+        <w:lastRenderedPageBreak/>
         <w:t xml:space="preserve">Zur Gerätekommunikation steht </w:t>
       </w:r>
       <w:r>
@@ -6084,11 +6346,7 @@
         <w:footnoteReference w:id="2"/>
       </w:r>
       <w:r>
-        <w:t xml:space="preserve">. Die </w:t>
-      </w:r>
-      <w:r>
-        <w:lastRenderedPageBreak/>
-        <w:t>Implementierung wurde</w:t>
+        <w:t>. Die Implementierung wurde</w:t>
       </w:r>
       <w:r>
         <w:t xml:space="preserve"> jedoch</w:t>
@@ -6199,10 +6457,10 @@
             <v:path o:extrusionok="f" gradientshapeok="t" o:connecttype="rect"/>
             <o:lock v:ext="edit" aspectratio="t"/>
           </v:shapetype>
-          <v:shape id="_x0000_i1025" type="#_x0000_t75" style="width:199.5pt;height:450.75pt" o:ole="">
-            <v:imagedata r:id="rId32" o:title=""/>
+          <v:shape id="_x0000_i1025" type="#_x0000_t75" style="width:199.5pt;height:450.5pt" o:ole="">
+            <v:imagedata r:id="rId27" o:title=""/>
           </v:shape>
-          <o:OLEObject Type="Embed" ProgID="Visio.Drawing.15" ShapeID="_x0000_i1025" DrawAspect="Content" ObjectID="_1587912194" r:id="rId33"/>
+          <o:OLEObject Type="Embed" ProgID="Visio.Drawing.15" ShapeID="_x0000_i1025" DrawAspect="Content" ObjectID="_1604314484" r:id="rId28"/>
         </w:object>
       </w:r>
     </w:p>
@@ -6213,14 +6471,36 @@
       <w:r>
         <w:t xml:space="preserve">Abbildung </w:t>
       </w:r>
-      <w:fldSimple w:instr=" SEQ Abbildung \* ARABIC ">
-        <w:r>
-          <w:rPr>
-            <w:noProof/>
-          </w:rPr>
-          <w:t>5</w:t>
-        </w:r>
-      </w:fldSimple>
+      <w:r>
+        <w:rPr>
+          <w:noProof/>
+        </w:rPr>
+        <w:fldChar w:fldCharType="begin"/>
+      </w:r>
+      <w:r>
+        <w:rPr>
+          <w:noProof/>
+        </w:rPr>
+        <w:instrText xml:space="preserve"> SEQ Abbildung \* ARABIC </w:instrText>
+      </w:r>
+      <w:r>
+        <w:rPr>
+          <w:noProof/>
+        </w:rPr>
+        <w:fldChar w:fldCharType="separate"/>
+      </w:r>
+      <w:r>
+        <w:rPr>
+          <w:noProof/>
+        </w:rPr>
+        <w:t>5</w:t>
+      </w:r>
+      <w:r>
+        <w:rPr>
+          <w:noProof/>
+        </w:rPr>
+        <w:fldChar w:fldCharType="end"/>
+      </w:r>
       <w:r>
         <w:t xml:space="preserve"> Adapterkommunikation</w:t>
       </w:r>
@@ -6267,7 +6547,11 @@
         <w:t xml:space="preserve"> mit zugehörigem privaten Schlüssel</w:t>
       </w:r>
       <w:r>
-        <w:t xml:space="preserve"> zur Anmeldung am SMGW übergeben</w:t>
+        <w:t xml:space="preserve"> zur Anmeldung am SMGW </w:t>
+      </w:r>
+      <w:r>
+        <w:lastRenderedPageBreak/>
+        <w:t>übergeben</w:t>
       </w:r>
       <w:r>
         <w:t xml:space="preserve"> wird, dann wird dieses Zertifikat bereits im Rahmen des TLS-Handshakes genutzt. Im Falle der Anmeldung per Benutzername/Passwort ist ein dem TLS-Verbindungsaufbau nachgelagertes Anmeldeprotokoll wie z.B. HTTP Digest Authentication anzuwenden. Dieses Anmeldeprotokoll ist je nach SMGW-Hersteller unterschiedlich umgesetzt und ist deshalb Teil der Implementierung des HAN-Adapters.</w:t>
@@ -6355,7 +6639,7 @@
       <w:r>
         <w:t xml:space="preserve">Das zentrale Datenmodell des Backends bildet die Klasse </w:t>
       </w:r>
-      <w:hyperlink r:id="rId34" w:history="1">
+      <w:hyperlink r:id="rId29" w:history="1">
         <w:r>
           <w:rPr>
             <w:rStyle w:val="Hyperlink"/>
@@ -6367,7 +6651,7 @@
       <w:r>
         <w:t xml:space="preserve">. Beim Start der ASP.NET Anwendung wird ein Objekt des </w:t>
       </w:r>
-      <w:hyperlink r:id="rId35" w:history="1">
+      <w:hyperlink r:id="rId30" w:history="1">
         <w:r>
           <w:rPr>
             <w:rStyle w:val="Hyperlink"/>
@@ -6385,7 +6669,7 @@
       <w:r>
         <w:t xml:space="preserve">als Singleton angelegt und per Dependency Injection allen Controllern übergeben. Der </w:t>
       </w:r>
-      <w:hyperlink r:id="rId36" w:history="1">
+      <w:hyperlink r:id="rId31" w:history="1">
         <w:r>
           <w:rPr>
             <w:rStyle w:val="Hyperlink"/>
@@ -6406,10 +6690,9 @@
     </w:p>
     <w:p>
       <w:r>
-        <w:lastRenderedPageBreak/>
         <w:t xml:space="preserve">Die Objektmodelle für die Adapterkommunikation und die TAF-Berechnung sind in der Komponente </w:t>
       </w:r>
-      <w:hyperlink r:id="rId37" w:history="1">
+      <w:hyperlink r:id="rId32" w:history="1">
         <w:r>
           <w:rPr>
             <w:rStyle w:val="Hyperlink"/>
@@ -6453,7 +6736,7 @@
       <w:r>
         <w:t xml:space="preserve"> (</w:t>
       </w:r>
-      <w:hyperlink r:id="rId38" w:history="1">
+      <w:hyperlink r:id="rId33" w:history="1">
         <w:r>
           <w:rPr>
             <w:rStyle w:val="Hyperlink"/>
@@ -6486,7 +6769,7 @@
       <w:r>
         <w:t xml:space="preserve"> (</w:t>
       </w:r>
-      <w:hyperlink r:id="rId39" w:history="1">
+      <w:hyperlink r:id="rId34" w:history="1">
         <w:r>
           <w:rPr>
             <w:rStyle w:val="Hyperlink"/>
@@ -6504,7 +6787,7 @@
       <w:r>
         <w:t>Validierung der Rückgabewerte der IHanAdapter-Funktionen(</w:t>
       </w:r>
-      <w:hyperlink r:id="rId40" w:history="1">
+      <w:hyperlink r:id="rId35" w:history="1">
         <w:r>
           <w:rPr>
             <w:rStyle w:val="Hyperlink"/>
@@ -6516,7 +6799,7 @@
       <w:r>
         <w:t>), sowie zur fachlichen Validierung des Datenmodells der XML-Daten (</w:t>
       </w:r>
-      <w:hyperlink r:id="rId41" w:history="1">
+      <w:hyperlink r:id="rId36" w:history="1">
         <w:r>
           <w:rPr>
             <w:rStyle w:val="Hyperlink"/>
@@ -6540,6 +6823,7 @@
         <w:pStyle w:val="berschrift4"/>
       </w:pPr>
       <w:r>
+        <w:lastRenderedPageBreak/>
         <w:t>Abruf der Vertragsdaten</w:t>
       </w:r>
     </w:p>
@@ -7183,7 +7467,7 @@
       <w:r>
         <w:t xml:space="preserve"> können TAF-Plugins eingebunden werden. Diese müssen das Interface </w:t>
       </w:r>
-      <w:hyperlink r:id="rId42" w:history="1">
+      <w:hyperlink r:id="rId37" w:history="1">
         <w:r>
           <w:rPr>
             <w:rStyle w:val="Hyperlink"/>
@@ -7198,7 +7482,7 @@
       <w:r>
         <w:t xml:space="preserve"> Ein TAF-Plugin berechnet anhand einer Tarifdefinition (</w:t>
       </w:r>
-      <w:hyperlink r:id="rId43" w:history="1">
+      <w:hyperlink r:id="rId38" w:history="1">
         <w:r>
           <w:rPr>
             <w:rStyle w:val="Hyperlink"/>
@@ -7210,7 +7494,7 @@
       <w:r>
         <w:t>) und den Daten der aus dem SMGW abgelesenen originären Messwertliste (</w:t>
       </w:r>
-      <w:hyperlink r:id="rId44" w:history="1">
+      <w:hyperlink r:id="rId39" w:history="1">
         <w:r>
           <w:rPr>
             <w:rStyle w:val="Hyperlink"/>
@@ -7366,14 +7650,36 @@
       <w:r>
         <w:t xml:space="preserve">Tabelle </w:t>
       </w:r>
-      <w:fldSimple w:instr=" SEQ Tabelle \* ARABIC ">
-        <w:r>
-          <w:rPr>
-            <w:noProof/>
-          </w:rPr>
-          <w:t>3</w:t>
-        </w:r>
-      </w:fldSimple>
+      <w:r>
+        <w:rPr>
+          <w:noProof/>
+        </w:rPr>
+        <w:fldChar w:fldCharType="begin"/>
+      </w:r>
+      <w:r>
+        <w:rPr>
+          <w:noProof/>
+        </w:rPr>
+        <w:instrText xml:space="preserve"> SEQ Tabelle \* ARABIC </w:instrText>
+      </w:r>
+      <w:r>
+        <w:rPr>
+          <w:noProof/>
+        </w:rPr>
+        <w:fldChar w:fldCharType="separate"/>
+      </w:r>
+      <w:r>
+        <w:rPr>
+          <w:noProof/>
+        </w:rPr>
+        <w:t>3</w:t>
+      </w:r>
+      <w:r>
+        <w:rPr>
+          <w:noProof/>
+        </w:rPr>
+        <w:fldChar w:fldCharType="end"/>
+      </w:r>
       <w:r>
         <w:t xml:space="preserve"> </w:t>
       </w:r>
@@ -7429,7 +7735,7 @@
                     </pic:cNvPicPr>
                   </pic:nvPicPr>
                   <pic:blipFill>
-                    <a:blip r:embed="rId45">
+                    <a:blip r:embed="rId40">
                       <a:extLst>
                         <a:ext uri="{28A0092B-C50C-407E-A947-70E740481C1C}">
                           <a14:useLocalDpi xmlns:a14="http://schemas.microsoft.com/office/drawing/2010/main" val="0"/>
@@ -7486,7 +7792,7 @@
                     </pic:cNvPicPr>
                   </pic:nvPicPr>
                   <pic:blipFill>
-                    <a:blip r:embed="rId46">
+                    <a:blip r:embed="rId41">
                       <a:extLst>
                         <a:ext uri="{28A0092B-C50C-407E-A947-70E740481C1C}">
                           <a14:useLocalDpi xmlns:a14="http://schemas.microsoft.com/office/drawing/2010/main" val="0"/>
@@ -7543,7 +7849,7 @@
                     </pic:cNvPicPr>
                   </pic:nvPicPr>
                   <pic:blipFill>
-                    <a:blip r:embed="rId47">
+                    <a:blip r:embed="rId42">
                       <a:extLst>
                         <a:ext uri="{28A0092B-C50C-407E-A947-70E740481C1C}">
                           <a14:useLocalDpi xmlns:a14="http://schemas.microsoft.com/office/drawing/2010/main" val="0"/>
@@ -7623,7 +7929,7 @@
                     </pic:cNvPicPr>
                   </pic:nvPicPr>
                   <pic:blipFill rotWithShape="1">
-                    <a:blip r:embed="rId48">
+                    <a:blip r:embed="rId43">
                       <a:extLst>
                         <a:ext uri="{28A0092B-C50C-407E-A947-70E740481C1C}">
                           <a14:useLocalDpi xmlns:a14="http://schemas.microsoft.com/office/drawing/2010/main" val="0"/>
@@ -8187,7 +8493,7 @@
             <w:r>
               <w:t xml:space="preserve">. Statuswerte nach FNN werden in die PTB-Darstellung konvertiert (siehe Klasse </w:t>
             </w:r>
-            <w:hyperlink r:id="rId49" w:history="1">
+            <w:hyperlink r:id="rId44" w:history="1">
               <w:r>
                 <w:rPr>
                   <w:rStyle w:val="Hyperlink"/>
@@ -10672,8 +10978,8 @@
     <w:p/>
     <w:p/>
     <w:sectPr>
-      <w:headerReference w:type="default" r:id="rId50"/>
-      <w:footerReference w:type="default" r:id="rId51"/>
+      <w:headerReference w:type="default" r:id="rId45"/>
+      <w:footerReference w:type="default" r:id="rId46"/>
       <w:pgSz w:w="11907" w:h="16839" w:code="9"/>
       <w:pgMar w:top="2678" w:right="1512" w:bottom="1913" w:left="1512" w:header="918" w:footer="709" w:gutter="0"/>
       <w:pgNumType w:start="1"/>
@@ -34509,6 +34815,7 @@
     <w:rsid w:val="004A393C"/>
     <w:rsid w:val="005D4851"/>
     <w:rsid w:val="00681448"/>
+    <w:rsid w:val="00865E47"/>
     <w:rsid w:val="00A33484"/>
     <w:rsid w:val="00B15133"/>
     <w:rsid w:val="00D066E6"/>
@@ -35395,7 +35702,7 @@
 <CoverPageProperties xmlns="http://schemas.microsoft.com/office/2006/coverPageProps">
   <PublishDate/>
   <Abstract>Dokumentation zur Softwareprüfung nach WELMEC Guide 7.2</Abstract>
-  <CompanyAddress>Kreuzbergweg 1a
+  <CompanyAddress>Paul-Dietrich-Straße 14
 93133 Burglengenfeld</CompanyAddress>
   <CompanyPhone/>
   <CompanyFax/>
@@ -35447,7 +35754,7 @@
 </file>
 
 <file path=customXml/itemProps4.xml><?xml version="1.0" encoding="utf-8"?>
-<ds:datastoreItem xmlns:ds="http://schemas.openxmlformats.org/officeDocument/2006/customXml" ds:itemID="{4AF9C30C-F04A-4B04-A49D-377510FF7734}">
+<ds:datastoreItem xmlns:ds="http://schemas.openxmlformats.org/officeDocument/2006/customXml" ds:itemID="{93658F5B-9690-40B1-AD69-CED88A08099E}">
   <ds:schemaRefs>
     <ds:schemaRef ds:uri="http://schemas.openxmlformats.org/officeDocument/2006/bibliography"/>
   </ds:schemaRefs>

</xml_diff>

<commit_message>
Updated manual and documentation to 1.5.1
</commit_message>
<xml_diff>
--- a/doc/Software Dokumentation.docx
+++ b/doc/Software Dokumentation.docx
@@ -1,6 +1,6 @@
 
 <file path=word/document.xml><?xml version="1.0" encoding="utf-8"?>
-<w:document xmlns:wpc="http://schemas.microsoft.com/office/word/2010/wordprocessingCanvas" xmlns:cx="http://schemas.microsoft.com/office/drawing/2014/chartex" xmlns:cx1="http://schemas.microsoft.com/office/drawing/2015/9/8/chartex" xmlns:cx2="http://schemas.microsoft.com/office/drawing/2015/10/21/chartex" xmlns:cx3="http://schemas.microsoft.com/office/drawing/2016/5/9/chartex" xmlns:cx4="http://schemas.microsoft.com/office/drawing/2016/5/10/chartex" xmlns:cx5="http://schemas.microsoft.com/office/drawing/2016/5/11/chartex" xmlns:cx6="http://schemas.microsoft.com/office/drawing/2016/5/12/chartex" xmlns:cx7="http://schemas.microsoft.com/office/drawing/2016/5/13/chartex" xmlns:cx8="http://schemas.microsoft.com/office/drawing/2016/5/14/chartex" xmlns:mc="http://schemas.openxmlformats.org/markup-compatibility/2006" xmlns:aink="http://schemas.microsoft.com/office/drawing/2016/ink" xmlns:am3d="http://schemas.microsoft.com/office/drawing/2017/model3d" xmlns:o="urn:schemas-microsoft-com:office:office" xmlns:r="http://schemas.openxmlformats.org/officeDocument/2006/relationships" xmlns:m="http://schemas.openxmlformats.org/officeDocument/2006/math" xmlns:v="urn:schemas-microsoft-com:vml" xmlns:wp14="http://schemas.microsoft.com/office/word/2010/wordprocessingDrawing" xmlns:wp="http://schemas.openxmlformats.org/drawingml/2006/wordprocessingDrawing" xmlns:w10="urn:schemas-microsoft-com:office:word" xmlns:w="http://schemas.openxmlformats.org/wordprocessingml/2006/main" xmlns:w14="http://schemas.microsoft.com/office/word/2010/wordml" xmlns:w15="http://schemas.microsoft.com/office/word/2012/wordml" xmlns:w16cid="http://schemas.microsoft.com/office/word/2016/wordml/cid" xmlns:w16se="http://schemas.microsoft.com/office/word/2015/wordml/symex" xmlns:wpg="http://schemas.microsoft.com/office/word/2010/wordprocessingGroup" xmlns:wpi="http://schemas.microsoft.com/office/word/2010/wordprocessingInk" xmlns:wne="http://schemas.microsoft.com/office/word/2006/wordml" xmlns:wps="http://schemas.microsoft.com/office/word/2010/wordprocessingShape" mc:Ignorable="w14 w15 w16se w16cid wp14">
+<w:document xmlns:wpc="http://schemas.microsoft.com/office/word/2010/wordprocessingCanvas" xmlns:cx="http://schemas.microsoft.com/office/drawing/2014/chartex" xmlns:cx1="http://schemas.microsoft.com/office/drawing/2015/9/8/chartex" xmlns:cx2="http://schemas.microsoft.com/office/drawing/2015/10/21/chartex" xmlns:cx3="http://schemas.microsoft.com/office/drawing/2016/5/9/chartex" xmlns:cx4="http://schemas.microsoft.com/office/drawing/2016/5/10/chartex" xmlns:cx5="http://schemas.microsoft.com/office/drawing/2016/5/11/chartex" xmlns:cx6="http://schemas.microsoft.com/office/drawing/2016/5/12/chartex" xmlns:cx7="http://schemas.microsoft.com/office/drawing/2016/5/13/chartex" xmlns:cx8="http://schemas.microsoft.com/office/drawing/2016/5/14/chartex" xmlns:mc="http://schemas.openxmlformats.org/markup-compatibility/2006" xmlns:aink="http://schemas.microsoft.com/office/drawing/2016/ink" xmlns:am3d="http://schemas.microsoft.com/office/drawing/2017/model3d" xmlns:o="urn:schemas-microsoft-com:office:office" xmlns:r="http://schemas.openxmlformats.org/officeDocument/2006/relationships" xmlns:m="http://schemas.openxmlformats.org/officeDocument/2006/math" xmlns:v="urn:schemas-microsoft-com:vml" xmlns:wp14="http://schemas.microsoft.com/office/word/2010/wordprocessingDrawing" xmlns:wp="http://schemas.openxmlformats.org/drawingml/2006/wordprocessingDrawing" xmlns:w10="urn:schemas-microsoft-com:office:word" xmlns:w="http://schemas.openxmlformats.org/wordprocessingml/2006/main" xmlns:w14="http://schemas.microsoft.com/office/word/2010/wordml" xmlns:w15="http://schemas.microsoft.com/office/word/2012/wordml" xmlns:w16cex="http://schemas.microsoft.com/office/word/2018/wordml/cex" xmlns:w16cid="http://schemas.microsoft.com/office/word/2016/wordml/cid" xmlns:w16="http://schemas.microsoft.com/office/word/2018/wordml" xmlns:w16sdtdh="http://schemas.microsoft.com/office/word/2020/wordml/sdtdatahash" xmlns:w16se="http://schemas.microsoft.com/office/word/2015/wordml/symex" xmlns:wpg="http://schemas.microsoft.com/office/word/2010/wordprocessingGroup" xmlns:wpi="http://schemas.microsoft.com/office/word/2010/wordprocessingInk" xmlns:wne="http://schemas.microsoft.com/office/word/2006/wordml" xmlns:wps="http://schemas.microsoft.com/office/word/2010/wordprocessingShape" mc:Ignorable="w14 w15 w16se w16cid w16 w16cex w16sdtdh wp14">
   <w:body>
     <w:sdt>
       <w:sdtPr>
@@ -29,7 +29,7 @@
             <mc:AlternateContent>
               <mc:Choice Requires="wps">
                 <w:drawing>
-                  <wp:anchor distT="0" distB="0" distL="114300" distR="114300" simplePos="0" relativeHeight="251658240" behindDoc="0" locked="0" layoutInCell="0" allowOverlap="0" wp14:anchorId="1F938386" wp14:editId="792976C1">
+                  <wp:anchor distT="0" distB="0" distL="114300" distR="114300" simplePos="0" relativeHeight="251658240" behindDoc="0" locked="0" layoutInCell="0" allowOverlap="0" wp14:anchorId="1BDFD916" wp14:editId="7597D417">
                     <wp:simplePos x="0" y="0"/>
                     <wp:positionH relativeFrom="page">
                       <wp:posOffset>702978</wp:posOffset>
@@ -178,7 +178,7 @@
               </mc:Choice>
               <mc:Fallback>
                 <w:pict>
-                  <v:shapetype w14:anchorId="1F938386" id="_x0000_t202" coordsize="21600,21600" o:spt="202" path="m,l,21600r21600,l21600,xe">
+                  <v:shapetype w14:anchorId="1BDFD916" id="_x0000_t202" coordsize="21600,21600" o:spt="202" path="m,l,21600r21600,l21600,xe">
                     <v:stroke joinstyle="miter"/>
                     <v:path gradientshapeok="t" o:connecttype="rect"/>
                   </v:shapetype>
@@ -302,7 +302,7 @@
             <mc:AlternateContent>
               <mc:Choice Requires="wps">
                 <w:drawing>
-                  <wp:anchor distT="0" distB="0" distL="114300" distR="114300" simplePos="0" relativeHeight="251654144" behindDoc="0" locked="0" layoutInCell="1" allowOverlap="1" wp14:anchorId="35A6724A" wp14:editId="4D7B63B6">
+                  <wp:anchor distT="0" distB="0" distL="114300" distR="114300" simplePos="0" relativeHeight="251654144" behindDoc="0" locked="0" layoutInCell="1" allowOverlap="1" wp14:anchorId="5CB071E9" wp14:editId="780EE5B6">
                     <wp:simplePos x="0" y="0"/>
                     <wp:positionH relativeFrom="margin">
                       <wp:align>right</wp:align>
@@ -344,7 +344,10 @@
                                   <w:t>TRudi 1.</w:t>
                                 </w:r>
                                 <w:r>
-                                  <w:t>1.0</w:t>
+                                  <w:t>5.</w:t>
+                                </w:r>
+                                <w:r>
+                                  <w:t>1</w:t>
                                 </w:r>
                               </w:p>
                               <w:p>
@@ -416,7 +419,7 @@
               </mc:Choice>
               <mc:Fallback>
                 <w:pict>
-                  <v:shape w14:anchorId="35A6724A" id="Textfeld 6" o:spid="_x0000_s1027" type="#_x0000_t202" alt="Titel, Untertitel und Exposee" style="position:absolute;margin-left:425.8pt;margin-top:0;width:477pt;height:489pt;z-index:251654144;visibility:visible;mso-wrap-style:square;mso-width-percent:0;mso-height-percent:850;mso-wrap-distance-left:9pt;mso-wrap-distance-top:0;mso-wrap-distance-right:9pt;mso-wrap-distance-bottom:0;mso-position-horizontal:right;mso-position-horizontal-relative:margin;mso-position-vertical:bottom;mso-position-vertical-relative:margin;mso-width-percent:0;mso-height-percent:850;mso-width-relative:margin;mso-height-relative:margin;v-text-anchor:bottom" o:gfxdata="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" filled="f" stroked="f" strokeweight=".5pt">
+                  <v:shape w14:anchorId="5CB071E9" id="Textfeld 6" o:spid="_x0000_s1027" type="#_x0000_t202" alt="Titel, Untertitel und Exposee" style="position:absolute;margin-left:425.8pt;margin-top:0;width:477pt;height:489pt;z-index:251654144;visibility:visible;mso-wrap-style:square;mso-width-percent:0;mso-height-percent:850;mso-wrap-distance-left:9pt;mso-wrap-distance-top:0;mso-wrap-distance-right:9pt;mso-wrap-distance-bottom:0;mso-position-horizontal:right;mso-position-horizontal-relative:margin;mso-position-vertical:bottom;mso-position-vertical-relative:margin;mso-width-percent:0;mso-height-percent:850;mso-width-relative:margin;mso-height-relative:margin;v-text-anchor:bottom" o:gfxdata="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" filled="f" stroked="f" strokeweight=".5pt">
                     <v:textbox inset="0,0,0,0">
                       <w:txbxContent>
                         <w:p>
@@ -428,7 +431,10 @@
                             <w:t>TRudi 1.</w:t>
                           </w:r>
                           <w:r>
-                            <w:t>1.0</w:t>
+                            <w:t>5.</w:t>
+                          </w:r>
+                          <w:r>
+                            <w:t>1</w:t>
                           </w:r>
                         </w:p>
                         <w:p>
@@ -542,7 +548,7 @@
         <w:tc>
           <w:tcPr>
             <w:cnfStyle w:val="001000000100" w:firstRow="0" w:lastRow="0" w:firstColumn="1" w:lastColumn="0" w:oddVBand="0" w:evenVBand="0" w:oddHBand="0" w:evenHBand="0" w:firstRowFirstColumn="1" w:firstRowLastColumn="0" w:lastRowFirstColumn="0" w:lastRowLastColumn="0"/>
-            <w:tcW w:w="1276" w:type="dxa"/>
+            <w:tcW w:w="1269" w:type="dxa"/>
           </w:tcPr>
           <w:p>
             <w:r>
@@ -552,7 +558,7 @@
         </w:tc>
         <w:tc>
           <w:tcPr>
-            <w:tcW w:w="1701" w:type="dxa"/>
+            <w:tcW w:w="1682" w:type="dxa"/>
           </w:tcPr>
           <w:p>
             <w:pPr>
@@ -565,7 +571,7 @@
         </w:tc>
         <w:tc>
           <w:tcPr>
-            <w:tcW w:w="1559" w:type="dxa"/>
+            <w:tcW w:w="1537" w:type="dxa"/>
           </w:tcPr>
           <w:p>
             <w:pPr>
@@ -578,7 +584,7 @@
         </w:tc>
         <w:tc>
           <w:tcPr>
-            <w:tcW w:w="4526" w:type="dxa"/>
+            <w:tcW w:w="4395" w:type="dxa"/>
           </w:tcPr>
           <w:p>
             <w:pPr>
@@ -597,7 +603,7 @@
         <w:tc>
           <w:tcPr>
             <w:cnfStyle w:val="001000000000" w:firstRow="0" w:lastRow="0" w:firstColumn="1" w:lastColumn="0" w:oddVBand="0" w:evenVBand="0" w:oddHBand="0" w:evenHBand="0" w:firstRowFirstColumn="0" w:firstRowLastColumn="0" w:lastRowFirstColumn="0" w:lastRowLastColumn="0"/>
-            <w:tcW w:w="1276" w:type="dxa"/>
+            <w:tcW w:w="1269" w:type="dxa"/>
           </w:tcPr>
           <w:p>
             <w:r>
@@ -607,7 +613,7 @@
         </w:tc>
         <w:tc>
           <w:tcPr>
-            <w:tcW w:w="1701" w:type="dxa"/>
+            <w:tcW w:w="1682" w:type="dxa"/>
           </w:tcPr>
           <w:p>
             <w:pPr>
@@ -620,7 +626,7 @@
         </w:tc>
         <w:tc>
           <w:tcPr>
-            <w:tcW w:w="1559" w:type="dxa"/>
+            <w:tcW w:w="1537" w:type="dxa"/>
           </w:tcPr>
           <w:p>
             <w:pPr>
@@ -633,7 +639,7 @@
         </w:tc>
         <w:tc>
           <w:tcPr>
-            <w:tcW w:w="4526" w:type="dxa"/>
+            <w:tcW w:w="4395" w:type="dxa"/>
           </w:tcPr>
           <w:p>
             <w:pPr>
@@ -649,7 +655,7 @@
         <w:tc>
           <w:tcPr>
             <w:cnfStyle w:val="001000000000" w:firstRow="0" w:lastRow="0" w:firstColumn="1" w:lastColumn="0" w:oddVBand="0" w:evenVBand="0" w:oddHBand="0" w:evenHBand="0" w:firstRowFirstColumn="0" w:firstRowLastColumn="0" w:lastRowFirstColumn="0" w:lastRowLastColumn="0"/>
-            <w:tcW w:w="1276" w:type="dxa"/>
+            <w:tcW w:w="1269" w:type="dxa"/>
           </w:tcPr>
           <w:p>
             <w:r>
@@ -659,7 +665,7 @@
         </w:tc>
         <w:tc>
           <w:tcPr>
-            <w:tcW w:w="1701" w:type="dxa"/>
+            <w:tcW w:w="1682" w:type="dxa"/>
           </w:tcPr>
           <w:p>
             <w:pPr>
@@ -672,7 +678,7 @@
         </w:tc>
         <w:tc>
           <w:tcPr>
-            <w:tcW w:w="1559" w:type="dxa"/>
+            <w:tcW w:w="1537" w:type="dxa"/>
           </w:tcPr>
           <w:p>
             <w:pPr>
@@ -685,7 +691,7 @@
         </w:tc>
         <w:tc>
           <w:tcPr>
-            <w:tcW w:w="4526" w:type="dxa"/>
+            <w:tcW w:w="4395" w:type="dxa"/>
           </w:tcPr>
           <w:p>
             <w:pPr>
@@ -704,7 +710,7 @@
         <w:tc>
           <w:tcPr>
             <w:cnfStyle w:val="001000000000" w:firstRow="0" w:lastRow="0" w:firstColumn="1" w:lastColumn="0" w:oddVBand="0" w:evenVBand="0" w:oddHBand="0" w:evenHBand="0" w:firstRowFirstColumn="0" w:firstRowLastColumn="0" w:lastRowFirstColumn="0" w:lastRowLastColumn="0"/>
-            <w:tcW w:w="1276" w:type="dxa"/>
+            <w:tcW w:w="1269" w:type="dxa"/>
           </w:tcPr>
           <w:p>
             <w:r>
@@ -714,7 +720,7 @@
         </w:tc>
         <w:tc>
           <w:tcPr>
-            <w:tcW w:w="1701" w:type="dxa"/>
+            <w:tcW w:w="1682" w:type="dxa"/>
           </w:tcPr>
           <w:p>
             <w:pPr>
@@ -727,7 +733,7 @@
         </w:tc>
         <w:tc>
           <w:tcPr>
-            <w:tcW w:w="1559" w:type="dxa"/>
+            <w:tcW w:w="1537" w:type="dxa"/>
           </w:tcPr>
           <w:p>
             <w:pPr>
@@ -740,7 +746,7 @@
         </w:tc>
         <w:tc>
           <w:tcPr>
-            <w:tcW w:w="4526" w:type="dxa"/>
+            <w:tcW w:w="4395" w:type="dxa"/>
           </w:tcPr>
           <w:p>
             <w:pPr>
@@ -756,7 +762,7 @@
         <w:tc>
           <w:tcPr>
             <w:cnfStyle w:val="001000000000" w:firstRow="0" w:lastRow="0" w:firstColumn="1" w:lastColumn="0" w:oddVBand="0" w:evenVBand="0" w:oddHBand="0" w:evenHBand="0" w:firstRowFirstColumn="0" w:firstRowLastColumn="0" w:lastRowFirstColumn="0" w:lastRowLastColumn="0"/>
-            <w:tcW w:w="1276" w:type="dxa"/>
+            <w:tcW w:w="1269" w:type="dxa"/>
           </w:tcPr>
           <w:p>
             <w:r>
@@ -766,7 +772,7 @@
         </w:tc>
         <w:tc>
           <w:tcPr>
-            <w:tcW w:w="1701" w:type="dxa"/>
+            <w:tcW w:w="1682" w:type="dxa"/>
           </w:tcPr>
           <w:p>
             <w:pPr>
@@ -779,7 +785,7 @@
         </w:tc>
         <w:tc>
           <w:tcPr>
-            <w:tcW w:w="1559" w:type="dxa"/>
+            <w:tcW w:w="1537" w:type="dxa"/>
           </w:tcPr>
           <w:p>
             <w:pPr>
@@ -792,7 +798,7 @@
         </w:tc>
         <w:tc>
           <w:tcPr>
-            <w:tcW w:w="4526" w:type="dxa"/>
+            <w:tcW w:w="4395" w:type="dxa"/>
           </w:tcPr>
           <w:p>
             <w:pPr>
@@ -811,7 +817,7 @@
         <w:tc>
           <w:tcPr>
             <w:cnfStyle w:val="001000000000" w:firstRow="0" w:lastRow="0" w:firstColumn="1" w:lastColumn="0" w:oddVBand="0" w:evenVBand="0" w:oddHBand="0" w:evenHBand="0" w:firstRowFirstColumn="0" w:firstRowLastColumn="0" w:lastRowFirstColumn="0" w:lastRowLastColumn="0"/>
-            <w:tcW w:w="1276" w:type="dxa"/>
+            <w:tcW w:w="1269" w:type="dxa"/>
           </w:tcPr>
           <w:p>
             <w:r>
@@ -821,7 +827,7 @@
         </w:tc>
         <w:tc>
           <w:tcPr>
-            <w:tcW w:w="1701" w:type="dxa"/>
+            <w:tcW w:w="1682" w:type="dxa"/>
           </w:tcPr>
           <w:p>
             <w:pPr>
@@ -834,7 +840,7 @@
         </w:tc>
         <w:tc>
           <w:tcPr>
-            <w:tcW w:w="1559" w:type="dxa"/>
+            <w:tcW w:w="1537" w:type="dxa"/>
           </w:tcPr>
           <w:p>
             <w:pPr>
@@ -847,7 +853,7 @@
         </w:tc>
         <w:tc>
           <w:tcPr>
-            <w:tcW w:w="4526" w:type="dxa"/>
+            <w:tcW w:w="4395" w:type="dxa"/>
           </w:tcPr>
           <w:p>
             <w:pPr>
@@ -863,7 +869,7 @@
         <w:tc>
           <w:tcPr>
             <w:cnfStyle w:val="001000000000" w:firstRow="0" w:lastRow="0" w:firstColumn="1" w:lastColumn="0" w:oddVBand="0" w:evenVBand="0" w:oddHBand="0" w:evenHBand="0" w:firstRowFirstColumn="0" w:firstRowLastColumn="0" w:lastRowFirstColumn="0" w:lastRowLastColumn="0"/>
-            <w:tcW w:w="1276" w:type="dxa"/>
+            <w:tcW w:w="1269" w:type="dxa"/>
           </w:tcPr>
           <w:p>
             <w:r>
@@ -873,7 +879,7 @@
         </w:tc>
         <w:tc>
           <w:tcPr>
-            <w:tcW w:w="1701" w:type="dxa"/>
+            <w:tcW w:w="1682" w:type="dxa"/>
           </w:tcPr>
           <w:p>
             <w:pPr>
@@ -886,7 +892,7 @@
         </w:tc>
         <w:tc>
           <w:tcPr>
-            <w:tcW w:w="1559" w:type="dxa"/>
+            <w:tcW w:w="1537" w:type="dxa"/>
           </w:tcPr>
           <w:p>
             <w:pPr>
@@ -899,7 +905,7 @@
         </w:tc>
         <w:tc>
           <w:tcPr>
-            <w:tcW w:w="4526" w:type="dxa"/>
+            <w:tcW w:w="4395" w:type="dxa"/>
           </w:tcPr>
           <w:p>
             <w:pPr>
@@ -918,7 +924,7 @@
         <w:tc>
           <w:tcPr>
             <w:cnfStyle w:val="001000000000" w:firstRow="0" w:lastRow="0" w:firstColumn="1" w:lastColumn="0" w:oddVBand="0" w:evenVBand="0" w:oddHBand="0" w:evenHBand="0" w:firstRowFirstColumn="0" w:firstRowLastColumn="0" w:lastRowFirstColumn="0" w:lastRowLastColumn="0"/>
-            <w:tcW w:w="1276" w:type="dxa"/>
+            <w:tcW w:w="1269" w:type="dxa"/>
           </w:tcPr>
           <w:p>
             <w:r>
@@ -928,7 +934,7 @@
         </w:tc>
         <w:tc>
           <w:tcPr>
-            <w:tcW w:w="1701" w:type="dxa"/>
+            <w:tcW w:w="1682" w:type="dxa"/>
           </w:tcPr>
           <w:p>
             <w:pPr>
@@ -941,7 +947,7 @@
         </w:tc>
         <w:tc>
           <w:tcPr>
-            <w:tcW w:w="1559" w:type="dxa"/>
+            <w:tcW w:w="1537" w:type="dxa"/>
           </w:tcPr>
           <w:p>
             <w:pPr>
@@ -954,7 +960,7 @@
         </w:tc>
         <w:tc>
           <w:tcPr>
-            <w:tcW w:w="4526" w:type="dxa"/>
+            <w:tcW w:w="4395" w:type="dxa"/>
           </w:tcPr>
           <w:p>
             <w:pPr>
@@ -981,7 +987,7 @@
         <w:tc>
           <w:tcPr>
             <w:cnfStyle w:val="001000000000" w:firstRow="0" w:lastRow="0" w:firstColumn="1" w:lastColumn="0" w:oddVBand="0" w:evenVBand="0" w:oddHBand="0" w:evenHBand="0" w:firstRowFirstColumn="0" w:firstRowLastColumn="0" w:lastRowFirstColumn="0" w:lastRowLastColumn="0"/>
-            <w:tcW w:w="1276" w:type="dxa"/>
+            <w:tcW w:w="1269" w:type="dxa"/>
           </w:tcPr>
           <w:p>
             <w:r>
@@ -991,7 +997,7 @@
         </w:tc>
         <w:tc>
           <w:tcPr>
-            <w:tcW w:w="1701" w:type="dxa"/>
+            <w:tcW w:w="1682" w:type="dxa"/>
           </w:tcPr>
           <w:p>
             <w:pPr>
@@ -1004,7 +1010,7 @@
         </w:tc>
         <w:tc>
           <w:tcPr>
-            <w:tcW w:w="1559" w:type="dxa"/>
+            <w:tcW w:w="1537" w:type="dxa"/>
           </w:tcPr>
           <w:p>
             <w:pPr>
@@ -1017,25 +1023,748 @@
         </w:tc>
         <w:tc>
           <w:tcPr>
-            <w:tcW w:w="4526" w:type="dxa"/>
+            <w:tcW w:w="4395" w:type="dxa"/>
           </w:tcPr>
           <w:p>
             <w:pPr>
               <w:cnfStyle w:val="000000000000" w:firstRow="0" w:lastRow="0" w:firstColumn="0" w:lastColumn="0" w:oddVBand="0" w:evenVBand="0" w:oddHBand="0" w:evenHBand="0" w:firstRowFirstColumn="0" w:firstRowLastColumn="0" w:lastRowFirstColumn="0" w:lastRowLastColumn="0"/>
             </w:pPr>
-            <w:proofErr w:type="spellStart"/>
-            <w:r>
-              <w:t>TRuDI</w:t>
-            </w:r>
-            <w:proofErr w:type="spellEnd"/>
-            <w:r>
-              <w:t xml:space="preserve"> Version 1.1.0</w:t>
+            <w:r>
+              <w:t>TRuDI Version 1.1.0</w:t>
+            </w:r>
+          </w:p>
+        </w:tc>
+      </w:tr>
+      <w:tr>
+        <w:trPr>
+          <w:cnfStyle w:val="000000100000" w:firstRow="0" w:lastRow="0" w:firstColumn="0" w:lastColumn="0" w:oddVBand="0" w:evenVBand="0" w:oddHBand="1" w:evenHBand="0" w:firstRowFirstColumn="0" w:firstRowLastColumn="0" w:lastRowFirstColumn="0" w:lastRowLastColumn="0"/>
+        </w:trPr>
+        <w:tc>
+          <w:tcPr>
+            <w:cnfStyle w:val="001000000000" w:firstRow="0" w:lastRow="0" w:firstColumn="1" w:lastColumn="0" w:oddVBand="0" w:evenVBand="0" w:oddHBand="0" w:evenHBand="0" w:firstRowFirstColumn="0" w:firstRowLastColumn="0" w:lastRowFirstColumn="0" w:lastRowLastColumn="0"/>
+            <w:tcW w:w="1269" w:type="dxa"/>
+          </w:tcPr>
+          <w:p>
+            <w:r>
+              <w:t>1.6</w:t>
+            </w:r>
+          </w:p>
+        </w:tc>
+        <w:tc>
+          <w:tcPr>
+            <w:tcW w:w="1682" w:type="dxa"/>
+          </w:tcPr>
+          <w:p>
+            <w:pPr>
+              <w:cnfStyle w:val="000000100000" w:firstRow="0" w:lastRow="0" w:firstColumn="0" w:lastColumn="0" w:oddVBand="0" w:evenVBand="0" w:oddHBand="1" w:evenHBand="0" w:firstRowFirstColumn="0" w:firstRowLastColumn="0" w:lastRowFirstColumn="0" w:lastRowLastColumn="0"/>
+            </w:pPr>
+            <w:r>
+              <w:t>01.07.2019</w:t>
+            </w:r>
+          </w:p>
+        </w:tc>
+        <w:tc>
+          <w:tcPr>
+            <w:tcW w:w="1537" w:type="dxa"/>
+          </w:tcPr>
+          <w:p>
+            <w:pPr>
+              <w:cnfStyle w:val="000000100000" w:firstRow="0" w:lastRow="0" w:firstColumn="0" w:lastColumn="0" w:oddVBand="0" w:evenVBand="0" w:oddHBand="1" w:evenHBand="0" w:firstRowFirstColumn="0" w:firstRowLastColumn="0" w:lastRowFirstColumn="0" w:lastRowLastColumn="0"/>
+            </w:pPr>
+            <w:r>
+              <w:t>T. Müller</w:t>
+            </w:r>
+          </w:p>
+        </w:tc>
+        <w:tc>
+          <w:tcPr>
+            <w:tcW w:w="4395" w:type="dxa"/>
+          </w:tcPr>
+          <w:p>
+            <w:pPr>
+              <w:cnfStyle w:val="000000100000" w:firstRow="0" w:lastRow="0" w:firstColumn="0" w:lastColumn="0" w:oddVBand="0" w:evenVBand="0" w:oddHBand="1" w:evenHBand="0" w:firstRowFirstColumn="0" w:firstRowLastColumn="0" w:lastRowFirstColumn="0" w:lastRowLastColumn="0"/>
+            </w:pPr>
+            <w:r>
+              <w:t>TRuDI Version 1.2.1</w:t>
+            </w:r>
+          </w:p>
+        </w:tc>
+      </w:tr>
+      <w:tr>
+        <w:tc>
+          <w:tcPr>
+            <w:cnfStyle w:val="001000000000" w:firstRow="0" w:lastRow="0" w:firstColumn="1" w:lastColumn="0" w:oddVBand="0" w:evenVBand="0" w:oddHBand="0" w:evenHBand="0" w:firstRowFirstColumn="0" w:firstRowLastColumn="0" w:lastRowFirstColumn="0" w:lastRowLastColumn="0"/>
+            <w:tcW w:w="1269" w:type="dxa"/>
+          </w:tcPr>
+          <w:p>
+            <w:r>
+              <w:t>1.7</w:t>
+            </w:r>
+          </w:p>
+        </w:tc>
+        <w:tc>
+          <w:tcPr>
+            <w:tcW w:w="1682" w:type="dxa"/>
+          </w:tcPr>
+          <w:p>
+            <w:pPr>
+              <w:cnfStyle w:val="000000000000" w:firstRow="0" w:lastRow="0" w:firstColumn="0" w:lastColumn="0" w:oddVBand="0" w:evenVBand="0" w:oddHBand="0" w:evenHBand="0" w:firstRowFirstColumn="0" w:firstRowLastColumn="0" w:lastRowFirstColumn="0" w:lastRowLastColumn="0"/>
+            </w:pPr>
+            <w:r>
+              <w:t>25.07.2019</w:t>
+            </w:r>
+          </w:p>
+        </w:tc>
+        <w:tc>
+          <w:tcPr>
+            <w:tcW w:w="1537" w:type="dxa"/>
+          </w:tcPr>
+          <w:p>
+            <w:pPr>
+              <w:cnfStyle w:val="000000000000" w:firstRow="0" w:lastRow="0" w:firstColumn="0" w:lastColumn="0" w:oddVBand="0" w:evenVBand="0" w:oddHBand="0" w:evenHBand="0" w:firstRowFirstColumn="0" w:firstRowLastColumn="0" w:lastRowFirstColumn="0" w:lastRowLastColumn="0"/>
+            </w:pPr>
+            <w:r>
+              <w:t>T. Müller</w:t>
+            </w:r>
+          </w:p>
+        </w:tc>
+        <w:tc>
+          <w:tcPr>
+            <w:tcW w:w="4395" w:type="dxa"/>
+          </w:tcPr>
+          <w:p>
+            <w:pPr>
+              <w:cnfStyle w:val="000000000000" w:firstRow="0" w:lastRow="0" w:firstColumn="0" w:lastColumn="0" w:oddVBand="0" w:evenVBand="0" w:oddHBand="0" w:evenHBand="0" w:firstRowFirstColumn="0" w:firstRowLastColumn="0" w:lastRowFirstColumn="0" w:lastRowLastColumn="0"/>
+            </w:pPr>
+            <w:r>
+              <w:t>TRuDI Version 1.2.4</w:t>
+            </w:r>
+          </w:p>
+        </w:tc>
+      </w:tr>
+      <w:tr>
+        <w:trPr>
+          <w:cnfStyle w:val="000000100000" w:firstRow="0" w:lastRow="0" w:firstColumn="0" w:lastColumn="0" w:oddVBand="0" w:evenVBand="0" w:oddHBand="1" w:evenHBand="0" w:firstRowFirstColumn="0" w:firstRowLastColumn="0" w:lastRowFirstColumn="0" w:lastRowLastColumn="0"/>
+        </w:trPr>
+        <w:tc>
+          <w:tcPr>
+            <w:cnfStyle w:val="001000000000" w:firstRow="0" w:lastRow="0" w:firstColumn="1" w:lastColumn="0" w:oddVBand="0" w:evenVBand="0" w:oddHBand="0" w:evenHBand="0" w:firstRowFirstColumn="0" w:firstRowLastColumn="0" w:lastRowFirstColumn="0" w:lastRowLastColumn="0"/>
+            <w:tcW w:w="1269" w:type="dxa"/>
+          </w:tcPr>
+          <w:p>
+            <w:r>
+              <w:t>1.8</w:t>
+            </w:r>
+          </w:p>
+        </w:tc>
+        <w:tc>
+          <w:tcPr>
+            <w:tcW w:w="1682" w:type="dxa"/>
+          </w:tcPr>
+          <w:p>
+            <w:pPr>
+              <w:cnfStyle w:val="000000100000" w:firstRow="0" w:lastRow="0" w:firstColumn="0" w:lastColumn="0" w:oddVBand="0" w:evenVBand="0" w:oddHBand="1" w:evenHBand="0" w:firstRowFirstColumn="0" w:firstRowLastColumn="0" w:lastRowFirstColumn="0" w:lastRowLastColumn="0"/>
+            </w:pPr>
+            <w:r>
+              <w:t>27.08.2019</w:t>
+            </w:r>
+          </w:p>
+        </w:tc>
+        <w:tc>
+          <w:tcPr>
+            <w:tcW w:w="1537" w:type="dxa"/>
+          </w:tcPr>
+          <w:p>
+            <w:pPr>
+              <w:cnfStyle w:val="000000100000" w:firstRow="0" w:lastRow="0" w:firstColumn="0" w:lastColumn="0" w:oddVBand="0" w:evenVBand="0" w:oddHBand="1" w:evenHBand="0" w:firstRowFirstColumn="0" w:firstRowLastColumn="0" w:lastRowFirstColumn="0" w:lastRowLastColumn="0"/>
+            </w:pPr>
+            <w:r>
+              <w:t>T. Müller</w:t>
+            </w:r>
+          </w:p>
+        </w:tc>
+        <w:tc>
+          <w:tcPr>
+            <w:tcW w:w="4395" w:type="dxa"/>
+          </w:tcPr>
+          <w:p>
+            <w:pPr>
+              <w:cnfStyle w:val="000000100000" w:firstRow="0" w:lastRow="0" w:firstColumn="0" w:lastColumn="0" w:oddVBand="0" w:evenVBand="0" w:oddHBand="1" w:evenHBand="0" w:firstRowFirstColumn="0" w:firstRowLastColumn="0" w:lastRowFirstColumn="0" w:lastRowLastColumn="0"/>
+            </w:pPr>
+            <w:r>
+              <w:t>TRuDI Version 1.2.11</w:t>
+            </w:r>
+          </w:p>
+        </w:tc>
+      </w:tr>
+      <w:tr>
+        <w:tc>
+          <w:tcPr>
+            <w:cnfStyle w:val="001000000000" w:firstRow="0" w:lastRow="0" w:firstColumn="1" w:lastColumn="0" w:oddVBand="0" w:evenVBand="0" w:oddHBand="0" w:evenHBand="0" w:firstRowFirstColumn="0" w:firstRowLastColumn="0" w:lastRowFirstColumn="0" w:lastRowLastColumn="0"/>
+            <w:tcW w:w="1269" w:type="dxa"/>
+          </w:tcPr>
+          <w:p>
+            <w:r>
+              <w:t>1.9</w:t>
+            </w:r>
+          </w:p>
+        </w:tc>
+        <w:tc>
+          <w:tcPr>
+            <w:tcW w:w="1682" w:type="dxa"/>
+          </w:tcPr>
+          <w:p>
+            <w:pPr>
+              <w:cnfStyle w:val="000000000000" w:firstRow="0" w:lastRow="0" w:firstColumn="0" w:lastColumn="0" w:oddVBand="0" w:evenVBand="0" w:oddHBand="0" w:evenHBand="0" w:firstRowFirstColumn="0" w:firstRowLastColumn="0" w:lastRowFirstColumn="0" w:lastRowLastColumn="0"/>
+            </w:pPr>
+            <w:r>
+              <w:t>03.09.2019</w:t>
+            </w:r>
+          </w:p>
+        </w:tc>
+        <w:tc>
+          <w:tcPr>
+            <w:tcW w:w="1537" w:type="dxa"/>
+          </w:tcPr>
+          <w:p>
+            <w:pPr>
+              <w:cnfStyle w:val="000000000000" w:firstRow="0" w:lastRow="0" w:firstColumn="0" w:lastColumn="0" w:oddVBand="0" w:evenVBand="0" w:oddHBand="0" w:evenHBand="0" w:firstRowFirstColumn="0" w:firstRowLastColumn="0" w:lastRowFirstColumn="0" w:lastRowLastColumn="0"/>
+            </w:pPr>
+            <w:r>
+              <w:t>T. Müller</w:t>
+            </w:r>
+          </w:p>
+        </w:tc>
+        <w:tc>
+          <w:tcPr>
+            <w:tcW w:w="4395" w:type="dxa"/>
+          </w:tcPr>
+          <w:p>
+            <w:pPr>
+              <w:cnfStyle w:val="000000000000" w:firstRow="0" w:lastRow="0" w:firstColumn="0" w:lastColumn="0" w:oddVBand="0" w:evenVBand="0" w:oddHBand="0" w:evenHBand="0" w:firstRowFirstColumn="0" w:firstRowLastColumn="0" w:lastRowFirstColumn="0" w:lastRowLastColumn="0"/>
+            </w:pPr>
+            <w:r>
+              <w:t>TRuDI Version 1.2.12</w:t>
+            </w:r>
+          </w:p>
+        </w:tc>
+      </w:tr>
+      <w:tr>
+        <w:trPr>
+          <w:cnfStyle w:val="000000100000" w:firstRow="0" w:lastRow="0" w:firstColumn="0" w:lastColumn="0" w:oddVBand="0" w:evenVBand="0" w:oddHBand="1" w:evenHBand="0" w:firstRowFirstColumn="0" w:firstRowLastColumn="0" w:lastRowFirstColumn="0" w:lastRowLastColumn="0"/>
+        </w:trPr>
+        <w:tc>
+          <w:tcPr>
+            <w:cnfStyle w:val="001000000000" w:firstRow="0" w:lastRow="0" w:firstColumn="1" w:lastColumn="0" w:oddVBand="0" w:evenVBand="0" w:oddHBand="0" w:evenHBand="0" w:firstRowFirstColumn="0" w:firstRowLastColumn="0" w:lastRowFirstColumn="0" w:lastRowLastColumn="0"/>
+            <w:tcW w:w="1269" w:type="dxa"/>
+          </w:tcPr>
+          <w:p>
+            <w:r>
+              <w:t>1.10</w:t>
+            </w:r>
+          </w:p>
+        </w:tc>
+        <w:tc>
+          <w:tcPr>
+            <w:tcW w:w="1682" w:type="dxa"/>
+          </w:tcPr>
+          <w:p>
+            <w:pPr>
+              <w:cnfStyle w:val="000000100000" w:firstRow="0" w:lastRow="0" w:firstColumn="0" w:lastColumn="0" w:oddVBand="0" w:evenVBand="0" w:oddHBand="1" w:evenHBand="0" w:firstRowFirstColumn="0" w:firstRowLastColumn="0" w:lastRowFirstColumn="0" w:lastRowLastColumn="0"/>
+            </w:pPr>
+            <w:r>
+              <w:t>23.09.2019</w:t>
+            </w:r>
+          </w:p>
+        </w:tc>
+        <w:tc>
+          <w:tcPr>
+            <w:tcW w:w="1537" w:type="dxa"/>
+          </w:tcPr>
+          <w:p>
+            <w:pPr>
+              <w:cnfStyle w:val="000000100000" w:firstRow="0" w:lastRow="0" w:firstColumn="0" w:lastColumn="0" w:oddVBand="0" w:evenVBand="0" w:oddHBand="1" w:evenHBand="0" w:firstRowFirstColumn="0" w:firstRowLastColumn="0" w:lastRowFirstColumn="0" w:lastRowLastColumn="0"/>
+            </w:pPr>
+            <w:r>
+              <w:t>T. Müller</w:t>
+            </w:r>
+          </w:p>
+        </w:tc>
+        <w:tc>
+          <w:tcPr>
+            <w:tcW w:w="4395" w:type="dxa"/>
+          </w:tcPr>
+          <w:p>
+            <w:pPr>
+              <w:cnfStyle w:val="000000100000" w:firstRow="0" w:lastRow="0" w:firstColumn="0" w:lastColumn="0" w:oddVBand="0" w:evenVBand="0" w:oddHBand="1" w:evenHBand="0" w:firstRowFirstColumn="0" w:firstRowLastColumn="0" w:lastRowFirstColumn="0" w:lastRowLastColumn="0"/>
+            </w:pPr>
+            <w:r>
+              <w:t>TRuDI Version 1.2.1</w:t>
+            </w:r>
+            <w:r>
+              <w:t>5</w:t>
+            </w:r>
+          </w:p>
+        </w:tc>
+      </w:tr>
+      <w:tr>
+        <w:tc>
+          <w:tcPr>
+            <w:cnfStyle w:val="001000000000" w:firstRow="0" w:lastRow="0" w:firstColumn="1" w:lastColumn="0" w:oddVBand="0" w:evenVBand="0" w:oddHBand="0" w:evenHBand="0" w:firstRowFirstColumn="0" w:firstRowLastColumn="0" w:lastRowFirstColumn="0" w:lastRowLastColumn="0"/>
+            <w:tcW w:w="1269" w:type="dxa"/>
+          </w:tcPr>
+          <w:p>
+            <w:r>
+              <w:t>1.11</w:t>
+            </w:r>
+          </w:p>
+        </w:tc>
+        <w:tc>
+          <w:tcPr>
+            <w:tcW w:w="1682" w:type="dxa"/>
+          </w:tcPr>
+          <w:p>
+            <w:pPr>
+              <w:cnfStyle w:val="000000000000" w:firstRow="0" w:lastRow="0" w:firstColumn="0" w:lastColumn="0" w:oddVBand="0" w:evenVBand="0" w:oddHBand="0" w:evenHBand="0" w:firstRowFirstColumn="0" w:firstRowLastColumn="0" w:lastRowFirstColumn="0" w:lastRowLastColumn="0"/>
+            </w:pPr>
+            <w:r>
+              <w:t>08.01.20</w:t>
+            </w:r>
+            <w:r>
+              <w:t>20</w:t>
+            </w:r>
+          </w:p>
+        </w:tc>
+        <w:tc>
+          <w:tcPr>
+            <w:tcW w:w="1537" w:type="dxa"/>
+          </w:tcPr>
+          <w:p>
+            <w:pPr>
+              <w:cnfStyle w:val="000000000000" w:firstRow="0" w:lastRow="0" w:firstColumn="0" w:lastColumn="0" w:oddVBand="0" w:evenVBand="0" w:oddHBand="0" w:evenHBand="0" w:firstRowFirstColumn="0" w:firstRowLastColumn="0" w:lastRowFirstColumn="0" w:lastRowLastColumn="0"/>
+            </w:pPr>
+            <w:r>
+              <w:t>T. Müller</w:t>
+            </w:r>
+          </w:p>
+        </w:tc>
+        <w:tc>
+          <w:tcPr>
+            <w:tcW w:w="4395" w:type="dxa"/>
+          </w:tcPr>
+          <w:p>
+            <w:pPr>
+              <w:cnfStyle w:val="000000000000" w:firstRow="0" w:lastRow="0" w:firstColumn="0" w:lastColumn="0" w:oddVBand="0" w:evenVBand="0" w:oddHBand="0" w:evenHBand="0" w:firstRowFirstColumn="0" w:firstRowLastColumn="0" w:lastRowFirstColumn="0" w:lastRowLastColumn="0"/>
+            </w:pPr>
+            <w:r>
+              <w:t>TRuDI Version 1.3.0</w:t>
+            </w:r>
+          </w:p>
+        </w:tc>
+      </w:tr>
+      <w:tr>
+        <w:trPr>
+          <w:cnfStyle w:val="000000100000" w:firstRow="0" w:lastRow="0" w:firstColumn="0" w:lastColumn="0" w:oddVBand="0" w:evenVBand="0" w:oddHBand="1" w:evenHBand="0" w:firstRowFirstColumn="0" w:firstRowLastColumn="0" w:lastRowFirstColumn="0" w:lastRowLastColumn="0"/>
+        </w:trPr>
+        <w:tc>
+          <w:tcPr>
+            <w:cnfStyle w:val="001000000000" w:firstRow="0" w:lastRow="0" w:firstColumn="1" w:lastColumn="0" w:oddVBand="0" w:evenVBand="0" w:oddHBand="0" w:evenHBand="0" w:firstRowFirstColumn="0" w:firstRowLastColumn="0" w:lastRowFirstColumn="0" w:lastRowLastColumn="0"/>
+            <w:tcW w:w="1269" w:type="dxa"/>
+          </w:tcPr>
+          <w:p>
+            <w:r>
+              <w:t>1.12</w:t>
+            </w:r>
+          </w:p>
+        </w:tc>
+        <w:tc>
+          <w:tcPr>
+            <w:tcW w:w="1682" w:type="dxa"/>
+          </w:tcPr>
+          <w:p>
+            <w:pPr>
+              <w:cnfStyle w:val="000000100000" w:firstRow="0" w:lastRow="0" w:firstColumn="0" w:lastColumn="0" w:oddVBand="0" w:evenVBand="0" w:oddHBand="1" w:evenHBand="0" w:firstRowFirstColumn="0" w:firstRowLastColumn="0" w:lastRowFirstColumn="0" w:lastRowLastColumn="0"/>
+            </w:pPr>
+            <w:r>
+              <w:t>17.03.2020</w:t>
+            </w:r>
+          </w:p>
+        </w:tc>
+        <w:tc>
+          <w:tcPr>
+            <w:tcW w:w="1537" w:type="dxa"/>
+          </w:tcPr>
+          <w:p>
+            <w:pPr>
+              <w:cnfStyle w:val="000000100000" w:firstRow="0" w:lastRow="0" w:firstColumn="0" w:lastColumn="0" w:oddVBand="0" w:evenVBand="0" w:oddHBand="1" w:evenHBand="0" w:firstRowFirstColumn="0" w:firstRowLastColumn="0" w:lastRowFirstColumn="0" w:lastRowLastColumn="0"/>
+            </w:pPr>
+            <w:r>
+              <w:t>T. Müller</w:t>
+            </w:r>
+          </w:p>
+        </w:tc>
+        <w:tc>
+          <w:tcPr>
+            <w:tcW w:w="4395" w:type="dxa"/>
+          </w:tcPr>
+          <w:p>
+            <w:pPr>
+              <w:cnfStyle w:val="000000100000" w:firstRow="0" w:lastRow="0" w:firstColumn="0" w:lastColumn="0" w:oddVBand="0" w:evenVBand="0" w:oddHBand="1" w:evenHBand="0" w:firstRowFirstColumn="0" w:firstRowLastColumn="0" w:lastRowFirstColumn="0" w:lastRowLastColumn="0"/>
+            </w:pPr>
+            <w:r>
+              <w:t>TRuDI Version 1.3.1</w:t>
+            </w:r>
+          </w:p>
+        </w:tc>
+      </w:tr>
+      <w:tr>
+        <w:tc>
+          <w:tcPr>
+            <w:cnfStyle w:val="001000000000" w:firstRow="0" w:lastRow="0" w:firstColumn="1" w:lastColumn="0" w:oddVBand="0" w:evenVBand="0" w:oddHBand="0" w:evenHBand="0" w:firstRowFirstColumn="0" w:firstRowLastColumn="0" w:lastRowFirstColumn="0" w:lastRowLastColumn="0"/>
+            <w:tcW w:w="1269" w:type="dxa"/>
+          </w:tcPr>
+          <w:p>
+            <w:r>
+              <w:t>1.13</w:t>
+            </w:r>
+          </w:p>
+        </w:tc>
+        <w:tc>
+          <w:tcPr>
+            <w:tcW w:w="1682" w:type="dxa"/>
+          </w:tcPr>
+          <w:p>
+            <w:pPr>
+              <w:cnfStyle w:val="000000000000" w:firstRow="0" w:lastRow="0" w:firstColumn="0" w:lastColumn="0" w:oddVBand="0" w:evenVBand="0" w:oddHBand="0" w:evenHBand="0" w:firstRowFirstColumn="0" w:firstRowLastColumn="0" w:lastRowFirstColumn="0" w:lastRowLastColumn="0"/>
+            </w:pPr>
+            <w:r>
+              <w:t>18.08.2020</w:t>
+            </w:r>
+          </w:p>
+        </w:tc>
+        <w:tc>
+          <w:tcPr>
+            <w:tcW w:w="1537" w:type="dxa"/>
+          </w:tcPr>
+          <w:p>
+            <w:pPr>
+              <w:cnfStyle w:val="000000000000" w:firstRow="0" w:lastRow="0" w:firstColumn="0" w:lastColumn="0" w:oddVBand="0" w:evenVBand="0" w:oddHBand="0" w:evenHBand="0" w:firstRowFirstColumn="0" w:firstRowLastColumn="0" w:lastRowFirstColumn="0" w:lastRowLastColumn="0"/>
+            </w:pPr>
+            <w:r>
+              <w:t>T. Müller</w:t>
+            </w:r>
+          </w:p>
+        </w:tc>
+        <w:tc>
+          <w:tcPr>
+            <w:tcW w:w="4395" w:type="dxa"/>
+          </w:tcPr>
+          <w:p>
+            <w:pPr>
+              <w:cnfStyle w:val="000000000000" w:firstRow="0" w:lastRow="0" w:firstColumn="0" w:lastColumn="0" w:oddVBand="0" w:evenVBand="0" w:oddHBand="0" w:evenHBand="0" w:firstRowFirstColumn="0" w:firstRowLastColumn="0" w:lastRowFirstColumn="0" w:lastRowLastColumn="0"/>
+            </w:pPr>
+            <w:r>
+              <w:t>TRuDI Version 1.4.0</w:t>
+            </w:r>
+          </w:p>
+        </w:tc>
+      </w:tr>
+      <w:tr>
+        <w:trPr>
+          <w:cnfStyle w:val="000000100000" w:firstRow="0" w:lastRow="0" w:firstColumn="0" w:lastColumn="0" w:oddVBand="0" w:evenVBand="0" w:oddHBand="1" w:evenHBand="0" w:firstRowFirstColumn="0" w:firstRowLastColumn="0" w:lastRowFirstColumn="0" w:lastRowLastColumn="0"/>
+        </w:trPr>
+        <w:tc>
+          <w:tcPr>
+            <w:cnfStyle w:val="001000000000" w:firstRow="0" w:lastRow="0" w:firstColumn="1" w:lastColumn="0" w:oddVBand="0" w:evenVBand="0" w:oddHBand="0" w:evenHBand="0" w:firstRowFirstColumn="0" w:firstRowLastColumn="0" w:lastRowFirstColumn="0" w:lastRowLastColumn="0"/>
+            <w:tcW w:w="1269" w:type="dxa"/>
+          </w:tcPr>
+          <w:p>
+            <w:r>
+              <w:t>1.14</w:t>
+            </w:r>
+          </w:p>
+        </w:tc>
+        <w:tc>
+          <w:tcPr>
+            <w:tcW w:w="1682" w:type="dxa"/>
+          </w:tcPr>
+          <w:p>
+            <w:pPr>
+              <w:cnfStyle w:val="000000100000" w:firstRow="0" w:lastRow="0" w:firstColumn="0" w:lastColumn="0" w:oddVBand="0" w:evenVBand="0" w:oddHBand="1" w:evenHBand="0" w:firstRowFirstColumn="0" w:firstRowLastColumn="0" w:lastRowFirstColumn="0" w:lastRowLastColumn="0"/>
+            </w:pPr>
+            <w:r>
+              <w:t>25.08.2020</w:t>
+            </w:r>
+          </w:p>
+        </w:tc>
+        <w:tc>
+          <w:tcPr>
+            <w:tcW w:w="1537" w:type="dxa"/>
+          </w:tcPr>
+          <w:p>
+            <w:pPr>
+              <w:cnfStyle w:val="000000100000" w:firstRow="0" w:lastRow="0" w:firstColumn="0" w:lastColumn="0" w:oddVBand="0" w:evenVBand="0" w:oddHBand="1" w:evenHBand="0" w:firstRowFirstColumn="0" w:firstRowLastColumn="0" w:lastRowFirstColumn="0" w:lastRowLastColumn="0"/>
+            </w:pPr>
+            <w:r>
+              <w:t>T. Müller</w:t>
+            </w:r>
+          </w:p>
+        </w:tc>
+        <w:tc>
+          <w:tcPr>
+            <w:tcW w:w="4395" w:type="dxa"/>
+          </w:tcPr>
+          <w:p>
+            <w:pPr>
+              <w:cnfStyle w:val="000000100000" w:firstRow="0" w:lastRow="0" w:firstColumn="0" w:lastColumn="0" w:oddVBand="0" w:evenVBand="0" w:oddHBand="1" w:evenHBand="0" w:firstRowFirstColumn="0" w:firstRowLastColumn="0" w:lastRowFirstColumn="0" w:lastRowLastColumn="0"/>
+            </w:pPr>
+            <w:r>
+              <w:t>TRuDI Version 1.4.2</w:t>
+            </w:r>
+          </w:p>
+        </w:tc>
+      </w:tr>
+      <w:tr>
+        <w:tc>
+          <w:tcPr>
+            <w:cnfStyle w:val="001000000000" w:firstRow="0" w:lastRow="0" w:firstColumn="1" w:lastColumn="0" w:oddVBand="0" w:evenVBand="0" w:oddHBand="0" w:evenHBand="0" w:firstRowFirstColumn="0" w:firstRowLastColumn="0" w:lastRowFirstColumn="0" w:lastRowLastColumn="0"/>
+            <w:tcW w:w="1269" w:type="dxa"/>
+          </w:tcPr>
+          <w:p>
+            <w:r>
+              <w:t>1.15</w:t>
+            </w:r>
+          </w:p>
+        </w:tc>
+        <w:tc>
+          <w:tcPr>
+            <w:tcW w:w="1682" w:type="dxa"/>
+          </w:tcPr>
+          <w:p>
+            <w:pPr>
+              <w:cnfStyle w:val="000000000000" w:firstRow="0" w:lastRow="0" w:firstColumn="0" w:lastColumn="0" w:oddVBand="0" w:evenVBand="0" w:oddHBand="0" w:evenHBand="0" w:firstRowFirstColumn="0" w:firstRowLastColumn="0" w:lastRowFirstColumn="0" w:lastRowLastColumn="0"/>
+            </w:pPr>
+            <w:r>
+              <w:t>10.09.2020</w:t>
+            </w:r>
+          </w:p>
+        </w:tc>
+        <w:tc>
+          <w:tcPr>
+            <w:tcW w:w="1537" w:type="dxa"/>
+          </w:tcPr>
+          <w:p>
+            <w:pPr>
+              <w:cnfStyle w:val="000000000000" w:firstRow="0" w:lastRow="0" w:firstColumn="0" w:lastColumn="0" w:oddVBand="0" w:evenVBand="0" w:oddHBand="0" w:evenHBand="0" w:firstRowFirstColumn="0" w:firstRowLastColumn="0" w:lastRowFirstColumn="0" w:lastRowLastColumn="0"/>
+            </w:pPr>
+            <w:r>
+              <w:t>T. Müller</w:t>
+            </w:r>
+          </w:p>
+        </w:tc>
+        <w:tc>
+          <w:tcPr>
+            <w:tcW w:w="4395" w:type="dxa"/>
+          </w:tcPr>
+          <w:p>
+            <w:pPr>
+              <w:cnfStyle w:val="000000000000" w:firstRow="0" w:lastRow="0" w:firstColumn="0" w:lastColumn="0" w:oddVBand="0" w:evenVBand="0" w:oddHBand="0" w:evenHBand="0" w:firstRowFirstColumn="0" w:firstRowLastColumn="0" w:lastRowFirstColumn="0" w:lastRowLastColumn="0"/>
+            </w:pPr>
+            <w:r>
+              <w:t>TRuDI Version 1.4.4</w:t>
+            </w:r>
+          </w:p>
+        </w:tc>
+      </w:tr>
+      <w:tr>
+        <w:trPr>
+          <w:cnfStyle w:val="000000100000" w:firstRow="0" w:lastRow="0" w:firstColumn="0" w:lastColumn="0" w:oddVBand="0" w:evenVBand="0" w:oddHBand="1" w:evenHBand="0" w:firstRowFirstColumn="0" w:firstRowLastColumn="0" w:lastRowFirstColumn="0" w:lastRowLastColumn="0"/>
+        </w:trPr>
+        <w:tc>
+          <w:tcPr>
+            <w:cnfStyle w:val="001000000000" w:firstRow="0" w:lastRow="0" w:firstColumn="1" w:lastColumn="0" w:oddVBand="0" w:evenVBand="0" w:oddHBand="0" w:evenHBand="0" w:firstRowFirstColumn="0" w:firstRowLastColumn="0" w:lastRowFirstColumn="0" w:lastRowLastColumn="0"/>
+            <w:tcW w:w="1269" w:type="dxa"/>
+          </w:tcPr>
+          <w:p>
+            <w:r>
+              <w:t>1.16</w:t>
+            </w:r>
+          </w:p>
+        </w:tc>
+        <w:tc>
+          <w:tcPr>
+            <w:tcW w:w="1682" w:type="dxa"/>
+          </w:tcPr>
+          <w:p>
+            <w:pPr>
+              <w:cnfStyle w:val="000000100000" w:firstRow="0" w:lastRow="0" w:firstColumn="0" w:lastColumn="0" w:oddVBand="0" w:evenVBand="0" w:oddHBand="1" w:evenHBand="0" w:firstRowFirstColumn="0" w:firstRowLastColumn="0" w:lastRowFirstColumn="0" w:lastRowLastColumn="0"/>
+            </w:pPr>
+            <w:r>
+              <w:t>21.09.2020</w:t>
+            </w:r>
+          </w:p>
+        </w:tc>
+        <w:tc>
+          <w:tcPr>
+            <w:tcW w:w="1537" w:type="dxa"/>
+          </w:tcPr>
+          <w:p>
+            <w:pPr>
+              <w:cnfStyle w:val="000000100000" w:firstRow="0" w:lastRow="0" w:firstColumn="0" w:lastColumn="0" w:oddVBand="0" w:evenVBand="0" w:oddHBand="1" w:evenHBand="0" w:firstRowFirstColumn="0" w:firstRowLastColumn="0" w:lastRowFirstColumn="0" w:lastRowLastColumn="0"/>
+            </w:pPr>
+            <w:r>
+              <w:t>T. Müller</w:t>
+            </w:r>
+          </w:p>
+        </w:tc>
+        <w:tc>
+          <w:tcPr>
+            <w:tcW w:w="4395" w:type="dxa"/>
+          </w:tcPr>
+          <w:p>
+            <w:pPr>
+              <w:cnfStyle w:val="000000100000" w:firstRow="0" w:lastRow="0" w:firstColumn="0" w:lastColumn="0" w:oddVBand="0" w:evenVBand="0" w:oddHBand="1" w:evenHBand="0" w:firstRowFirstColumn="0" w:firstRowLastColumn="0" w:lastRowFirstColumn="0" w:lastRowLastColumn="0"/>
+            </w:pPr>
+            <w:r>
+              <w:t>TRuDI Version 1.4.5</w:t>
+            </w:r>
+          </w:p>
+        </w:tc>
+      </w:tr>
+      <w:tr>
+        <w:tc>
+          <w:tcPr>
+            <w:cnfStyle w:val="001000000000" w:firstRow="0" w:lastRow="0" w:firstColumn="1" w:lastColumn="0" w:oddVBand="0" w:evenVBand="0" w:oddHBand="0" w:evenHBand="0" w:firstRowFirstColumn="0" w:firstRowLastColumn="0" w:lastRowFirstColumn="0" w:lastRowLastColumn="0"/>
+            <w:tcW w:w="1269" w:type="dxa"/>
+          </w:tcPr>
+          <w:p>
+            <w:r>
+              <w:t>1.17</w:t>
+            </w:r>
+          </w:p>
+        </w:tc>
+        <w:tc>
+          <w:tcPr>
+            <w:tcW w:w="1682" w:type="dxa"/>
+          </w:tcPr>
+          <w:p>
+            <w:pPr>
+              <w:cnfStyle w:val="000000000000" w:firstRow="0" w:lastRow="0" w:firstColumn="0" w:lastColumn="0" w:oddVBand="0" w:evenVBand="0" w:oddHBand="0" w:evenHBand="0" w:firstRowFirstColumn="0" w:firstRowLastColumn="0" w:lastRowFirstColumn="0" w:lastRowLastColumn="0"/>
+            </w:pPr>
+            <w:r>
+              <w:t>14.04.2021</w:t>
+            </w:r>
+          </w:p>
+        </w:tc>
+        <w:tc>
+          <w:tcPr>
+            <w:tcW w:w="1537" w:type="dxa"/>
+          </w:tcPr>
+          <w:p>
+            <w:pPr>
+              <w:cnfStyle w:val="000000000000" w:firstRow="0" w:lastRow="0" w:firstColumn="0" w:lastColumn="0" w:oddVBand="0" w:evenVBand="0" w:oddHBand="0" w:evenHBand="0" w:firstRowFirstColumn="0" w:firstRowLastColumn="0" w:lastRowFirstColumn="0" w:lastRowLastColumn="0"/>
+            </w:pPr>
+            <w:r>
+              <w:t>T. Müller</w:t>
+            </w:r>
+          </w:p>
+        </w:tc>
+        <w:tc>
+          <w:tcPr>
+            <w:tcW w:w="4395" w:type="dxa"/>
+          </w:tcPr>
+          <w:p>
+            <w:pPr>
+              <w:cnfStyle w:val="000000000000" w:firstRow="0" w:lastRow="0" w:firstColumn="0" w:lastColumn="0" w:oddVBand="0" w:evenVBand="0" w:oddHBand="0" w:evenHBand="0" w:firstRowFirstColumn="0" w:firstRowLastColumn="0" w:lastRowFirstColumn="0" w:lastRowLastColumn="0"/>
+            </w:pPr>
+            <w:r>
+              <w:t>TRuDI Version 1.5.0</w:t>
+            </w:r>
+          </w:p>
+        </w:tc>
+      </w:tr>
+      <w:tr>
+        <w:trPr>
+          <w:cnfStyle w:val="000000100000" w:firstRow="0" w:lastRow="0" w:firstColumn="0" w:lastColumn="0" w:oddVBand="0" w:evenVBand="0" w:oddHBand="1" w:evenHBand="0" w:firstRowFirstColumn="0" w:firstRowLastColumn="0" w:lastRowFirstColumn="0" w:lastRowLastColumn="0"/>
+        </w:trPr>
+        <w:tc>
+          <w:tcPr>
+            <w:cnfStyle w:val="001000000000" w:firstRow="0" w:lastRow="0" w:firstColumn="1" w:lastColumn="0" w:oddVBand="0" w:evenVBand="0" w:oddHBand="0" w:evenHBand="0" w:firstRowFirstColumn="0" w:firstRowLastColumn="0" w:lastRowFirstColumn="0" w:lastRowLastColumn="0"/>
+            <w:tcW w:w="1269" w:type="dxa"/>
+          </w:tcPr>
+          <w:p>
+            <w:r>
+              <w:t>1.18</w:t>
+            </w:r>
+          </w:p>
+        </w:tc>
+        <w:tc>
+          <w:tcPr>
+            <w:tcW w:w="1682" w:type="dxa"/>
+          </w:tcPr>
+          <w:p>
+            <w:pPr>
+              <w:cnfStyle w:val="000000100000" w:firstRow="0" w:lastRow="0" w:firstColumn="0" w:lastColumn="0" w:oddVBand="0" w:evenVBand="0" w:oddHBand="1" w:evenHBand="0" w:firstRowFirstColumn="0" w:firstRowLastColumn="0" w:lastRowFirstColumn="0" w:lastRowLastColumn="0"/>
+            </w:pPr>
+            <w:r>
+              <w:t>17.06.2021</w:t>
+            </w:r>
+          </w:p>
+        </w:tc>
+        <w:tc>
+          <w:tcPr>
+            <w:tcW w:w="1537" w:type="dxa"/>
+          </w:tcPr>
+          <w:p>
+            <w:pPr>
+              <w:cnfStyle w:val="000000100000" w:firstRow="0" w:lastRow="0" w:firstColumn="0" w:lastColumn="0" w:oddVBand="0" w:evenVBand="0" w:oddHBand="1" w:evenHBand="0" w:firstRowFirstColumn="0" w:firstRowLastColumn="0" w:lastRowFirstColumn="0" w:lastRowLastColumn="0"/>
+            </w:pPr>
+            <w:r>
+              <w:t>T. Müller</w:t>
+            </w:r>
+          </w:p>
+        </w:tc>
+        <w:tc>
+          <w:tcPr>
+            <w:tcW w:w="4395" w:type="dxa"/>
+          </w:tcPr>
+          <w:p>
+            <w:pPr>
+              <w:cnfStyle w:val="000000100000" w:firstRow="0" w:lastRow="0" w:firstColumn="0" w:lastColumn="0" w:oddVBand="0" w:evenVBand="0" w:oddHBand="1" w:evenHBand="0" w:firstRowFirstColumn="0" w:firstRowLastColumn="0" w:lastRowFirstColumn="0" w:lastRowLastColumn="0"/>
+            </w:pPr>
+            <w:r>
+              <w:t>TRuDI Version 1.5.</w:t>
+            </w:r>
+            <w:r>
+              <w:t>1</w:t>
+            </w:r>
+            <w:r>
+              <w:t>, Transparenzfunktion für TAF-8</w:t>
             </w:r>
           </w:p>
         </w:tc>
       </w:tr>
     </w:tbl>
     <w:p/>
+    <w:p>
+      <w:pPr>
+        <w:rPr>
+          <w:rFonts w:asciiTheme="majorHAnsi" w:eastAsiaTheme="majorEastAsia" w:hAnsiTheme="majorHAnsi" w:cstheme="majorBidi"/>
+          <w:bCs/>
+          <w:kern w:val="0"/>
+          <w:sz w:val="36"/>
+          <w:szCs w:val="36"/>
+        </w:rPr>
+      </w:pPr>
+      <w:r>
+        <w:rPr>
+          <w:b/>
+          <w:sz w:val="36"/>
+          <w:szCs w:val="36"/>
+        </w:rPr>
+        <w:br w:type="page"/>
+      </w:r>
+    </w:p>
     <w:p>
       <w:pPr>
         <w:pStyle w:val="Inhaltsverzeichnisberschrift"/>
@@ -1059,6 +1788,7 @@
           <w:sz w:val="36"/>
           <w:szCs w:val="36"/>
         </w:rPr>
+        <w:lastRenderedPageBreak/>
         <w:t>Inhaltsverzeichnis</w:t>
       </w:r>
     </w:p>
@@ -1104,7 +1834,7 @@
           <w:r>
             <w:fldChar w:fldCharType="separate"/>
           </w:r>
-          <w:hyperlink w:anchor="_Toc495435547" w:history="1">
+          <w:hyperlink w:anchor="_Toc74847775" w:history="1">
             <w:r>
               <w:rPr>
                 <w:rStyle w:val="Hyperlink"/>
@@ -1150,7 +1880,7 @@
                 <w:noProof/>
                 <w:webHidden/>
               </w:rPr>
-              <w:instrText xml:space="preserve"> PAGEREF _Toc495435547 \h </w:instrText>
+              <w:instrText xml:space="preserve"> PAGEREF _Toc74847775 \h </w:instrText>
             </w:r>
             <w:r>
               <w:rPr>
@@ -1198,7 +1928,7 @@
               <w:lang w:eastAsia="de-DE"/>
             </w:rPr>
           </w:pPr>
-          <w:hyperlink w:anchor="_Toc495435548" w:history="1">
+          <w:hyperlink w:anchor="_Toc74847776" w:history="1">
             <w:r>
               <w:rPr>
                 <w:rStyle w:val="Hyperlink"/>
@@ -1244,7 +1974,7 @@
                 <w:noProof/>
                 <w:webHidden/>
               </w:rPr>
-              <w:instrText xml:space="preserve"> PAGEREF _Toc495435548 \h </w:instrText>
+              <w:instrText xml:space="preserve"> PAGEREF _Toc74847776 \h </w:instrText>
             </w:r>
             <w:r>
               <w:rPr>
@@ -1292,7 +2022,7 @@
               <w:lang w:eastAsia="de-DE"/>
             </w:rPr>
           </w:pPr>
-          <w:hyperlink w:anchor="_Toc495435549" w:history="1">
+          <w:hyperlink w:anchor="_Toc74847777" w:history="1">
             <w:r>
               <w:rPr>
                 <w:rStyle w:val="Hyperlink"/>
@@ -1338,7 +2068,7 @@
                 <w:noProof/>
                 <w:webHidden/>
               </w:rPr>
-              <w:instrText xml:space="preserve"> PAGEREF _Toc495435549 \h </w:instrText>
+              <w:instrText xml:space="preserve"> PAGEREF _Toc74847777 \h </w:instrText>
             </w:r>
             <w:r>
               <w:rPr>
@@ -1386,7 +2116,7 @@
               <w:lang w:eastAsia="de-DE"/>
             </w:rPr>
           </w:pPr>
-          <w:hyperlink w:anchor="_Toc495435550" w:history="1">
+          <w:hyperlink w:anchor="_Toc74847778" w:history="1">
             <w:r>
               <w:rPr>
                 <w:rStyle w:val="Hyperlink"/>
@@ -1432,7 +2162,7 @@
                 <w:noProof/>
                 <w:webHidden/>
               </w:rPr>
-              <w:instrText xml:space="preserve"> PAGEREF _Toc495435550 \h </w:instrText>
+              <w:instrText xml:space="preserve"> PAGEREF _Toc74847778 \h </w:instrText>
             </w:r>
             <w:r>
               <w:rPr>
@@ -1480,7 +2210,7 @@
               <w:lang w:eastAsia="de-DE"/>
             </w:rPr>
           </w:pPr>
-          <w:hyperlink w:anchor="_Toc495435551" w:history="1">
+          <w:hyperlink w:anchor="_Toc74847779" w:history="1">
             <w:r>
               <w:rPr>
                 <w:rStyle w:val="Hyperlink"/>
@@ -1528,7 +2258,7 @@
                 <w:noProof/>
                 <w:webHidden/>
               </w:rPr>
-              <w:instrText xml:space="preserve"> PAGEREF _Toc495435551 \h </w:instrText>
+              <w:instrText xml:space="preserve"> PAGEREF _Toc74847779 \h </w:instrText>
             </w:r>
             <w:r>
               <w:rPr>
@@ -1576,7 +2306,7 @@
               <w:lang w:eastAsia="de-DE"/>
             </w:rPr>
           </w:pPr>
-          <w:hyperlink w:anchor="_Toc495435552" w:history="1">
+          <w:hyperlink w:anchor="_Toc74847780" w:history="1">
             <w:r>
               <w:rPr>
                 <w:rStyle w:val="Hyperlink"/>
@@ -1622,7 +2352,7 @@
                 <w:noProof/>
                 <w:webHidden/>
               </w:rPr>
-              <w:instrText xml:space="preserve"> PAGEREF _Toc495435552 \h </w:instrText>
+              <w:instrText xml:space="preserve"> PAGEREF _Toc74847780 \h </w:instrText>
             </w:r>
             <w:r>
               <w:rPr>
@@ -1670,7 +2400,7 @@
               <w:lang w:eastAsia="de-DE"/>
             </w:rPr>
           </w:pPr>
-          <w:hyperlink w:anchor="_Toc495435553" w:history="1">
+          <w:hyperlink w:anchor="_Toc74847781" w:history="1">
             <w:r>
               <w:rPr>
                 <w:rStyle w:val="Hyperlink"/>
@@ -1716,7 +2446,7 @@
                 <w:noProof/>
                 <w:webHidden/>
               </w:rPr>
-              <w:instrText xml:space="preserve"> PAGEREF _Toc495435553 \h </w:instrText>
+              <w:instrText xml:space="preserve"> PAGEREF _Toc74847781 \h </w:instrText>
             </w:r>
             <w:r>
               <w:rPr>
@@ -1764,7 +2494,7 @@
               <w:lang w:eastAsia="de-DE"/>
             </w:rPr>
           </w:pPr>
-          <w:hyperlink w:anchor="_Toc495435554" w:history="1">
+          <w:hyperlink w:anchor="_Toc74847782" w:history="1">
             <w:r>
               <w:rPr>
                 <w:rStyle w:val="Hyperlink"/>
@@ -1810,7 +2540,7 @@
                 <w:noProof/>
                 <w:webHidden/>
               </w:rPr>
-              <w:instrText xml:space="preserve"> PAGEREF _Toc495435554 \h </w:instrText>
+              <w:instrText xml:space="preserve"> PAGEREF _Toc74847782 \h </w:instrText>
             </w:r>
             <w:r>
               <w:rPr>
@@ -1858,7 +2588,7 @@
               <w:lang w:eastAsia="de-DE"/>
             </w:rPr>
           </w:pPr>
-          <w:hyperlink w:anchor="_Toc495435555" w:history="1">
+          <w:hyperlink w:anchor="_Toc74847783" w:history="1">
             <w:r>
               <w:rPr>
                 <w:rStyle w:val="Hyperlink"/>
@@ -1904,7 +2634,7 @@
                 <w:noProof/>
                 <w:webHidden/>
               </w:rPr>
-              <w:instrText xml:space="preserve"> PAGEREF _Toc495435555 \h </w:instrText>
+              <w:instrText xml:space="preserve"> PAGEREF _Toc74847783 \h </w:instrText>
             </w:r>
             <w:r>
               <w:rPr>
@@ -1952,7 +2682,7 @@
               <w:lang w:eastAsia="de-DE"/>
             </w:rPr>
           </w:pPr>
-          <w:hyperlink w:anchor="_Toc495435556" w:history="1">
+          <w:hyperlink w:anchor="_Toc74847784" w:history="1">
             <w:r>
               <w:rPr>
                 <w:rStyle w:val="Hyperlink"/>
@@ -1998,7 +2728,7 @@
                 <w:noProof/>
                 <w:webHidden/>
               </w:rPr>
-              <w:instrText xml:space="preserve"> PAGEREF _Toc495435556 \h </w:instrText>
+              <w:instrText xml:space="preserve"> PAGEREF _Toc74847784 \h </w:instrText>
             </w:r>
             <w:r>
               <w:rPr>
@@ -2046,7 +2776,7 @@
               <w:lang w:eastAsia="de-DE"/>
             </w:rPr>
           </w:pPr>
-          <w:hyperlink w:anchor="_Toc495435557" w:history="1">
+          <w:hyperlink w:anchor="_Toc74847785" w:history="1">
             <w:r>
               <w:rPr>
                 <w:rStyle w:val="Hyperlink"/>
@@ -2092,7 +2822,7 @@
                 <w:noProof/>
                 <w:webHidden/>
               </w:rPr>
-              <w:instrText xml:space="preserve"> PAGEREF _Toc495435557 \h </w:instrText>
+              <w:instrText xml:space="preserve"> PAGEREF _Toc74847785 \h </w:instrText>
             </w:r>
             <w:r>
               <w:rPr>
@@ -2140,7 +2870,7 @@
               <w:lang w:eastAsia="de-DE"/>
             </w:rPr>
           </w:pPr>
-          <w:hyperlink w:anchor="_Toc495435558" w:history="1">
+          <w:hyperlink w:anchor="_Toc74847786" w:history="1">
             <w:r>
               <w:rPr>
                 <w:rStyle w:val="Hyperlink"/>
@@ -2186,7 +2916,7 @@
                 <w:noProof/>
                 <w:webHidden/>
               </w:rPr>
-              <w:instrText xml:space="preserve"> PAGEREF _Toc495435558 \h </w:instrText>
+              <w:instrText xml:space="preserve"> PAGEREF _Toc74847786 \h </w:instrText>
             </w:r>
             <w:r>
               <w:rPr>
@@ -2234,7 +2964,7 @@
               <w:lang w:eastAsia="de-DE"/>
             </w:rPr>
           </w:pPr>
-          <w:hyperlink w:anchor="_Toc495435559" w:history="1">
+          <w:hyperlink w:anchor="_Toc74847787" w:history="1">
             <w:r>
               <w:rPr>
                 <w:rStyle w:val="Hyperlink"/>
@@ -2280,7 +3010,7 @@
                 <w:noProof/>
                 <w:webHidden/>
               </w:rPr>
-              <w:instrText xml:space="preserve"> PAGEREF _Toc495435559 \h </w:instrText>
+              <w:instrText xml:space="preserve"> PAGEREF _Toc74847787 \h </w:instrText>
             </w:r>
             <w:r>
               <w:rPr>
@@ -2300,7 +3030,7 @@
                 <w:noProof/>
                 <w:webHidden/>
               </w:rPr>
-              <w:t>8</w:t>
+              <w:t>9</w:t>
             </w:r>
             <w:r>
               <w:rPr>
@@ -2328,7 +3058,7 @@
               <w:lang w:eastAsia="de-DE"/>
             </w:rPr>
           </w:pPr>
-          <w:hyperlink w:anchor="_Toc495435560" w:history="1">
+          <w:hyperlink w:anchor="_Toc74847788" w:history="1">
             <w:r>
               <w:rPr>
                 <w:rStyle w:val="Hyperlink"/>
@@ -2374,7 +3104,7 @@
                 <w:noProof/>
                 <w:webHidden/>
               </w:rPr>
-              <w:instrText xml:space="preserve"> PAGEREF _Toc495435560 \h </w:instrText>
+              <w:instrText xml:space="preserve"> PAGEREF _Toc74847788 \h </w:instrText>
             </w:r>
             <w:r>
               <w:rPr>
@@ -2394,7 +3124,7 @@
                 <w:noProof/>
                 <w:webHidden/>
               </w:rPr>
-              <w:t>8</w:t>
+              <w:t>10</w:t>
             </w:r>
             <w:r>
               <w:rPr>
@@ -2422,7 +3152,7 @@
               <w:lang w:eastAsia="de-DE"/>
             </w:rPr>
           </w:pPr>
-          <w:hyperlink w:anchor="_Toc495435561" w:history="1">
+          <w:hyperlink w:anchor="_Toc74847789" w:history="1">
             <w:r>
               <w:rPr>
                 <w:rStyle w:val="Hyperlink"/>
@@ -2468,7 +3198,7 @@
                 <w:noProof/>
                 <w:webHidden/>
               </w:rPr>
-              <w:instrText xml:space="preserve"> PAGEREF _Toc495435561 \h </w:instrText>
+              <w:instrText xml:space="preserve"> PAGEREF _Toc74847789 \h </w:instrText>
             </w:r>
             <w:r>
               <w:rPr>
@@ -2488,7 +3218,7 @@
                 <w:noProof/>
                 <w:webHidden/>
               </w:rPr>
-              <w:t>10</w:t>
+              <w:t>11</w:t>
             </w:r>
             <w:r>
               <w:rPr>
@@ -2516,7 +3246,7 @@
               <w:lang w:eastAsia="de-DE"/>
             </w:rPr>
           </w:pPr>
-          <w:hyperlink w:anchor="_Toc495435562" w:history="1">
+          <w:hyperlink w:anchor="_Toc74847790" w:history="1">
             <w:r>
               <w:rPr>
                 <w:rStyle w:val="Hyperlink"/>
@@ -2562,7 +3292,7 @@
                 <w:noProof/>
                 <w:webHidden/>
               </w:rPr>
-              <w:instrText xml:space="preserve"> PAGEREF _Toc495435562 \h </w:instrText>
+              <w:instrText xml:space="preserve"> PAGEREF _Toc74847790 \h </w:instrText>
             </w:r>
             <w:r>
               <w:rPr>
@@ -2582,7 +3312,101 @@
                 <w:noProof/>
                 <w:webHidden/>
               </w:rPr>
-              <w:t>13</w:t>
+              <w:t>14</w:t>
+            </w:r>
+            <w:r>
+              <w:rPr>
+                <w:noProof/>
+                <w:webHidden/>
+              </w:rPr>
+              <w:fldChar w:fldCharType="end"/>
+            </w:r>
+          </w:hyperlink>
+        </w:p>
+        <w:p>
+          <w:pPr>
+            <w:pStyle w:val="Verzeichnis3"/>
+            <w:tabs>
+              <w:tab w:val="left" w:pos="1100"/>
+              <w:tab w:val="right" w:leader="dot" w:pos="8873"/>
+            </w:tabs>
+            <w:rPr>
+              <w:rFonts w:eastAsiaTheme="minorEastAsia"/>
+              <w:noProof/>
+              <w:color w:val="auto"/>
+              <w:kern w:val="0"/>
+              <w:sz w:val="22"/>
+              <w:szCs w:val="22"/>
+              <w:lang w:eastAsia="de-DE"/>
+            </w:rPr>
+          </w:pPr>
+          <w:hyperlink w:anchor="_Toc74847791" w:history="1">
+            <w:r>
+              <w:rPr>
+                <w:rStyle w:val="Hyperlink"/>
+                <w:noProof/>
+              </w:rPr>
+              <w:t>2.3.7</w:t>
+            </w:r>
+            <w:r>
+              <w:rPr>
+                <w:rFonts w:eastAsiaTheme="minorEastAsia"/>
+                <w:noProof/>
+                <w:color w:val="auto"/>
+                <w:kern w:val="0"/>
+                <w:sz w:val="22"/>
+                <w:szCs w:val="22"/>
+                <w:lang w:eastAsia="de-DE"/>
+              </w:rPr>
+              <w:tab/>
+            </w:r>
+            <w:r>
+              <w:rPr>
+                <w:rStyle w:val="Hyperlink"/>
+                <w:noProof/>
+              </w:rPr>
+              <w:t>Leistungsmittelwertberechnung und TAF-Plugin TAF-8</w:t>
+            </w:r>
+            <w:r>
+              <w:rPr>
+                <w:noProof/>
+                <w:webHidden/>
+              </w:rPr>
+              <w:tab/>
+            </w:r>
+            <w:r>
+              <w:rPr>
+                <w:noProof/>
+                <w:webHidden/>
+              </w:rPr>
+              <w:fldChar w:fldCharType="begin"/>
+            </w:r>
+            <w:r>
+              <w:rPr>
+                <w:noProof/>
+                <w:webHidden/>
+              </w:rPr>
+              <w:instrText xml:space="preserve"> PAGEREF _Toc74847791 \h </w:instrText>
+            </w:r>
+            <w:r>
+              <w:rPr>
+                <w:noProof/>
+                <w:webHidden/>
+              </w:rPr>
+            </w:r>
+            <w:r>
+              <w:rPr>
+                <w:noProof/>
+                <w:webHidden/>
+              </w:rPr>
+              <w:fldChar w:fldCharType="separate"/>
+            </w:r>
+            <w:r>
+              <w:rPr>
+                <w:noProof/>
+                <w:webHidden/>
+              </w:rPr>
+              <w:t>15</w:t>
             </w:r>
             <w:r>
               <w:rPr>
@@ -2610,7 +3434,7 @@
               <w:lang w:eastAsia="de-DE"/>
             </w:rPr>
           </w:pPr>
-          <w:hyperlink w:anchor="_Toc495435563" w:history="1">
+          <w:hyperlink w:anchor="_Toc74847792" w:history="1">
             <w:r>
               <w:rPr>
                 <w:rStyle w:val="Hyperlink"/>
@@ -2656,7 +3480,7 @@
                 <w:noProof/>
                 <w:webHidden/>
               </w:rPr>
-              <w:instrText xml:space="preserve"> PAGEREF _Toc495435563 \h </w:instrText>
+              <w:instrText xml:space="preserve"> PAGEREF _Toc74847792 \h </w:instrText>
             </w:r>
             <w:r>
               <w:rPr>
@@ -2676,7 +3500,7 @@
                 <w:noProof/>
                 <w:webHidden/>
               </w:rPr>
-              <w:t>14</w:t>
+              <w:t>15</w:t>
             </w:r>
             <w:r>
               <w:rPr>
@@ -2704,7 +3528,7 @@
               <w:lang w:eastAsia="de-DE"/>
             </w:rPr>
           </w:pPr>
-          <w:hyperlink w:anchor="_Toc495435564" w:history="1">
+          <w:hyperlink w:anchor="_Toc74847793" w:history="1">
             <w:r>
               <w:rPr>
                 <w:rStyle w:val="Hyperlink"/>
@@ -2750,7 +3574,7 @@
                 <w:noProof/>
                 <w:webHidden/>
               </w:rPr>
-              <w:instrText xml:space="preserve"> PAGEREF _Toc495435564 \h </w:instrText>
+              <w:instrText xml:space="preserve"> PAGEREF _Toc74847793 \h </w:instrText>
             </w:r>
             <w:r>
               <w:rPr>
@@ -2770,7 +3594,7 @@
                 <w:noProof/>
                 <w:webHidden/>
               </w:rPr>
-              <w:t>14</w:t>
+              <w:t>15</w:t>
             </w:r>
             <w:r>
               <w:rPr>
@@ -2798,7 +3622,7 @@
               <w:lang w:eastAsia="de-DE"/>
             </w:rPr>
           </w:pPr>
-          <w:hyperlink w:anchor="_Toc495435565" w:history="1">
+          <w:hyperlink w:anchor="_Toc74847794" w:history="1">
             <w:r>
               <w:rPr>
                 <w:rStyle w:val="Hyperlink"/>
@@ -2844,7 +3668,7 @@
                 <w:noProof/>
                 <w:webHidden/>
               </w:rPr>
-              <w:instrText xml:space="preserve"> PAGEREF _Toc495435565 \h </w:instrText>
+              <w:instrText xml:space="preserve"> PAGEREF _Toc74847794 \h </w:instrText>
             </w:r>
             <w:r>
               <w:rPr>
@@ -2864,7 +3688,7 @@
                 <w:noProof/>
                 <w:webHidden/>
               </w:rPr>
-              <w:t>19</w:t>
+              <w:t>20</w:t>
             </w:r>
             <w:r>
               <w:rPr>
@@ -2892,7 +3716,7 @@
               <w:lang w:eastAsia="de-DE"/>
             </w:rPr>
           </w:pPr>
-          <w:hyperlink w:anchor="_Toc495435566" w:history="1">
+          <w:hyperlink w:anchor="_Toc74847795" w:history="1">
             <w:r>
               <w:rPr>
                 <w:rStyle w:val="Hyperlink"/>
@@ -2938,7 +3762,7 @@
                 <w:noProof/>
                 <w:webHidden/>
               </w:rPr>
-              <w:instrText xml:space="preserve"> PAGEREF _Toc495435566 \h </w:instrText>
+              <w:instrText xml:space="preserve"> PAGEREF _Toc74847795 \h </w:instrText>
             </w:r>
             <w:r>
               <w:rPr>
@@ -2958,7 +3782,7 @@
                 <w:noProof/>
                 <w:webHidden/>
               </w:rPr>
-              <w:t>20</w:t>
+              <w:t>22</w:t>
             </w:r>
             <w:r>
               <w:rPr>
@@ -2996,7 +3820,7 @@
         <w:sectPr>
           <w:footerReference w:type="default" r:id="rId11"/>
           <w:pgSz w:w="11907" w:h="16839" w:code="9"/>
-          <w:pgMar w:top="2678" w:right="1512" w:bottom="1913" w:left="1512" w:header="918" w:footer="709" w:gutter="0"/>
+          <w:pgMar w:top="851" w:right="1512" w:bottom="1913" w:left="1512" w:header="918" w:footer="709" w:gutter="0"/>
           <w:pgNumType w:fmt="lowerRoman" w:start="1"/>
           <w:cols w:space="720"/>
           <w:docGrid w:linePitch="360"/>
@@ -3011,7 +3835,7 @@
           <w:numId w:val="24"/>
         </w:numPr>
       </w:pPr>
-      <w:bookmarkStart w:id="1" w:name="_Toc495435547"/>
+      <w:bookmarkStart w:id="1" w:name="_Toc74847775"/>
       <w:r>
         <w:lastRenderedPageBreak/>
         <w:t>Softwarestruktur</w:t>
@@ -3021,30 +3845,33 @@
     </w:p>
     <w:p>
       <w:r>
-        <w:t xml:space="preserve">Die </w:t>
-      </w:r>
-      <w:proofErr w:type="spellStart"/>
-      <w:r>
-        <w:t>TRuDI</w:t>
-      </w:r>
-      <w:proofErr w:type="spellEnd"/>
+        <w:t xml:space="preserve">Die TRuDI </w:t>
+      </w:r>
+      <w:r>
+        <w:t>1.</w:t>
+      </w:r>
+      <w:r>
+        <w:t>5.</w:t>
+      </w:r>
+      <w:r>
+        <w:t>1</w:t>
+      </w:r>
       <w:r>
         <w:t xml:space="preserve"> </w:t>
       </w:r>
       <w:r>
-        <w:t>1.</w:t>
-      </w:r>
-      <w:r>
-        <w:t>1.0</w:t>
-      </w:r>
-      <w:r>
-        <w:t xml:space="preserve"> </w:t>
-      </w:r>
-      <w:r>
         <w:t xml:space="preserve">Anwendung </w:t>
       </w:r>
       <w:r>
-        <w:t>besteht aus Frontend und Backend Prozess.</w:t>
+        <w:t xml:space="preserve">besteht aus Frontend und </w:t>
+      </w:r>
+      <w:proofErr w:type="gramStart"/>
+      <w:r>
+        <w:t>Backend</w:t>
+      </w:r>
+      <w:proofErr w:type="gramEnd"/>
+      <w:r>
+        <w:t xml:space="preserve"> Prozess.</w:t>
       </w:r>
       <w:r>
         <w:t xml:space="preserve"> </w:t>
@@ -3124,7 +3951,7 @@
         <mc:AlternateContent>
           <mc:Choice Requires="wpg">
             <w:drawing>
-              <wp:anchor distT="0" distB="0" distL="114300" distR="114300" simplePos="0" relativeHeight="251668480" behindDoc="0" locked="0" layoutInCell="1" allowOverlap="1">
+              <wp:anchor distT="0" distB="0" distL="114300" distR="114300" simplePos="0" relativeHeight="251668480" behindDoc="0" locked="0" layoutInCell="1" allowOverlap="1" wp14:anchorId="6E8F70CC" wp14:editId="0FE741B7">
                 <wp:simplePos x="0" y="0"/>
                 <wp:positionH relativeFrom="margin">
                   <wp:align>left</wp:align>
@@ -3479,7 +4306,7 @@
           </mc:Choice>
           <mc:Fallback>
             <w:pict>
-              <v:group id="Gruppieren 14" o:spid="_x0000_s1028" style="position:absolute;margin-left:0;margin-top:.45pt;width:437.45pt;height:166.75pt;z-index:251668480;mso-position-horizontal:left;mso-position-horizontal-relative:margin" coordsize="55558,21181" o:gfxdata="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">
+              <v:group w14:anchorId="6E8F70CC" id="Gruppieren 14" o:spid="_x0000_s1028" style="position:absolute;margin-left:0;margin-top:.45pt;width:437.45pt;height:166.75pt;z-index:251668480;mso-position-horizontal:left;mso-position-horizontal-relative:margin" coordsize="55558,21181" o:gfxdata="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">
                 <v:group id="Gruppieren 13" o:spid="_x0000_s1029" style="position:absolute;width:55558;height:21181" coordsize="55558,21181" o:gfxdata="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">
                   <v:rect id="Rechteck 2" o:spid="_x0000_s1030" style="position:absolute;top:2951;width:22165;height:18230;visibility:visible;mso-wrap-style:square;v-text-anchor:middle" o:gfxdata="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" fillcolor="white [3201]" strokecolor="black [3200]" strokeweight="2pt">
                     <v:textbox>
@@ -3627,7 +4454,7 @@
         <mc:AlternateContent>
           <mc:Choice Requires="wps">
             <w:drawing>
-              <wp:anchor distT="0" distB="0" distL="114300" distR="114300" simplePos="0" relativeHeight="251670528" behindDoc="0" locked="0" layoutInCell="1" allowOverlap="1" wp14:anchorId="2EE09941" wp14:editId="796422C9">
+              <wp:anchor distT="0" distB="0" distL="114300" distR="114300" simplePos="0" relativeHeight="251670528" behindDoc="0" locked="0" layoutInCell="1" allowOverlap="1" wp14:anchorId="35D0C9D8" wp14:editId="25DC3E6F">
                 <wp:simplePos x="0" y="0"/>
                 <wp:positionH relativeFrom="margin">
                   <wp:align>left</wp:align>
@@ -3725,7 +4552,7 @@
           </mc:Choice>
           <mc:Fallback>
             <w:pict>
-              <v:shape w14:anchorId="2EE09941" id="Textfeld 1" o:spid="_x0000_s1036" type="#_x0000_t202" style="position:absolute;margin-left:0;margin-top:20pt;width:174.5pt;height:.05pt;z-index:251670528;visibility:visible;mso-wrap-style:square;mso-wrap-distance-left:9pt;mso-wrap-distance-top:0;mso-wrap-distance-right:9pt;mso-wrap-distance-bottom:0;mso-position-horizontal:left;mso-position-horizontal-relative:margin;mso-position-vertical:absolute;mso-position-vertical-relative:text;v-text-anchor:top" o:gfxdata="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" stroked="f">
+              <v:shape w14:anchorId="35D0C9D8" id="Textfeld 1" o:spid="_x0000_s1036" type="#_x0000_t202" style="position:absolute;margin-left:0;margin-top:20pt;width:174.5pt;height:.05pt;z-index:251670528;visibility:visible;mso-wrap-style:square;mso-wrap-distance-left:9pt;mso-wrap-distance-top:0;mso-wrap-distance-right:9pt;mso-wrap-distance-bottom:0;mso-position-horizontal:left;mso-position-horizontal-relative:margin;mso-position-vertical:absolute;mso-position-vertical-relative:text;v-text-anchor:top" o:gfxdata="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" stroked="f">
                 <v:textbox style="mso-fit-shape-to-text:t" inset="0,0,0,0">
                   <w:txbxContent>
                     <w:p>
@@ -4056,10 +4883,7 @@
               <w:cnfStyle w:val="000000000000" w:firstRow="0" w:lastRow="0" w:firstColumn="0" w:lastColumn="0" w:oddVBand="0" w:evenVBand="0" w:oddHBand="0" w:evenHBand="0" w:firstRowFirstColumn="0" w:firstRowLastColumn="0" w:lastRowFirstColumn="0" w:lastRowLastColumn="0"/>
             </w:pPr>
             <w:r>
-              <w:t>1.7.</w:t>
-            </w:r>
-            <w:r>
-              <w:t>14</w:t>
+              <w:t>9.2.1</w:t>
             </w:r>
           </w:p>
         </w:tc>
@@ -4098,7 +4922,19 @@
               <w:cnfStyle w:val="000000000000" w:firstRow="0" w:lastRow="0" w:firstColumn="0" w:lastColumn="0" w:oddVBand="0" w:evenVBand="0" w:oddHBand="0" w:evenHBand="0" w:firstRowFirstColumn="0" w:firstRowLastColumn="0" w:lastRowFirstColumn="0" w:lastRowLastColumn="0"/>
             </w:pPr>
             <w:r>
-              <w:t>8.11.1</w:t>
+              <w:t>12</w:t>
+            </w:r>
+            <w:r>
+              <w:t>.</w:t>
+            </w:r>
+            <w:r>
+              <w:t>14</w:t>
+            </w:r>
+            <w:r>
+              <w:t>.</w:t>
+            </w:r>
+            <w:r>
+              <w:t>1</w:t>
             </w:r>
           </w:p>
         </w:tc>
@@ -4140,7 +4976,19 @@
               <w:rPr>
                 <w:bCs/>
               </w:rPr>
-              <w:t>58.0.3029.110</w:t>
+              <w:t>83</w:t>
+            </w:r>
+            <w:r>
+              <w:rPr>
+                <w:bCs/>
+              </w:rPr>
+              <w:t>.0.</w:t>
+            </w:r>
+            <w:r>
+              <w:rPr>
+                <w:bCs/>
+              </w:rPr>
+              <w:t>4103.122</w:t>
             </w:r>
           </w:p>
         </w:tc>
@@ -4185,7 +5033,19 @@
               <w:rPr>
                 <w:bCs/>
               </w:rPr>
-              <w:t>5.8.283.38</w:t>
+              <w:t>8</w:t>
+            </w:r>
+            <w:r>
+              <w:rPr>
+                <w:bCs/>
+              </w:rPr>
+              <w:t>.</w:t>
+            </w:r>
+            <w:r>
+              <w:rPr>
+                <w:bCs/>
+              </w:rPr>
+              <w:t>3</w:t>
             </w:r>
           </w:p>
         </w:tc>
@@ -4254,7 +5114,7 @@
       <w:pPr>
         <w:pStyle w:val="berschrift1"/>
       </w:pPr>
-      <w:bookmarkStart w:id="2" w:name="_Toc495435548"/>
+      <w:bookmarkStart w:id="2" w:name="_Toc74847776"/>
       <w:r>
         <w:lastRenderedPageBreak/>
         <w:t>Frontend</w:t>
@@ -4265,7 +5125,7 @@
       <w:pPr>
         <w:pStyle w:val="berschrift2"/>
       </w:pPr>
-      <w:bookmarkStart w:id="3" w:name="_Toc495435549"/>
+      <w:bookmarkStart w:id="3" w:name="_Toc74847777"/>
       <w:r>
         <w:t>Starten und Beenden der Anwendung</w:t>
       </w:r>
@@ -4281,7 +5141,7 @@
           <w:lang w:eastAsia="de-DE"/>
         </w:rPr>
         <w:drawing>
-          <wp:inline distT="0" distB="0" distL="0" distR="0" wp14:anchorId="1F1F0059" wp14:editId="54F2DEFC">
+          <wp:inline distT="0" distB="0" distL="0" distR="0" wp14:anchorId="0D53EF6F" wp14:editId="68153742">
             <wp:extent cx="5640705" cy="4428490"/>
             <wp:effectExtent l="0" t="0" r="0" b="0"/>
             <wp:docPr id="46" name="Grafik 46"/>
@@ -4366,7 +5226,7 @@
         <w:pStyle w:val="berschrift3"/>
       </w:pPr>
       <w:bookmarkStart w:id="4" w:name="_Ref493159432"/>
-      <w:bookmarkStart w:id="5" w:name="_Toc495435550"/>
+      <w:bookmarkStart w:id="5" w:name="_Toc74847778"/>
       <w:r>
         <w:t>Implementierung</w:t>
       </w:r>
@@ -4495,7 +5355,7 @@
           <w:lang w:val="en-US"/>
         </w:rPr>
       </w:pPr>
-      <w:bookmarkStart w:id="6" w:name="_Toc495435551"/>
+      <w:bookmarkStart w:id="6" w:name="_Toc74847779"/>
       <w:r>
         <w:rPr>
           <w:lang w:val="en-US"/>
@@ -4520,9 +5380,17 @@
         <w:rPr>
           <w:lang w:val="en-US"/>
         </w:rPr>
-        <w:t>des Backends</w:t>
+        <w:t xml:space="preserve">des </w:t>
+      </w:r>
+      <w:proofErr w:type="gramStart"/>
+      <w:r>
+        <w:rPr>
+          <w:lang w:val="en-US"/>
+        </w:rPr>
+        <w:t>Backends</w:t>
       </w:r>
       <w:bookmarkEnd w:id="6"/>
+      <w:proofErr w:type="gramEnd"/>
     </w:p>
     <w:p>
       <w:r>
@@ -4629,7 +5497,15 @@
         <w:t xml:space="preserve">aufgerufen. </w:t>
       </w:r>
       <w:r>
-        <w:t xml:space="preserve">Dieses Verfahren soll sicherstellen, dass der Port unter dem das Backend erreichbar ist, nur dem Frontend bekannt ist. </w:t>
+        <w:t xml:space="preserve">Dieses Verfahren soll sicherstellen, dass der </w:t>
+      </w:r>
+      <w:proofErr w:type="gramStart"/>
+      <w:r>
+        <w:t>Port</w:t>
+      </w:r>
+      <w:proofErr w:type="gramEnd"/>
+      <w:r>
+        <w:t xml:space="preserve"> unter dem das Backend erreichbar ist, nur dem Frontend bekannt ist. </w:t>
       </w:r>
     </w:p>
     <w:p>
@@ -4637,7 +5513,15 @@
         <w:t xml:space="preserve">Zusätzlich kommt </w:t>
       </w:r>
       <w:r>
-        <w:t xml:space="preserve">zwischen Frontend und Backend kommt HTTPS zum Einsatz. Das Serverzertifikat des </w:t>
+        <w:t xml:space="preserve">zwischen Frontend und </w:t>
+      </w:r>
+      <w:proofErr w:type="gramStart"/>
+      <w:r>
+        <w:t>Backend</w:t>
+      </w:r>
+      <w:proofErr w:type="gramEnd"/>
+      <w:r>
+        <w:t xml:space="preserve"> kommt HTTPS zum Einsatz. Das Serverzertifikat des </w:t>
       </w:r>
       <w:proofErr w:type="spellStart"/>
       <w:r>
@@ -4661,7 +5545,15 @@
     </w:p>
     <w:p>
       <w:r>
-        <w:t>Es ist ein Eventhandler eingerichtet um sicherzustellen, dass b</w:t>
+        <w:t xml:space="preserve">Es ist ein Eventhandler </w:t>
+      </w:r>
+      <w:proofErr w:type="gramStart"/>
+      <w:r>
+        <w:t>eingerichtet</w:t>
+      </w:r>
+      <w:proofErr w:type="gramEnd"/>
+      <w:r>
+        <w:t xml:space="preserve"> um sicherzustellen, dass b</w:t>
       </w:r>
       <w:r>
         <w:t xml:space="preserve">eim Beenden der </w:t>
@@ -4695,7 +5587,7 @@
         <w:pStyle w:val="berschrift3"/>
       </w:pPr>
       <w:bookmarkStart w:id="7" w:name="_Ref493159554"/>
-      <w:bookmarkStart w:id="8" w:name="_Toc495435552"/>
+      <w:bookmarkStart w:id="8" w:name="_Toc74847780"/>
       <w:r>
         <w:t>Identität der Software</w:t>
       </w:r>
@@ -4746,30 +5638,6 @@
       <w:proofErr w:type="gramEnd"/>
     </w:p>
     <w:p>
-      <w:pPr>
-        <w:ind w:firstLine="720"/>
-        <w:rPr>
-          <w:lang w:val="en-GB"/>
-        </w:rPr>
-      </w:pPr>
-      <w:r>
-        <w:rPr>
-          <w:lang w:val="en-GB"/>
-        </w:rPr>
-        <w:t xml:space="preserve">- </w:t>
-      </w:r>
-      <w:proofErr w:type="spellStart"/>
-      <w:proofErr w:type="gramStart"/>
-      <w:r>
-        <w:rPr>
-          <w:lang w:val="en-GB"/>
-        </w:rPr>
-        <w:t>electron.asar</w:t>
-      </w:r>
-      <w:proofErr w:type="spellEnd"/>
-      <w:proofErr w:type="gramEnd"/>
-    </w:p>
-    <w:p>
       <w:r>
         <w:t>Dieser Hashwert zeigt die Identität der Software und kann mit einem veröffentlichten Stand verglichen werden.</w:t>
       </w:r>
@@ -4779,7 +5647,7 @@
         <w:pStyle w:val="berschrift1"/>
       </w:pPr>
       <w:bookmarkStart w:id="9" w:name="_Ref493150984"/>
-      <w:bookmarkStart w:id="10" w:name="_Toc495435553"/>
+      <w:bookmarkStart w:id="10" w:name="_Toc74847781"/>
       <w:r>
         <w:lastRenderedPageBreak/>
         <w:t>Benutzeroberfläche</w:t>
@@ -4791,7 +5659,7 @@
       <w:pPr>
         <w:pStyle w:val="berschrift2"/>
       </w:pPr>
-      <w:bookmarkStart w:id="11" w:name="_Toc495435554"/>
+      <w:bookmarkStart w:id="11" w:name="_Toc74847782"/>
       <w:r>
         <w:t xml:space="preserve">Übersicht der </w:t>
       </w:r>
@@ -4810,7 +5678,7 @@
           <w:lang w:eastAsia="de-DE"/>
         </w:rPr>
         <w:drawing>
-          <wp:inline distT="0" distB="0" distL="0" distR="0">
+          <wp:inline distT="0" distB="0" distL="0" distR="0" wp14:anchorId="10F5D930" wp14:editId="4299C3BB">
             <wp:extent cx="5486400" cy="3200400"/>
             <wp:effectExtent l="0" t="0" r="19050" b="0"/>
             <wp:docPr id="7" name="Diagramm 7"/>
@@ -4869,7 +5737,7 @@
       <w:pPr>
         <w:pStyle w:val="berschrift2"/>
       </w:pPr>
-      <w:bookmarkStart w:id="12" w:name="_Toc495435555"/>
+      <w:bookmarkStart w:id="12" w:name="_Toc74847783"/>
       <w:r>
         <w:t>Beschreibung der Ansichten</w:t>
       </w:r>
@@ -4895,7 +5763,7 @@
       <w:pPr>
         <w:pStyle w:val="berschrift2"/>
       </w:pPr>
-      <w:bookmarkStart w:id="13" w:name="_Toc495435556"/>
+      <w:bookmarkStart w:id="13" w:name="_Toc74847784"/>
       <w:r>
         <w:lastRenderedPageBreak/>
         <w:t>Backend</w:t>
@@ -4906,7 +5774,7 @@
       <w:pPr>
         <w:pStyle w:val="berschrift3"/>
       </w:pPr>
-      <w:bookmarkStart w:id="14" w:name="_Toc495435557"/>
+      <w:bookmarkStart w:id="14" w:name="_Toc74847785"/>
       <w:r>
         <w:t xml:space="preserve">Übersicht der Komponenten des </w:t>
       </w:r>
@@ -4927,7 +5795,7 @@
           <w:lang w:eastAsia="de-DE"/>
         </w:rPr>
         <w:drawing>
-          <wp:inline distT="0" distB="0" distL="0" distR="0">
+          <wp:inline distT="0" distB="0" distL="0" distR="0" wp14:anchorId="1FF6A6BE" wp14:editId="54677747">
             <wp:extent cx="5640705" cy="5040172"/>
             <wp:effectExtent l="0" t="0" r="0" b="8255"/>
             <wp:docPr id="19" name="Grafik 19" descr="C:\Users\cwschroeder\Downloads\TruDi packages (4).png"/>
@@ -5014,15 +5882,7 @@
         <w:fldChar w:fldCharType="end"/>
       </w:r>
       <w:r>
-        <w:t xml:space="preserve"> Pakete des </w:t>
-      </w:r>
-      <w:proofErr w:type="spellStart"/>
-      <w:r>
-        <w:t>TRuDI</w:t>
-      </w:r>
-      <w:proofErr w:type="spellEnd"/>
-      <w:r>
-        <w:t xml:space="preserve"> </w:t>
+        <w:t xml:space="preserve"> Pakete des TRuDI </w:t>
       </w:r>
       <w:proofErr w:type="spellStart"/>
       <w:r>
@@ -5213,7 +6073,7 @@
       <w:bookmarkStart w:id="15" w:name="_Ref493157556"/>
       <w:bookmarkStart w:id="16" w:name="_Ref493157576"/>
       <w:bookmarkStart w:id="17" w:name="_Ref493157593"/>
-      <w:bookmarkStart w:id="18" w:name="_Toc495435558"/>
+      <w:bookmarkStart w:id="18" w:name="_Toc74847786"/>
       <w:r>
         <w:t>Gerätekommunikation</w:t>
       </w:r>
@@ -5514,13 +6374,8 @@
             <w:pPr>
               <w:cnfStyle w:val="000000100000" w:firstRow="0" w:lastRow="0" w:firstColumn="0" w:lastColumn="0" w:oddVBand="0" w:evenVBand="0" w:oddHBand="1" w:evenHBand="0" w:firstRowFirstColumn="0" w:firstRowLastColumn="0" w:lastRowFirstColumn="0" w:lastRowLastColumn="0"/>
             </w:pPr>
-            <w:proofErr w:type="spellStart"/>
-            <w:r>
-              <w:t>devolo</w:t>
-            </w:r>
-            <w:proofErr w:type="spellEnd"/>
-            <w:r>
-              <w:t xml:space="preserve"> AG</w:t>
+            <w:r>
+              <w:t>devolo AG</w:t>
             </w:r>
           </w:p>
         </w:tc>
@@ -5648,13 +6503,8 @@
             <w:pPr>
               <w:cnfStyle w:val="000000000000" w:firstRow="0" w:lastRow="0" w:firstColumn="0" w:lastColumn="0" w:oddVBand="0" w:evenVBand="0" w:oddHBand="0" w:evenHBand="0" w:firstRowFirstColumn="0" w:firstRowLastColumn="0" w:lastRowFirstColumn="0" w:lastRowLastColumn="0"/>
             </w:pPr>
-            <w:proofErr w:type="spellStart"/>
-            <w:r>
-              <w:t>Discovergy</w:t>
-            </w:r>
-            <w:proofErr w:type="spellEnd"/>
-            <w:r>
-              <w:t xml:space="preserve"> GmbH</w:t>
+            <w:r>
+              <w:t>Discovergy GmbH</w:t>
             </w:r>
           </w:p>
         </w:tc>
@@ -5719,8 +6569,6 @@
       <w:r>
         <w:t>Liste der HAN Adapter</w:t>
       </w:r>
-      <w:bookmarkStart w:id="19" w:name="_GoBack"/>
-      <w:bookmarkEnd w:id="19"/>
     </w:p>
     <w:p>
       <w:r>
@@ -6412,15 +7260,7 @@
         <w:t>unter</w:t>
       </w:r>
       <w:r>
-        <w:t xml:space="preserve"> Verwendung von </w:t>
-      </w:r>
-      <w:proofErr w:type="spellStart"/>
-      <w:r>
-        <w:t>Brainpool</w:t>
-      </w:r>
-      <w:proofErr w:type="spellEnd"/>
-      <w:r>
-        <w:t>-Kurvenparametern zu bekommen</w:t>
+        <w:t xml:space="preserve"> Verwendung von Brainpool-Kurvenparametern zu bekommen</w:t>
       </w:r>
       <w:r>
         <w:rPr>
@@ -6437,7 +7277,7 @@
         <w:keepNext/>
       </w:pPr>
       <w:r>
-        <w:object w:dxaOrig="5261" w:dyaOrig="11901">
+        <w:object w:dxaOrig="5261" w:dyaOrig="11901" w14:anchorId="2057B7BC">
           <v:shapetype id="_x0000_t75" coordsize="21600,21600" o:spt="75" o:preferrelative="t" path="m@4@5l@4@11@9@11@9@5xe" filled="f" stroked="f">
             <v:stroke joinstyle="miter"/>
             <v:formulas>
@@ -6457,10 +7297,10 @@
             <v:path o:extrusionok="f" gradientshapeok="t" o:connecttype="rect"/>
             <o:lock v:ext="edit" aspectratio="t"/>
           </v:shapetype>
-          <v:shape id="_x0000_i1025" type="#_x0000_t75" style="width:199.5pt;height:450.5pt" o:ole="">
+          <v:shape id="_x0000_i1025" type="#_x0000_t75" style="width:199.15pt;height:450.45pt" o:ole="">
             <v:imagedata r:id="rId27" o:title=""/>
           </v:shape>
-          <o:OLEObject Type="Embed" ProgID="Visio.Drawing.15" ShapeID="_x0000_i1025" DrawAspect="Content" ObjectID="_1604314484" r:id="rId28"/>
+          <o:OLEObject Type="Embed" ProgID="Visio.Drawing.15" ShapeID="_x0000_i1025" DrawAspect="Content" ObjectID="_1685460690" r:id="rId28"/>
         </w:object>
       </w:r>
     </w:p>
@@ -6523,7 +7363,15 @@
         <w:t xml:space="preserve">Die Anmeldedaten werden dabei von der Software nicht dauerhaft gespeichert. Sie werden nur vom HAN Adapter </w:t>
       </w:r>
       <w:r>
-        <w:t>im Rahmen der Connect() Funktion</w:t>
+        <w:t xml:space="preserve">im Rahmen der </w:t>
+      </w:r>
+      <w:proofErr w:type="gramStart"/>
+      <w:r>
+        <w:t>Connect(</w:t>
+      </w:r>
+      <w:proofErr w:type="gramEnd"/>
+      <w:r>
+        <w:t>) Funktion</w:t>
       </w:r>
       <w:r>
         <w:t xml:space="preserve"> zum Zweck des TLS-</w:t>
@@ -6544,8 +7392,13 @@
         <w:t xml:space="preserve"> dem Adapter ein Client-Zertifikat</w:t>
       </w:r>
       <w:r>
-        <w:t xml:space="preserve"> mit zugehörigem privaten Schlüssel</w:t>
-      </w:r>
+        <w:t xml:space="preserve"> </w:t>
+      </w:r>
+      <w:proofErr w:type="gramStart"/>
+      <w:r>
+        <w:t>mit zugehörigem privaten Schlüssel</w:t>
+      </w:r>
+      <w:proofErr w:type="gramEnd"/>
       <w:r>
         <w:t xml:space="preserve"> zur Anmeldung am SMGW </w:t>
       </w:r>
@@ -6603,7 +7456,23 @@
         <w:t>Über den Adapter werden die der Auswahl entsprechenden originären Messwerte und Logdaten aus dem SMGW ausgelesen. Bei der Konvertierung der Rohdaten erfolgt eine Interpretation von Gerätekennungen nach DIN-43863-5. Sollten für einen Messwert mehrere Zeitstempel angeliefert werden, wird vom Adapter derjenige ausgewählt und für die weitere Verarbeitung verwendet, welcher der Ablesung des Werts durch das SMGW entspricht. Die Messwerte selbst werden in das durch AR2418-6 vorgegebene Format überführt und auf die Basis-SI Einheit skaliert.</w:t>
       </w:r>
       <w:r>
-        <w:t xml:space="preserve"> Messwertstati können vom Adapter entweder als FNN- oder PTB-Statuswort an die TRuDI Basis übergeben werden. Falls vom SMGW weder FNN- noch PTB Statuswerte bereitgestellt werden, erfolgt eine Konvertierung des herstellerspezifischen Statusworts auf das PTB Format innerhalb des Adapters. Ansonsten finden keine weiteren Anpassungen der ausgelesenen Inhalte statt. Der Adapter wird entsprechend Abbildung 5 nur dann aktiv, wenn ein Funktionsaufruf durch die TruDI-Basis angestoßen wird. Er greift dabei </w:t>
+        <w:t xml:space="preserve"> </w:t>
+      </w:r>
+      <w:proofErr w:type="spellStart"/>
+      <w:r>
+        <w:t>Messwertstati</w:t>
+      </w:r>
+      <w:proofErr w:type="spellEnd"/>
+      <w:r>
+        <w:t xml:space="preserve"> können vom Adapter entweder als FNN- oder PTB-Statuswort an die TRuDI Basis übergeben werden. Falls vom SMGW weder FNN- noch PTB Statuswerte bereitgestellt werden, erfolgt eine Konvertierung des herstellerspezifischen Statusworts auf das PTB Format innerhalb des Adapters. Ansonsten finden keine weiteren Anpassungen der ausgelesenen Inhalte statt. Der Adapter wird entsprechend Abbildung 5 nur dann aktiv, wenn ein Funktionsaufruf durch die </w:t>
+      </w:r>
+      <w:proofErr w:type="spellStart"/>
+      <w:r>
+        <w:t>TruDI</w:t>
+      </w:r>
+      <w:proofErr w:type="spellEnd"/>
+      <w:r>
+        <w:t xml:space="preserve">-Basis angestoßen wird. Er greift dabei </w:t>
       </w:r>
       <w:r>
         <w:t>ausschließlich</w:t>
@@ -6627,19 +7496,28 @@
       <w:pPr>
         <w:pStyle w:val="berschrift3"/>
       </w:pPr>
-      <w:bookmarkStart w:id="20" w:name="_Ref493163715"/>
-      <w:bookmarkStart w:id="21" w:name="_Toc495435559"/>
+      <w:bookmarkStart w:id="19" w:name="_Ref493163715"/>
+      <w:bookmarkStart w:id="20" w:name="_Toc74847787"/>
       <w:r>
         <w:t>Datenmodell</w:t>
       </w:r>
+      <w:bookmarkEnd w:id="19"/>
       <w:bookmarkEnd w:id="20"/>
-      <w:bookmarkEnd w:id="21"/>
     </w:p>
     <w:p>
       <w:r>
-        <w:t xml:space="preserve">Das zentrale Datenmodell des Backends bildet die Klasse </w:t>
+        <w:t xml:space="preserve">Das zentrale Datenmodell des </w:t>
+      </w:r>
+      <w:proofErr w:type="spellStart"/>
+      <w:r>
+        <w:t>Backends</w:t>
+      </w:r>
+      <w:proofErr w:type="spellEnd"/>
+      <w:r>
+        <w:t xml:space="preserve"> bildet die Klasse </w:t>
       </w:r>
       <w:hyperlink r:id="rId29" w:history="1">
+        <w:proofErr w:type="spellStart"/>
         <w:r>
           <w:rPr>
             <w:rStyle w:val="Hyperlink"/>
@@ -6647,11 +7525,13 @@
           </w:rPr>
           <w:t>ApplicationState</w:t>
         </w:r>
+        <w:proofErr w:type="spellEnd"/>
       </w:hyperlink>
       <w:r>
         <w:t xml:space="preserve">. Beim Start der ASP.NET Anwendung wird ein Objekt des </w:t>
       </w:r>
       <w:hyperlink r:id="rId30" w:history="1">
+        <w:proofErr w:type="spellStart"/>
         <w:r>
           <w:rPr>
             <w:rStyle w:val="Hyperlink"/>
@@ -6659,6 +7539,7 @@
           </w:rPr>
           <w:t>ApplicationState</w:t>
         </w:r>
+        <w:proofErr w:type="spellEnd"/>
       </w:hyperlink>
       <w:r>
         <w:rPr>
@@ -6667,9 +7548,26 @@
         <w:t xml:space="preserve"> </w:t>
       </w:r>
       <w:r>
-        <w:t xml:space="preserve">als Singleton angelegt und per Dependency Injection allen Controllern übergeben. Der </w:t>
+        <w:t xml:space="preserve">als Singleton angelegt und per </w:t>
+      </w:r>
+      <w:proofErr w:type="spellStart"/>
+      <w:r>
+        <w:t>Dependency</w:t>
+      </w:r>
+      <w:proofErr w:type="spellEnd"/>
+      <w:r>
+        <w:t xml:space="preserve"> </w:t>
+      </w:r>
+      <w:proofErr w:type="spellStart"/>
+      <w:r>
+        <w:t>Injection</w:t>
+      </w:r>
+      <w:proofErr w:type="spellEnd"/>
+      <w:r>
+        <w:t xml:space="preserve"> allen Controllern übergeben. Der </w:t>
       </w:r>
       <w:hyperlink r:id="rId31" w:history="1">
+        <w:proofErr w:type="spellStart"/>
         <w:r>
           <w:rPr>
             <w:rStyle w:val="Hyperlink"/>
@@ -6677,6 +7575,7 @@
           </w:rPr>
           <w:t>ApplicationState</w:t>
         </w:r>
+        <w:proofErr w:type="spellEnd"/>
       </w:hyperlink>
       <w:r>
         <w:rPr>
@@ -6769,15 +7668,34 @@
       <w:r>
         <w:t xml:space="preserve"> (</w:t>
       </w:r>
-      <w:hyperlink r:id="rId34" w:history="1">
-        <w:r>
-          <w:rPr>
-            <w:rStyle w:val="Hyperlink"/>
-            <w:i/>
-          </w:rPr>
-          <w:t>XmlModelParser</w:t>
-        </w:r>
-      </w:hyperlink>
+      <w:proofErr w:type="spellStart"/>
+      <w:r>
+        <w:fldChar w:fldCharType="begin"/>
+      </w:r>
+      <w:r>
+        <w:instrText xml:space="preserve"> HYPERLIN</w:instrText>
+      </w:r>
+      <w:r>
+        <w:instrText xml:space="preserve">K "https://bitbucket.org/dzgtrudi/trudi/src/master/src/TRuDI.HanAdapter.XmlValidation/XmlModelParser.cs" </w:instrText>
+      </w:r>
+      <w:r>
+        <w:fldChar w:fldCharType="separate"/>
+      </w:r>
+      <w:r>
+        <w:rPr>
+          <w:rStyle w:val="Hyperlink"/>
+          <w:i/>
+        </w:rPr>
+        <w:t>XmlModelParser</w:t>
+      </w:r>
+      <w:proofErr w:type="spellEnd"/>
+      <w:r>
+        <w:rPr>
+          <w:rStyle w:val="Hyperlink"/>
+          <w:i/>
+        </w:rPr>
+        <w:fldChar w:fldCharType="end"/>
+      </w:r>
       <w:r>
         <w:t>)</w:t>
       </w:r>
@@ -6785,29 +7703,75 @@
         <w:t xml:space="preserve">, sowie Funktionen zur </w:t>
       </w:r>
       <w:r>
-        <w:t>Validierung der Rückgabewerte der IHanAdapter-Funktionen(</w:t>
-      </w:r>
-      <w:hyperlink r:id="rId35" w:history="1">
-        <w:r>
-          <w:rPr>
-            <w:rStyle w:val="Hyperlink"/>
-            <w:i/>
-          </w:rPr>
-          <w:t>ContextValidation</w:t>
-        </w:r>
-      </w:hyperlink>
+        <w:t xml:space="preserve">Validierung der Rückgabewerte der </w:t>
+      </w:r>
+      <w:proofErr w:type="spellStart"/>
+      <w:r>
+        <w:t>IHanAdapter</w:t>
+      </w:r>
+      <w:proofErr w:type="spellEnd"/>
+      <w:r>
+        <w:t>-Funktionen(</w:t>
+      </w:r>
+      <w:proofErr w:type="spellStart"/>
+      <w:r>
+        <w:fldChar w:fldCharType="begin"/>
+      </w:r>
+      <w:r>
+        <w:instrText xml:space="preserve"> HYPERLINK "https://bitbucket.org/dzgtrudi/trudi/src/</w:instrText>
+      </w:r>
+      <w:r>
+        <w:instrText xml:space="preserve">master/src/TRuDI.HanAdapter.XmlValidation/ContextValidation.cs" </w:instrText>
+      </w:r>
+      <w:r>
+        <w:fldChar w:fldCharType="separate"/>
+      </w:r>
+      <w:r>
+        <w:rPr>
+          <w:rStyle w:val="Hyperlink"/>
+          <w:i/>
+        </w:rPr>
+        <w:t>ContextValidation</w:t>
+      </w:r>
+      <w:proofErr w:type="spellEnd"/>
+      <w:r>
+        <w:rPr>
+          <w:rStyle w:val="Hyperlink"/>
+          <w:i/>
+        </w:rPr>
+        <w:fldChar w:fldCharType="end"/>
+      </w:r>
       <w:r>
         <w:t>), sowie zur fachlichen Validierung des Datenmodells der XML-Daten (</w:t>
       </w:r>
-      <w:hyperlink r:id="rId36" w:history="1">
-        <w:r>
-          <w:rPr>
-            <w:rStyle w:val="Hyperlink"/>
-            <w:i/>
-          </w:rPr>
-          <w:t>ModelValidation</w:t>
-        </w:r>
-      </w:hyperlink>
+      <w:proofErr w:type="spellStart"/>
+      <w:r>
+        <w:fldChar w:fldCharType="begin"/>
+      </w:r>
+      <w:r>
+        <w:instrText xml:space="preserve"> HYPERLINK "https://bitbucket.org/dzgtrudi/trudi/src/master/src/TRuDI.HanAdapter.XmlValidation/ModelVali</w:instrText>
+      </w:r>
+      <w:r>
+        <w:instrText xml:space="preserve">dation.cs" </w:instrText>
+      </w:r>
+      <w:r>
+        <w:fldChar w:fldCharType="separate"/>
+      </w:r>
+      <w:r>
+        <w:rPr>
+          <w:rStyle w:val="Hyperlink"/>
+          <w:i/>
+        </w:rPr>
+        <w:t>ModelValidation</w:t>
+      </w:r>
+      <w:proofErr w:type="spellEnd"/>
+      <w:r>
+        <w:rPr>
+          <w:rStyle w:val="Hyperlink"/>
+          <w:i/>
+        </w:rPr>
+        <w:fldChar w:fldCharType="end"/>
+      </w:r>
       <w:r>
         <w:t>)</w:t>
       </w:r>
@@ -6911,12 +7875,14 @@
                 <w:b w:val="0"/>
               </w:rPr>
             </w:pPr>
+            <w:proofErr w:type="spellStart"/>
             <w:r>
               <w:rPr>
                 <w:b w:val="0"/>
               </w:rPr>
               <w:t>TafId</w:t>
             </w:r>
+            <w:proofErr w:type="spellEnd"/>
           </w:p>
         </w:tc>
         <w:tc>
@@ -6953,9 +7919,11 @@
             <w:pPr>
               <w:cnfStyle w:val="000000100000" w:firstRow="0" w:lastRow="0" w:firstColumn="0" w:lastColumn="0" w:oddVBand="0" w:evenVBand="0" w:oddHBand="1" w:evenHBand="0" w:firstRowFirstColumn="0" w:firstRowLastColumn="0" w:lastRowFirstColumn="0" w:lastRowLastColumn="0"/>
             </w:pPr>
+            <w:proofErr w:type="gramStart"/>
             <w:r>
               <w:t>muss</w:t>
             </w:r>
+            <w:proofErr w:type="gramEnd"/>
           </w:p>
         </w:tc>
       </w:tr>
@@ -6971,12 +7939,14 @@
                 <w:b w:val="0"/>
               </w:rPr>
             </w:pPr>
+            <w:proofErr w:type="spellStart"/>
             <w:r>
               <w:rPr>
                 <w:b w:val="0"/>
               </w:rPr>
               <w:t>TafName</w:t>
             </w:r>
+            <w:proofErr w:type="spellEnd"/>
           </w:p>
         </w:tc>
         <w:tc>
@@ -7000,9 +7970,11 @@
             <w:pPr>
               <w:cnfStyle w:val="000000000000" w:firstRow="0" w:lastRow="0" w:firstColumn="0" w:lastColumn="0" w:oddVBand="0" w:evenVBand="0" w:oddHBand="0" w:evenHBand="0" w:firstRowFirstColumn="0" w:firstRowLastColumn="0" w:lastRowFirstColumn="0" w:lastRowLastColumn="0"/>
             </w:pPr>
+            <w:proofErr w:type="spellStart"/>
             <w:r>
               <w:t>tariffName</w:t>
             </w:r>
+            <w:proofErr w:type="spellEnd"/>
           </w:p>
         </w:tc>
         <w:tc>
@@ -7013,9 +7985,11 @@
             <w:pPr>
               <w:cnfStyle w:val="000000000000" w:firstRow="0" w:lastRow="0" w:firstColumn="0" w:lastColumn="0" w:oddVBand="0" w:evenVBand="0" w:oddHBand="0" w:evenHBand="0" w:firstRowFirstColumn="0" w:firstRowLastColumn="0" w:lastRowFirstColumn="0" w:lastRowLastColumn="0"/>
             </w:pPr>
+            <w:proofErr w:type="gramStart"/>
             <w:r>
               <w:t>muss</w:t>
             </w:r>
+            <w:proofErr w:type="gramEnd"/>
           </w:p>
         </w:tc>
       </w:tr>
@@ -7120,9 +8094,11 @@
             <w:pPr>
               <w:cnfStyle w:val="000000000000" w:firstRow="0" w:lastRow="0" w:firstColumn="0" w:lastColumn="0" w:oddVBand="0" w:evenVBand="0" w:oddHBand="0" w:evenHBand="0" w:firstRowFirstColumn="0" w:firstRowLastColumn="0" w:lastRowFirstColumn="0" w:lastRowLastColumn="0"/>
             </w:pPr>
+            <w:proofErr w:type="spellStart"/>
             <w:r>
               <w:t>meterId</w:t>
             </w:r>
+            <w:proofErr w:type="spellEnd"/>
           </w:p>
         </w:tc>
         <w:tc>
@@ -7133,9 +8109,11 @@
             <w:pPr>
               <w:cnfStyle w:val="000000000000" w:firstRow="0" w:lastRow="0" w:firstColumn="0" w:lastColumn="0" w:oddVBand="0" w:evenVBand="0" w:oddHBand="0" w:evenHBand="0" w:firstRowFirstColumn="0" w:firstRowLastColumn="0" w:lastRowFirstColumn="0" w:lastRowLastColumn="0"/>
             </w:pPr>
+            <w:proofErr w:type="gramStart"/>
             <w:r>
               <w:t>muss</w:t>
             </w:r>
+            <w:proofErr w:type="gramEnd"/>
           </w:p>
         </w:tc>
       </w:tr>
@@ -7154,12 +8132,14 @@
                 <w:b w:val="0"/>
               </w:rPr>
             </w:pPr>
+            <w:proofErr w:type="spellStart"/>
             <w:r>
               <w:rPr>
                 <w:b w:val="0"/>
               </w:rPr>
               <w:t>MeteringPointId</w:t>
             </w:r>
+            <w:proofErr w:type="spellEnd"/>
           </w:p>
         </w:tc>
         <w:tc>
@@ -7183,9 +8163,11 @@
             <w:pPr>
               <w:cnfStyle w:val="000000100000" w:firstRow="0" w:lastRow="0" w:firstColumn="0" w:lastColumn="0" w:oddVBand="0" w:evenVBand="0" w:oddHBand="1" w:evenHBand="0" w:firstRowFirstColumn="0" w:firstRowLastColumn="0" w:lastRowFirstColumn="0" w:lastRowLastColumn="0"/>
             </w:pPr>
+            <w:proofErr w:type="spellStart"/>
             <w:r>
               <w:t>usagePointId</w:t>
             </w:r>
+            <w:proofErr w:type="spellEnd"/>
           </w:p>
         </w:tc>
         <w:tc>
@@ -7196,9 +8178,11 @@
             <w:pPr>
               <w:cnfStyle w:val="000000100000" w:firstRow="0" w:lastRow="0" w:firstColumn="0" w:lastColumn="0" w:oddVBand="0" w:evenVBand="0" w:oddHBand="1" w:evenHBand="0" w:firstRowFirstColumn="0" w:firstRowLastColumn="0" w:lastRowFirstColumn="0" w:lastRowLastColumn="0"/>
             </w:pPr>
+            <w:proofErr w:type="gramStart"/>
             <w:r>
               <w:t>muss</w:t>
             </w:r>
+            <w:proofErr w:type="gramEnd"/>
           </w:p>
         </w:tc>
       </w:tr>
@@ -7214,12 +8198,14 @@
                 <w:b w:val="0"/>
               </w:rPr>
             </w:pPr>
+            <w:proofErr w:type="spellStart"/>
             <w:r>
               <w:rPr>
                 <w:b w:val="0"/>
               </w:rPr>
               <w:t>SupplierId</w:t>
             </w:r>
+            <w:proofErr w:type="spellEnd"/>
           </w:p>
         </w:tc>
         <w:tc>
@@ -7243,9 +8229,11 @@
             <w:pPr>
               <w:cnfStyle w:val="000000000000" w:firstRow="0" w:lastRow="0" w:firstColumn="0" w:lastColumn="0" w:oddVBand="0" w:evenVBand="0" w:oddHBand="0" w:evenHBand="0" w:firstRowFirstColumn="0" w:firstRowLastColumn="0" w:lastRowFirstColumn="0" w:lastRowLastColumn="0"/>
             </w:pPr>
+            <w:proofErr w:type="spellStart"/>
             <w:r>
               <w:t>invoicingPartyId</w:t>
             </w:r>
+            <w:proofErr w:type="spellEnd"/>
           </w:p>
         </w:tc>
         <w:tc>
@@ -7256,9 +8244,11 @@
             <w:pPr>
               <w:cnfStyle w:val="000000000000" w:firstRow="0" w:lastRow="0" w:firstColumn="0" w:lastColumn="0" w:oddVBand="0" w:evenVBand="0" w:oddHBand="0" w:evenHBand="0" w:firstRowFirstColumn="0" w:firstRowLastColumn="0" w:lastRowFirstColumn="0" w:lastRowLastColumn="0"/>
             </w:pPr>
+            <w:proofErr w:type="gramStart"/>
             <w:r>
               <w:t>muss</w:t>
             </w:r>
+            <w:proofErr w:type="gramEnd"/>
           </w:p>
         </w:tc>
       </w:tr>
@@ -7277,12 +8267,14 @@
                 <w:b w:val="0"/>
               </w:rPr>
             </w:pPr>
+            <w:proofErr w:type="spellStart"/>
             <w:r>
               <w:rPr>
                 <w:b w:val="0"/>
               </w:rPr>
               <w:t>ConsumerId</w:t>
             </w:r>
+            <w:proofErr w:type="spellEnd"/>
           </w:p>
         </w:tc>
         <w:tc>
@@ -7293,8 +8285,29 @@
             <w:pPr>
               <w:cnfStyle w:val="000000100000" w:firstRow="0" w:lastRow="0" w:firstColumn="0" w:lastColumn="0" w:oddVBand="0" w:evenVBand="0" w:oddHBand="1" w:evenHBand="0" w:firstRowFirstColumn="0" w:firstRowLastColumn="0" w:lastRowFirstColumn="0" w:lastRowLastColumn="0"/>
             </w:pPr>
-            <w:r>
-              <w:t>ObjectID des Letztverbrauchers, dem die die Daten zugeordnet werden (Cosem Logical Device ohne .sm)</w:t>
+            <w:proofErr w:type="spellStart"/>
+            <w:r>
+              <w:t>ObjectID</w:t>
+            </w:r>
+            <w:proofErr w:type="spellEnd"/>
+            <w:r>
+              <w:t xml:space="preserve"> des Letztverbrauchers, dem die die Daten zugeordnet werden (</w:t>
+            </w:r>
+            <w:proofErr w:type="spellStart"/>
+            <w:r>
+              <w:t>Cosem</w:t>
+            </w:r>
+            <w:proofErr w:type="spellEnd"/>
+            <w:r>
+              <w:t xml:space="preserve"> Logical Device ohne .</w:t>
+            </w:r>
+            <w:proofErr w:type="spellStart"/>
+            <w:r>
+              <w:t>sm</w:t>
+            </w:r>
+            <w:proofErr w:type="spellEnd"/>
+            <w:r>
+              <w:t>)</w:t>
             </w:r>
           </w:p>
         </w:tc>
@@ -7306,9 +8319,11 @@
             <w:pPr>
               <w:cnfStyle w:val="000000100000" w:firstRow="0" w:lastRow="0" w:firstColumn="0" w:lastColumn="0" w:oddVBand="0" w:evenVBand="0" w:oddHBand="1" w:evenHBand="0" w:firstRowFirstColumn="0" w:firstRowLastColumn="0" w:lastRowFirstColumn="0" w:lastRowLastColumn="0"/>
             </w:pPr>
+            <w:proofErr w:type="spellStart"/>
             <w:r>
               <w:t>customerId</w:t>
             </w:r>
+            <w:proofErr w:type="spellEnd"/>
           </w:p>
         </w:tc>
         <w:tc>
@@ -7319,9 +8334,11 @@
             <w:pPr>
               <w:cnfStyle w:val="000000100000" w:firstRow="0" w:lastRow="0" w:firstColumn="0" w:lastColumn="0" w:oddVBand="0" w:evenVBand="0" w:oddHBand="1" w:evenHBand="0" w:firstRowFirstColumn="0" w:firstRowLastColumn="0" w:lastRowFirstColumn="0" w:lastRowLastColumn="0"/>
             </w:pPr>
+            <w:proofErr w:type="gramStart"/>
             <w:r>
               <w:t>muss</w:t>
             </w:r>
+            <w:proofErr w:type="gramEnd"/>
           </w:p>
         </w:tc>
       </w:tr>
@@ -7376,9 +8393,11 @@
             <w:pPr>
               <w:cnfStyle w:val="000000000000" w:firstRow="0" w:lastRow="0" w:firstColumn="0" w:lastColumn="0" w:oddVBand="0" w:evenVBand="0" w:oddHBand="0" w:evenHBand="0" w:firstRowFirstColumn="0" w:firstRowLastColumn="0" w:lastRowFirstColumn="0" w:lastRowLastColumn="0"/>
             </w:pPr>
+            <w:proofErr w:type="gramStart"/>
             <w:r>
               <w:t>muss</w:t>
             </w:r>
+            <w:proofErr w:type="gramEnd"/>
           </w:p>
         </w:tc>
       </w:tr>
@@ -7448,26 +8467,29 @@
       <w:pPr>
         <w:pStyle w:val="berschrift3"/>
       </w:pPr>
-      <w:bookmarkStart w:id="22" w:name="_Toc495435560"/>
+      <w:bookmarkStart w:id="21" w:name="_Toc74847788"/>
       <w:r>
         <w:t>Transparenzfunktion</w:t>
       </w:r>
-      <w:bookmarkEnd w:id="22"/>
+      <w:bookmarkEnd w:id="21"/>
     </w:p>
     <w:p>
       <w:r>
         <w:t xml:space="preserve">Analog zu </w:t>
       </w:r>
+      <w:proofErr w:type="spellStart"/>
       <w:r>
         <w:rPr>
           <w:i/>
         </w:rPr>
         <w:t>IHanAdapter</w:t>
       </w:r>
+      <w:proofErr w:type="spellEnd"/>
       <w:r>
         <w:t xml:space="preserve"> können TAF-Plugins eingebunden werden. Diese müssen das Interface </w:t>
       </w:r>
-      <w:hyperlink r:id="rId37" w:history="1">
+      <w:hyperlink r:id="rId34" w:history="1">
+        <w:proofErr w:type="spellStart"/>
         <w:r>
           <w:rPr>
             <w:rStyle w:val="Hyperlink"/>
@@ -7475,6 +8497,7 @@
           </w:rPr>
           <w:t>ITafAdapter</w:t>
         </w:r>
+        <w:proofErr w:type="spellEnd"/>
       </w:hyperlink>
       <w:r>
         <w:t xml:space="preserve"> implementieren.</w:t>
@@ -7482,27 +8505,62 @@
       <w:r>
         <w:t xml:space="preserve"> Ein TAF-Plugin berechnet anhand einer Tarifdefinition (</w:t>
       </w:r>
-      <w:hyperlink r:id="rId38" w:history="1">
-        <w:r>
-          <w:rPr>
-            <w:rStyle w:val="Hyperlink"/>
-            <w:i/>
-          </w:rPr>
-          <w:t>UsagePointLieferant</w:t>
-        </w:r>
-      </w:hyperlink>
+      <w:proofErr w:type="spellStart"/>
+      <w:r>
+        <w:fldChar w:fldCharType="begin"/>
+      </w:r>
+      <w:r>
+        <w:instrText xml:space="preserve"> HYPERLINK "https://bitbucket.org/dzgtrudi/trudi/src/master/src/TRuDI.Models/BasicData/UsagePointLieferant.cs" </w:instrText>
+      </w:r>
+      <w:r>
+        <w:fldChar w:fldCharType="separate"/>
+      </w:r>
+      <w:r>
+        <w:rPr>
+          <w:rStyle w:val="Hyperlink"/>
+          <w:i/>
+        </w:rPr>
+        <w:t>UsagePointLieferant</w:t>
+      </w:r>
+      <w:proofErr w:type="spellEnd"/>
+      <w:r>
+        <w:rPr>
+          <w:rStyle w:val="Hyperlink"/>
+          <w:i/>
+        </w:rPr>
+        <w:fldChar w:fldCharType="end"/>
+      </w:r>
       <w:r>
         <w:t>) und den Daten der aus dem SMGW abgelesenen originären Messwertliste (</w:t>
       </w:r>
-      <w:hyperlink r:id="rId39" w:history="1">
-        <w:r>
-          <w:rPr>
-            <w:rStyle w:val="Hyperlink"/>
-            <w:i/>
-          </w:rPr>
-          <w:t>UsagePointAdapterTRuDI</w:t>
-        </w:r>
-      </w:hyperlink>
+      <w:proofErr w:type="spellStart"/>
+      <w:r>
+        <w:fldChar w:fldCharType="begin"/>
+      </w:r>
+      <w:r>
+        <w:instrText xml:space="preserve"> HYPERLINK "https://bitbucket.org/d</w:instrText>
+      </w:r>
+      <w:r>
+        <w:instrText xml:space="preserve">zgtrudi/trudi/src/master/src/TRuDI.Models/BasicData/UsagePointAdapterTRuDI.cs" </w:instrText>
+      </w:r>
+      <w:r>
+        <w:fldChar w:fldCharType="separate"/>
+      </w:r>
+      <w:r>
+        <w:rPr>
+          <w:rStyle w:val="Hyperlink"/>
+          <w:i/>
+        </w:rPr>
+        <w:t>UsagePointAdapterTRuDI</w:t>
+      </w:r>
+      <w:proofErr w:type="spellEnd"/>
+      <w:r>
+        <w:rPr>
+          <w:rStyle w:val="Hyperlink"/>
+          <w:i/>
+        </w:rPr>
+        <w:fldChar w:fldCharType="end"/>
+      </w:r>
       <w:r>
         <w:t>) die abgeleiteten Tarifregister. In dieser Programmversion sind TAF-Plugins für folgende Tarifanwendungsfälle implementiert:</w:t>
       </w:r>
@@ -7529,8 +8587,13 @@
           </w:tcPr>
           <w:p>
             <w:r>
-              <w:t>TAF-Id</w:t>
-            </w:r>
+              <w:t>TAF-</w:t>
+            </w:r>
+            <w:proofErr w:type="spellStart"/>
+            <w:r>
+              <w:t>Id</w:t>
+            </w:r>
+            <w:proofErr w:type="spellEnd"/>
           </w:p>
         </w:tc>
         <w:tc>
@@ -7596,8 +8659,13 @@
             <w:pPr>
               <w:cnfStyle w:val="000000100000" w:firstRow="0" w:lastRow="0" w:firstColumn="0" w:lastColumn="0" w:oddVBand="0" w:evenVBand="0" w:oddHBand="1" w:evenHBand="0" w:firstRowFirstColumn="0" w:firstRowLastColumn="0" w:lastRowFirstColumn="0" w:lastRowLastColumn="0"/>
             </w:pPr>
-            <w:r>
-              <w:t>TRuDI.TafAdapter.Taf1</w:t>
+            <w:proofErr w:type="gramStart"/>
+            <w:r>
+              <w:t>TRuDI.TafAdapter.Taf</w:t>
+            </w:r>
+            <w:proofErr w:type="gramEnd"/>
+            <w:r>
+              <w:t>1</w:t>
             </w:r>
           </w:p>
         </w:tc>
@@ -7636,8 +8704,61 @@
               <w:keepNext/>
               <w:cnfStyle w:val="000000000000" w:firstRow="0" w:lastRow="0" w:firstColumn="0" w:lastColumn="0" w:oddVBand="0" w:evenVBand="0" w:oddHBand="0" w:evenHBand="0" w:firstRowFirstColumn="0" w:firstRowLastColumn="0" w:lastRowFirstColumn="0" w:lastRowLastColumn="0"/>
             </w:pPr>
-            <w:r>
-              <w:t>TRuDI.TafAdapter.Taf2</w:t>
+            <w:proofErr w:type="gramStart"/>
+            <w:r>
+              <w:t>TRuDI.TafAdapter.Taf</w:t>
+            </w:r>
+            <w:proofErr w:type="gramEnd"/>
+            <w:r>
+              <w:t>2</w:t>
+            </w:r>
+          </w:p>
+        </w:tc>
+      </w:tr>
+      <w:tr>
+        <w:trPr>
+          <w:cnfStyle w:val="000000100000" w:firstRow="0" w:lastRow="0" w:firstColumn="0" w:lastColumn="0" w:oddVBand="0" w:evenVBand="0" w:oddHBand="1" w:evenHBand="0" w:firstRowFirstColumn="0" w:firstRowLastColumn="0" w:lastRowFirstColumn="0" w:lastRowLastColumn="0"/>
+        </w:trPr>
+        <w:tc>
+          <w:tcPr>
+            <w:cnfStyle w:val="001000000000" w:firstRow="0" w:lastRow="0" w:firstColumn="1" w:lastColumn="0" w:oddVBand="0" w:evenVBand="0" w:oddHBand="0" w:evenHBand="0" w:firstRowFirstColumn="0" w:firstRowLastColumn="0" w:lastRowFirstColumn="0" w:lastRowLastColumn="0"/>
+            <w:tcW w:w="877" w:type="dxa"/>
+          </w:tcPr>
+          <w:p>
+            <w:r>
+              <w:t>TAF-8</w:t>
+            </w:r>
+          </w:p>
+        </w:tc>
+        <w:tc>
+          <w:tcPr>
+            <w:tcW w:w="3054" w:type="dxa"/>
+          </w:tcPr>
+          <w:p>
+            <w:pPr>
+              <w:cnfStyle w:val="000000100000" w:firstRow="0" w:lastRow="0" w:firstColumn="0" w:lastColumn="0" w:oddVBand="0" w:evenVBand="0" w:oddHBand="1" w:evenHBand="0" w:firstRowFirstColumn="0" w:firstRowLastColumn="0" w:lastRowFirstColumn="0" w:lastRowLastColumn="0"/>
+            </w:pPr>
+            <w:r>
+              <w:t>Erfassung von Extremwerten</w:t>
+            </w:r>
+          </w:p>
+        </w:tc>
+        <w:tc>
+          <w:tcPr>
+            <w:tcW w:w="4942" w:type="dxa"/>
+          </w:tcPr>
+          <w:p>
+            <w:pPr>
+              <w:keepNext/>
+              <w:cnfStyle w:val="000000100000" w:firstRow="0" w:lastRow="0" w:firstColumn="0" w:lastColumn="0" w:oddVBand="0" w:evenVBand="0" w:oddHBand="1" w:evenHBand="0" w:firstRowFirstColumn="0" w:firstRowLastColumn="0" w:lastRowFirstColumn="0" w:lastRowLastColumn="0"/>
+            </w:pPr>
+            <w:proofErr w:type="gramStart"/>
+            <w:r>
+              <w:t>TRuDI.TafAdapter.Taf</w:t>
+            </w:r>
+            <w:proofErr w:type="gramEnd"/>
+            <w:r>
+              <w:t>8</w:t>
             </w:r>
           </w:p>
         </w:tc>
@@ -7704,12 +8825,12 @@
       <w:pPr>
         <w:pStyle w:val="berschrift3"/>
       </w:pPr>
-      <w:bookmarkStart w:id="23" w:name="_Toc495435561"/>
+      <w:bookmarkStart w:id="22" w:name="_Toc74847789"/>
       <w:r>
         <w:lastRenderedPageBreak/>
         <w:t>Flussdiagramme für TAF-Plugin TAF-2</w:t>
       </w:r>
-      <w:bookmarkEnd w:id="23"/>
+      <w:bookmarkEnd w:id="22"/>
     </w:p>
     <w:p>
       <w:r>
@@ -7718,7 +8839,7 @@
           <w:lang w:eastAsia="de-DE"/>
         </w:rPr>
         <w:drawing>
-          <wp:inline distT="0" distB="0" distL="0" distR="0">
+          <wp:inline distT="0" distB="0" distL="0" distR="0" wp14:anchorId="60307213" wp14:editId="3D952762">
             <wp:extent cx="5051620" cy="7296785"/>
             <wp:effectExtent l="0" t="0" r="0" b="0"/>
             <wp:docPr id="17" name="Grafik 17" descr="C:\Users\cwschroeder\Dropbox\MyData\Documents\IVU Softwareentwicklung GmbH\Projekte\DZG.Bundesdisplay\doc\FD_Taf7UseCaseTaf2.png"/>
@@ -7735,7 +8856,7 @@
                     </pic:cNvPicPr>
                   </pic:nvPicPr>
                   <pic:blipFill>
-                    <a:blip r:embed="rId40">
+                    <a:blip r:embed="rId35">
                       <a:extLst>
                         <a:ext uri="{28A0092B-C50C-407E-A947-70E740481C1C}">
                           <a14:useLocalDpi xmlns:a14="http://schemas.microsoft.com/office/drawing/2010/main" val="0"/>
@@ -7775,7 +8896,7 @@
         </w:rPr>
         <w:lastRenderedPageBreak/>
         <w:drawing>
-          <wp:inline distT="0" distB="0" distL="0" distR="0">
+          <wp:inline distT="0" distB="0" distL="0" distR="0" wp14:anchorId="1E14A455" wp14:editId="18F12088">
             <wp:extent cx="5206951" cy="7521152"/>
             <wp:effectExtent l="0" t="0" r="0" b="3810"/>
             <wp:docPr id="15" name="Grafik 15" descr="C:\Users\cwschroeder\Dropbox\MyData\Documents\IVU Softwareentwicklung GmbH\Projekte\DZG.Bundesdisplay\doc\FD_GetDayData.png"/>
@@ -7792,7 +8913,7 @@
                     </pic:cNvPicPr>
                   </pic:nvPicPr>
                   <pic:blipFill>
-                    <a:blip r:embed="rId41">
+                    <a:blip r:embed="rId36">
                       <a:extLst>
                         <a:ext uri="{28A0092B-C50C-407E-A947-70E740481C1C}">
                           <a14:useLocalDpi xmlns:a14="http://schemas.microsoft.com/office/drawing/2010/main" val="0"/>
@@ -7832,7 +8953,7 @@
         </w:rPr>
         <w:lastRenderedPageBreak/>
         <w:drawing>
-          <wp:inline distT="0" distB="0" distL="0" distR="0">
+          <wp:inline distT="0" distB="0" distL="0" distR="0" wp14:anchorId="7579B81A" wp14:editId="5998AE36">
             <wp:extent cx="4970584" cy="7179733"/>
             <wp:effectExtent l="0" t="0" r="1905" b="2540"/>
             <wp:docPr id="18" name="Grafik 18" descr="C:\Users\cwschroeder\Dropbox\MyData\Documents\IVU Softwareentwicklung GmbH\Projekte\DZG.Bundesdisplay\doc\FD_FindLastValidTime.png"/>
@@ -7849,7 +8970,7 @@
                     </pic:cNvPicPr>
                   </pic:nvPicPr>
                   <pic:blipFill>
-                    <a:blip r:embed="rId42">
+                    <a:blip r:embed="rId37">
                       <a:extLst>
                         <a:ext uri="{28A0092B-C50C-407E-A947-70E740481C1C}">
                           <a14:useLocalDpi xmlns:a14="http://schemas.microsoft.com/office/drawing/2010/main" val="0"/>
@@ -7898,12 +9019,12 @@
       <w:pPr>
         <w:pStyle w:val="berschrift3"/>
       </w:pPr>
-      <w:bookmarkStart w:id="24" w:name="_Toc495435562"/>
+      <w:bookmarkStart w:id="23" w:name="_Toc74847790"/>
       <w:r>
         <w:lastRenderedPageBreak/>
         <w:t>Flussdiagramme für TAF-Plugin TAF-1</w:t>
       </w:r>
-      <w:bookmarkEnd w:id="24"/>
+      <w:bookmarkEnd w:id="23"/>
     </w:p>
     <w:p>
       <w:r>
@@ -7912,7 +9033,7 @@
           <w:lang w:eastAsia="de-DE"/>
         </w:rPr>
         <w:drawing>
-          <wp:inline distT="0" distB="0" distL="0" distR="0">
+          <wp:inline distT="0" distB="0" distL="0" distR="0" wp14:anchorId="516035B1" wp14:editId="72F8AC9A">
             <wp:extent cx="5640517" cy="7161919"/>
             <wp:effectExtent l="0" t="0" r="0" b="1270"/>
             <wp:docPr id="16" name="Grafik 16" descr="C:\Users\cwschroeder\Dropbox\MyData\Documents\IVU Softwareentwicklung GmbH\Projekte\DZG.Bundesdisplay\doc\Flussdiagramme\FD_Taf7UseCaseTaf1.png"/>
@@ -7929,7 +9050,7 @@
                     </pic:cNvPicPr>
                   </pic:nvPicPr>
                   <pic:blipFill rotWithShape="1">
-                    <a:blip r:embed="rId43">
+                    <a:blip r:embed="rId38">
                       <a:extLst>
                         <a:ext uri="{28A0092B-C50C-407E-A947-70E740481C1C}">
                           <a14:useLocalDpi xmlns:a14="http://schemas.microsoft.com/office/drawing/2010/main" val="0"/>
@@ -7966,11 +9087,128 @@
     </w:p>
     <w:p>
       <w:pPr>
+        <w:pStyle w:val="berschrift3"/>
+      </w:pPr>
+      <w:bookmarkStart w:id="24" w:name="_Toc74847791"/>
+      <w:r>
+        <w:lastRenderedPageBreak/>
+        <w:t xml:space="preserve">Leistungsmittelwertberechnung und </w:t>
+      </w:r>
+      <w:r>
+        <w:t>TAF-Plugin TAF-</w:t>
+      </w:r>
+      <w:r>
+        <w:t>8</w:t>
+      </w:r>
+      <w:bookmarkEnd w:id="24"/>
+    </w:p>
+    <w:p>
+      <w:r>
+        <w:t>TRuDI berechnet aus den Zählerständen der Originären Messwertliste automatisch Leistungsmittelwerte. Dazu wird die Energiemenge zwischen zwei aufeinanderfolgende Zählerständen ermittelt und mit einem der folgenden Faktoren multipliziert:</w:t>
+      </w:r>
+    </w:p>
+    <w:p>
+      <w:pPr>
+        <w:pStyle w:val="Listenabsatz"/>
+        <w:numPr>
+          <w:ilvl w:val="0"/>
+          <w:numId w:val="29"/>
+        </w:numPr>
+      </w:pPr>
+      <w:r>
+        <w:t>60 bei einer Messperiode von einer Minute</w:t>
+      </w:r>
+    </w:p>
+    <w:p>
+      <w:pPr>
+        <w:pStyle w:val="Listenabsatz"/>
+        <w:numPr>
+          <w:ilvl w:val="0"/>
+          <w:numId w:val="29"/>
+        </w:numPr>
+      </w:pPr>
+      <w:r>
+        <w:t xml:space="preserve">4 </w:t>
+      </w:r>
+      <w:r>
+        <w:t>bei einer Messperiode von 15 Minute</w:t>
+      </w:r>
+    </w:p>
+    <w:p>
+      <w:pPr>
+        <w:pStyle w:val="Listenabsatz"/>
+        <w:numPr>
+          <w:ilvl w:val="0"/>
+          <w:numId w:val="29"/>
+        </w:numPr>
+      </w:pPr>
+      <w:r>
+        <w:t>1 bei einer Messperiode von 60 Minute</w:t>
+      </w:r>
+    </w:p>
+    <w:p>
+      <w:r>
+        <w:t>Weitere abweichende Messperioden werden nicht unterstützt.</w:t>
+      </w:r>
+    </w:p>
+    <w:p>
+      <w:r>
+        <w:t>Unter folgenden Umständen kann kein Leistungsmittelwert berechnet werden:</w:t>
+      </w:r>
+    </w:p>
+    <w:p>
+      <w:pPr>
+        <w:pStyle w:val="Listenabsatz"/>
+        <w:numPr>
+          <w:ilvl w:val="0"/>
+          <w:numId w:val="30"/>
+        </w:numPr>
+      </w:pPr>
+      <w:r>
+        <w:t>kein vorhergehender Zählerstand</w:t>
+      </w:r>
+    </w:p>
+    <w:p>
+      <w:pPr>
+        <w:pStyle w:val="Listenabsatz"/>
+        <w:numPr>
+          <w:ilvl w:val="0"/>
+          <w:numId w:val="30"/>
+        </w:numPr>
+      </w:pPr>
+      <w:r>
+        <w:t>kein gültiger vorhergehender Zählerstand</w:t>
+      </w:r>
+    </w:p>
+    <w:p>
+      <w:pPr>
+        <w:pStyle w:val="Listenabsatz"/>
+        <w:numPr>
+          <w:ilvl w:val="0"/>
+          <w:numId w:val="30"/>
+        </w:numPr>
+      </w:pPr>
+      <w:r>
+        <w:t>kein gültiger Zählerstand</w:t>
+      </w:r>
+    </w:p>
+    <w:p>
+      <w:r>
+        <w:t xml:space="preserve">Das TAF-8-Plugin sortiert die </w:t>
+      </w:r>
+      <w:r>
+        <w:t xml:space="preserve">berechneten Leistungsmittelwerte </w:t>
+      </w:r>
+      <w:r>
+        <w:t>und bringt bis zu 5 Maximum-Werte und bis zu 5 Minimum-Werte, abhängig von der jeweiligen Tarifdefinition des Lieferanten, zur Anzeige.</w:t>
+      </w:r>
+    </w:p>
+    <w:p>
+      <w:pPr>
         <w:pStyle w:val="berschrift1"/>
       </w:pPr>
-      <w:bookmarkStart w:id="25" w:name="_Toc495435563"/>
-      <w:r>
-        <w:lastRenderedPageBreak/>
+      <w:bookmarkStart w:id="25" w:name="_Toc74847792"/>
+      <w:r>
         <w:t>Bezug zu Anforderungen nach PTB 50.8</w:t>
       </w:r>
       <w:bookmarkEnd w:id="25"/>
@@ -7981,7 +9219,7 @@
         <w:spacing w:line="240" w:lineRule="auto"/>
       </w:pPr>
       <w:bookmarkStart w:id="26" w:name="_Toc491810202"/>
-      <w:bookmarkStart w:id="27" w:name="_Toc495435564"/>
+      <w:bookmarkStart w:id="27" w:name="_Toc74847793"/>
       <w:r>
         <w:t>Anforderungen nach Kapitel 5.3 – Kundendisplay als Anzeige Applikation</w:t>
       </w:r>
@@ -8254,7 +9492,11 @@
               <w:t xml:space="preserve">sich </w:t>
             </w:r>
             <w:r>
-              <w:t xml:space="preserve">der Abfragezeitbereich und der ausgerollte Kalender der Tarifdefinition bis zum aktuellen Zeitpunkt </w:t>
+              <w:t xml:space="preserve">der Abfragezeitbereich und der ausgerollte Kalender der Tarifdefinition bis zum aktuellen </w:t>
+            </w:r>
+            <w:r>
+              <w:lastRenderedPageBreak/>
+              <w:t xml:space="preserve">Zeitpunkt </w:t>
             </w:r>
             <w:r>
               <w:t>erstrecken</w:t>
@@ -8355,8 +9597,13 @@
             <w:r>
               <w:br/>
             </w:r>
-            <w:r>
-              <w:t>Siehe Spiegelstrich „Aktuelle Zählerstände“</w:t>
+            <w:proofErr w:type="gramStart"/>
+            <w:r>
+              <w:t>Siehe</w:t>
+            </w:r>
+            <w:proofErr w:type="gramEnd"/>
+            <w:r>
+              <w:t xml:space="preserve"> Spiegelstrich „Aktuelle Zählerstände“</w:t>
             </w:r>
             <w:r>
               <w:t xml:space="preserve"> </w:t>
@@ -8422,7 +9669,6 @@
               <w:cnfStyle w:val="000000000000" w:firstRow="0" w:lastRow="0" w:firstColumn="0" w:lastColumn="0" w:oddVBand="0" w:evenVBand="0" w:oddHBand="0" w:evenHBand="0" w:firstRowFirstColumn="0" w:firstRowLastColumn="0" w:lastRowFirstColumn="0" w:lastRowLastColumn="0"/>
             </w:pPr>
             <w:r>
-              <w:lastRenderedPageBreak/>
               <w:t>Zu PTB 50.8, 4.1.3.2 (eichrechtlich relevant)</w:t>
             </w:r>
           </w:p>
@@ -8449,7 +9695,15 @@
               <w:br/>
             </w:r>
             <w:r>
-              <w:t xml:space="preserve">Für die über die Anzeigefunktion dargestellten Werte ist keine weitere Berechnung vom Bediener vorzunehmen um die in Rechnung gestellten abgeleiteten Registerstände überprüfen zu können. </w:t>
+              <w:t xml:space="preserve">Für die über die Anzeigefunktion dargestellten Werte ist keine weitere Berechnung vom Bediener </w:t>
+            </w:r>
+            <w:proofErr w:type="gramStart"/>
+            <w:r>
+              <w:t>vorzunehmen</w:t>
+            </w:r>
+            <w:proofErr w:type="gramEnd"/>
+            <w:r>
+              <w:t xml:space="preserve"> um die in Rechnung gestellten abgeleiteten Registerstände überprüfen zu können. </w:t>
             </w:r>
             <w:r>
               <w:br/>
@@ -8491,15 +9745,25 @@
               <w:t xml:space="preserve"> (siehe PTB 50.8, Tabelle 4-2)</w:t>
             </w:r>
             <w:r>
-              <w:t xml:space="preserve">. Statuswerte nach FNN werden in die PTB-Darstellung konvertiert (siehe Klasse </w:t>
-            </w:r>
-            <w:hyperlink r:id="rId44" w:history="1">
+              <w:t xml:space="preserve">. Statuswerte nach FNN werden in die PTB-Darstellung konvertiert (siehe </w:t>
+            </w:r>
+            <w:proofErr w:type="gramStart"/>
+            <w:r>
+              <w:t>Klasse</w:t>
+            </w:r>
+            <w:proofErr w:type="gramEnd"/>
+            <w:r>
+              <w:t xml:space="preserve"> </w:t>
+            </w:r>
+            <w:hyperlink r:id="rId39" w:history="1">
+              <w:proofErr w:type="spellStart"/>
               <w:r>
                 <w:rPr>
                   <w:rStyle w:val="Hyperlink"/>
                 </w:rPr>
                 <w:t>StatusFnn</w:t>
               </w:r>
+              <w:proofErr w:type="spellEnd"/>
             </w:hyperlink>
             <w:r>
               <w:t>). Fehlerhafte Werte werden mit einem Warnsymbol und einer textuellen Darstellung des Fehlers gekennzeichnet.</w:t>
@@ -8528,7 +9792,11 @@
               <w:br/>
             </w:r>
             <w:r>
-              <w:t xml:space="preserve">Die Kennung des Letztverbrauchers wird bei in der Ansicht „Tarifdaten“ als </w:t>
+              <w:t xml:space="preserve">Die Kennung des Letztverbrauchers wird bei in </w:t>
+            </w:r>
+            <w:r>
+              <w:lastRenderedPageBreak/>
+              <w:t xml:space="preserve">der Ansicht „Tarifdaten“ als </w:t>
             </w:r>
             <w:r>
               <w:rPr>
@@ -8563,7 +9831,15 @@
               <w:br/>
             </w:r>
             <w:r>
-              <w:t xml:space="preserve">Die Kennung des Lieferanten wird in der Ansicht  „Verträge“(Anzeigefunktion) bzw. „Tarifdaten“ (Transparenzfunktion) als </w:t>
+              <w:t xml:space="preserve">Die Kennung des Lieferanten wird in der </w:t>
+            </w:r>
+            <w:proofErr w:type="gramStart"/>
+            <w:r>
+              <w:t>Ansicht  „</w:t>
+            </w:r>
+            <w:proofErr w:type="gramEnd"/>
+            <w:r>
+              <w:t xml:space="preserve">Verträge“(Anzeigefunktion) bzw. „Tarifdaten“ (Transparenzfunktion) als </w:t>
             </w:r>
             <w:r>
               <w:rPr>
@@ -8659,7 +9935,6 @@
               <w:rPr>
                 <w:b/>
               </w:rPr>
-              <w:lastRenderedPageBreak/>
               <w:t>Zählerkennzeichnung (alle TAF)</w:t>
             </w:r>
             <w:r>
@@ -8803,6 +10078,7 @@
               <w:rPr>
                 <w:b/>
               </w:rPr>
+              <w:lastRenderedPageBreak/>
               <w:t>Tarifumschaltzeitpunkte (TAF 2)</w:t>
             </w:r>
             <w:r>
@@ -8821,11 +10097,27 @@
             <w:r>
               <w:t xml:space="preserve">vom HAN-Adapter bei der von der Funktion </w:t>
             </w:r>
+            <w:proofErr w:type="spellStart"/>
+            <w:proofErr w:type="gramStart"/>
             <w:r>
               <w:rPr>
                 <w:i/>
               </w:rPr>
-              <w:t>LoadData()</w:t>
+              <w:t>LoadData</w:t>
+            </w:r>
+            <w:proofErr w:type="spellEnd"/>
+            <w:r>
+              <w:rPr>
+                <w:i/>
+              </w:rPr>
+              <w:t>(</w:t>
+            </w:r>
+            <w:proofErr w:type="gramEnd"/>
+            <w:r>
+              <w:rPr>
+                <w:i/>
+              </w:rPr>
+              <w:t>)</w:t>
             </w:r>
             <w:r>
               <w:t xml:space="preserve"> zurückgelieferten XML Struktur, das </w:t>
@@ -8833,12 +10125,14 @@
             <w:r>
               <w:t xml:space="preserve">Element </w:t>
             </w:r>
+            <w:proofErr w:type="spellStart"/>
             <w:r>
               <w:rPr>
                 <w:i/>
               </w:rPr>
               <w:t>tariffName</w:t>
             </w:r>
+            <w:proofErr w:type="spellEnd"/>
             <w:r>
               <w:t xml:space="preserve"> </w:t>
             </w:r>
@@ -8906,11 +10200,7 @@
               <w:br/>
             </w:r>
             <w:r>
-              <w:t xml:space="preserve">Die Abrechnungsregister werden in der Ansicht </w:t>
-            </w:r>
-            <w:r>
-              <w:lastRenderedPageBreak/>
-              <w:t>„Abrechnungsdaten“ im Bereich des Zählpunkts tabellarisch angezeigt.</w:t>
+              <w:t>Die Abrechnungsregister werden in der Ansicht „Abrechnungsdaten“ im Bereich des Zählpunkts tabellarisch angezeigt.</w:t>
             </w:r>
             <w:r>
               <w:br/>
@@ -8997,7 +10287,11 @@
               <w:br/>
             </w:r>
             <w:r>
-              <w:t>Zu den in der Ansicht „Abrechnungsdaten“ angezeigten originären Messwertlisten wird je Messwert dessen Status nach PTB-Definition angezeigt.</w:t>
+              <w:t xml:space="preserve">Zu den in der Ansicht „Abrechnungsdaten“ angezeigten originären Messwertlisten wird je </w:t>
+            </w:r>
+            <w:r>
+              <w:lastRenderedPageBreak/>
+              <w:t>Messwert dessen Status nach PTB-Definition angezeigt.</w:t>
             </w:r>
           </w:p>
         </w:tc>
@@ -9198,11 +10492,15 @@
               <w:cnfStyle w:val="000000000000" w:firstRow="0" w:lastRow="0" w:firstColumn="0" w:lastColumn="0" w:oddVBand="0" w:evenVBand="0" w:oddHBand="0" w:evenHBand="0" w:firstRowFirstColumn="0" w:firstRowLastColumn="0" w:lastRowFirstColumn="0" w:lastRowLastColumn="0"/>
             </w:pPr>
             <w:r>
-              <w:t xml:space="preserve">Die Navigation und Benutzerführung ist durch eine Location-Breadcrumb-Navigationsleiste mit Elementen für jede Ansicht übersichtlich </w:t>
-            </w:r>
-            <w:r>
-              <w:lastRenderedPageBreak/>
-              <w:t>umgesetzt. Die aktuelle Hauptansicht wird dabei in der Leiste farblich hervorgehoben</w:t>
+              <w:t>Die Navigation und Benutzerführung ist durch eine Location-</w:t>
+            </w:r>
+            <w:proofErr w:type="spellStart"/>
+            <w:r>
+              <w:t>Breadcrumb</w:t>
+            </w:r>
+            <w:proofErr w:type="spellEnd"/>
+            <w:r>
+              <w:t>-Navigationsleiste mit Elementen für jede Ansicht übersichtlich umgesetzt. Die aktuelle Hauptansicht wird dabei in der Leiste farblich hervorgehoben</w:t>
             </w:r>
             <w:r>
               <w:t>.</w:t>
@@ -9224,15 +10522,31 @@
               <w:rPr>
                 <w:b/>
               </w:rPr>
-              <w:t>Lücken und Messwert-Stati</w:t>
-            </w:r>
+              <w:t>Lücken und Messwert-</w:t>
+            </w:r>
+            <w:proofErr w:type="spellStart"/>
+            <w:r>
+              <w:rPr>
+                <w:b/>
+              </w:rPr>
+              <w:t>Stati</w:t>
+            </w:r>
+            <w:proofErr w:type="spellEnd"/>
           </w:p>
           <w:p>
             <w:pPr>
               <w:cnfStyle w:val="000000000000" w:firstRow="0" w:lastRow="0" w:firstColumn="0" w:lastColumn="0" w:oddVBand="0" w:evenVBand="0" w:oddHBand="0" w:evenHBand="0" w:firstRowFirstColumn="0" w:firstRowLastColumn="0" w:lastRowFirstColumn="0" w:lastRowLastColumn="0"/>
             </w:pPr>
             <w:r>
-              <w:t>Schnelles Auffinden von Lücken und Messwerten mit besonderen Stati ist über die Schaltfläche „Status-Übersicht anzeigen“ der jeweiligen Originären Messwertliste</w:t>
+              <w:t xml:space="preserve">Schnelles Auffinden von Lücken und Messwerten mit besonderen </w:t>
+            </w:r>
+            <w:proofErr w:type="spellStart"/>
+            <w:r>
+              <w:t>Stati</w:t>
+            </w:r>
+            <w:proofErr w:type="spellEnd"/>
+            <w:r>
+              <w:t xml:space="preserve"> ist über die Schaltfläche „Status-Übersicht anzeigen“ der jeweiligen Originären Messwertliste</w:t>
             </w:r>
             <w:r>
               <w:t xml:space="preserve"> möglich.</w:t>
@@ -9251,7 +10565,6 @@
           </w:tcPr>
           <w:p>
             <w:r>
-              <w:lastRenderedPageBreak/>
               <w:t>AN1.11</w:t>
             </w:r>
           </w:p>
@@ -9392,13 +10705,25 @@
               <w:fldChar w:fldCharType="end"/>
             </w:r>
             <w:r>
-              <w:t xml:space="preserve"> und des Umstands, dass stets nur ein HAN-Adapter aktiviert wird sichergestellt, dass nur Verbindungen zum zugehörigen Gerät aufgebaut werden. </w:t>
+              <w:t xml:space="preserve"> und des Umstands, dass stets nur ein HAN-Adapter </w:t>
+            </w:r>
+            <w:proofErr w:type="gramStart"/>
+            <w:r>
+              <w:t>aktiviert</w:t>
+            </w:r>
+            <w:proofErr w:type="gramEnd"/>
+            <w:r>
+              <w:t xml:space="preserve"> wird sichergestellt, dass nur Verbindungen zum zugehörigen Gerät aufgebaut werden. </w:t>
             </w:r>
             <w:r>
               <w:t>Weiterhin werden d</w:t>
             </w:r>
             <w:r>
-              <w:t xml:space="preserve">ie Inhalte des während des TLS Verbindungsaufbaus aus dem SMGW ausgelesenen Zertifikats, in der Ansicht „Details zum Smart Meter Gateway“ angezeigt. </w:t>
+              <w:t xml:space="preserve">ie Inhalte des während des TLS Verbindungsaufbaus aus dem </w:t>
+            </w:r>
+            <w:r>
+              <w:lastRenderedPageBreak/>
+              <w:t xml:space="preserve">SMGW ausgelesenen Zertifikats, in der Ansicht „Details zum Smart Meter Gateway“ angezeigt. </w:t>
             </w:r>
           </w:p>
         </w:tc>
@@ -9411,6 +10736,7 @@
           </w:tcPr>
           <w:p>
             <w:r>
+              <w:lastRenderedPageBreak/>
               <w:t>AN7.2</w:t>
             </w:r>
           </w:p>
@@ -9542,9 +10868,8 @@
         <w:spacing w:line="240" w:lineRule="auto"/>
       </w:pPr>
       <w:bookmarkStart w:id="28" w:name="_Toc491810203"/>
-      <w:bookmarkStart w:id="29" w:name="_Toc495435565"/>
-      <w:r>
-        <w:lastRenderedPageBreak/>
+      <w:bookmarkStart w:id="29" w:name="_Toc74847794"/>
+      <w:r>
         <w:t>Anforderungen nach Kapitel 7 – Transparenzsoftware</w:t>
       </w:r>
       <w:bookmarkEnd w:id="28"/>
@@ -9794,7 +11119,11 @@
               <w:t xml:space="preserve"> </w:t>
             </w:r>
             <w:r>
-              <w:t>verbreiteten Bootstrap-Framework. Dadurch ist sichergestellt, dass die Bedienelemente auf Linux und Windows Betriebssystemen gleichermaßen vertraut wirken.</w:t>
+              <w:t xml:space="preserve">verbreiteten Bootstrap-Framework. Dadurch ist sichergestellt, dass die Bedienelemente auf Linux und Windows </w:t>
+            </w:r>
+            <w:r>
+              <w:lastRenderedPageBreak/>
+              <w:t>Betriebssystemen gleichermaßen vertraut wirken.</w:t>
             </w:r>
           </w:p>
         </w:tc>
@@ -9810,6 +11139,7 @@
           </w:tcPr>
           <w:p>
             <w:r>
+              <w:lastRenderedPageBreak/>
               <w:t>TS2</w:t>
             </w:r>
           </w:p>
@@ -9932,7 +11262,15 @@
               <w:cnfStyle w:val="000000100000" w:firstRow="0" w:lastRow="0" w:firstColumn="0" w:lastColumn="0" w:oddVBand="0" w:evenVBand="0" w:oddHBand="1" w:evenHBand="0" w:firstRowFirstColumn="0" w:firstRowLastColumn="0" w:lastRowFirstColumn="0" w:lastRowLastColumn="0"/>
             </w:pPr>
             <w:r>
-              <w:t>Durch den vom HAN-Adapter durchgeführten TLS-Verbindungsaufbau, sowie der  TLS-gesicherten Kommunikation zwischen Back- und Frontend ist sichergestellt, dass keine Manipulation der Kommunikation zwischen den beteiligten Komponenten erfolgt ist.</w:t>
+              <w:t xml:space="preserve">Durch den vom HAN-Adapter durchgeführten TLS-Verbindungsaufbau, sowie </w:t>
+            </w:r>
+            <w:proofErr w:type="gramStart"/>
+            <w:r>
+              <w:t>der  TLS</w:t>
+            </w:r>
+            <w:proofErr w:type="gramEnd"/>
+            <w:r>
+              <w:t>-gesicherten Kommunikation zwischen Back- und Frontend ist sichergestellt, dass keine Manipulation der Kommunikation zwischen den beteiligten Komponenten erfolgt ist.</w:t>
             </w:r>
           </w:p>
         </w:tc>
@@ -10083,7 +11421,6 @@
           </w:tcPr>
           <w:p>
             <w:r>
-              <w:lastRenderedPageBreak/>
               <w:t>TS8.1</w:t>
             </w:r>
           </w:p>
@@ -10167,7 +11504,15 @@
               <w:cnfStyle w:val="000000000000" w:firstRow="0" w:lastRow="0" w:firstColumn="0" w:lastColumn="0" w:oddVBand="0" w:evenVBand="0" w:oddHBand="0" w:evenHBand="0" w:firstRowFirstColumn="0" w:firstRowLastColumn="0" w:lastRowFirstColumn="0" w:lastRowLastColumn="0"/>
             </w:pPr>
             <w:r>
-              <w:t>Nach Freigabe der Software wird eine Linux-Live-CD für das Betriebssystem Heise Meterix o.ä. erstellt.</w:t>
+              <w:t xml:space="preserve">Nach Freigabe der Software wird eine Linux-Live-CD für das Betriebssystem Heise </w:t>
+            </w:r>
+            <w:proofErr w:type="spellStart"/>
+            <w:r>
+              <w:t>Meterix</w:t>
+            </w:r>
+            <w:proofErr w:type="spellEnd"/>
+            <w:r>
+              <w:t xml:space="preserve"> o.ä. erstellt.</w:t>
             </w:r>
           </w:p>
         </w:tc>
@@ -10209,7 +11554,15 @@
               <w:cnfStyle w:val="000000100000" w:firstRow="0" w:lastRow="0" w:firstColumn="0" w:lastColumn="0" w:oddVBand="0" w:evenVBand="0" w:oddHBand="1" w:evenHBand="0" w:firstRowFirstColumn="0" w:firstRowLastColumn="0" w:lastRowFirstColumn="0" w:lastRowLastColumn="0"/>
             </w:pPr>
             <w:r>
-              <w:t>Die in der Software im Rahmen der Transparenzfunktion hinterlegten Regelwerke für TAF-1 und TAF-2 entstammen keiner externen Quelle sondern sind integraler Bestandteil der Applikation. Über den Integritätscheck der Anwendung sind deren Integrität und Authentizität sichergestellt.</w:t>
+              <w:t xml:space="preserve">Die in der Software im Rahmen der Transparenzfunktion hinterlegten Regelwerke für TAF-1 und TAF-2 entstammen keiner externen </w:t>
+            </w:r>
+            <w:proofErr w:type="gramStart"/>
+            <w:r>
+              <w:t>Quelle</w:t>
+            </w:r>
+            <w:proofErr w:type="gramEnd"/>
+            <w:r>
+              <w:t xml:space="preserve"> sondern sind integraler Bestandteil der Applikation. Über den Integritätscheck der Anwendung sind deren Integrität und Authentizität sichergestellt.</w:t>
             </w:r>
           </w:p>
         </w:tc>
@@ -10304,6 +11657,7 @@
           </w:tcPr>
           <w:p>
             <w:r>
+              <w:lastRenderedPageBreak/>
               <w:t>TS8.5</w:t>
             </w:r>
           </w:p>
@@ -10330,7 +11684,15 @@
               <w:cnfStyle w:val="000000100000" w:firstRow="0" w:lastRow="0" w:firstColumn="0" w:lastColumn="0" w:oddVBand="0" w:evenVBand="0" w:oddHBand="1" w:evenHBand="0" w:firstRowFirstColumn="0" w:firstRowLastColumn="0" w:lastRowFirstColumn="0" w:lastRowLastColumn="0"/>
             </w:pPr>
             <w:r>
-              <w:t xml:space="preserve">Die Software zeigt in der Ansicht „Abrechnungsdaten„ die ausgelesenen </w:t>
+              <w:t>Die Software zeigt in der Ansicht „</w:t>
+            </w:r>
+            <w:proofErr w:type="gramStart"/>
+            <w:r>
+              <w:t>Abrechnungsdaten„ die</w:t>
+            </w:r>
+            <w:proofErr w:type="gramEnd"/>
+            <w:r>
+              <w:t xml:space="preserve"> ausgelesenen </w:t>
             </w:r>
             <w:r>
               <w:t>originären Messwertliste</w:t>
@@ -10409,7 +11771,7 @@
         <w:spacing w:line="240" w:lineRule="auto"/>
       </w:pPr>
       <w:bookmarkStart w:id="30" w:name="_Toc491810204"/>
-      <w:bookmarkStart w:id="31" w:name="_Toc495435566"/>
+      <w:bookmarkStart w:id="31" w:name="_Toc74847795"/>
       <w:r>
         <w:t>Sonstige Anforderungen</w:t>
       </w:r>
@@ -10594,7 +11956,6 @@
               <w:rPr>
                 <w:b/>
               </w:rPr>
-              <w:lastRenderedPageBreak/>
               <w:t>Zählerstand und OBIS</w:t>
             </w:r>
             <w:r>
@@ -10738,7 +12099,14 @@
             </w:r>
             <w:r>
               <w:br/>
-              <w:t xml:space="preserve">Gelöst durch Verweis </w:t>
+            </w:r>
+            <w:proofErr w:type="gramStart"/>
+            <w:r>
+              <w:t>Gelöst</w:t>
+            </w:r>
+            <w:proofErr w:type="gramEnd"/>
+            <w:r>
+              <w:t xml:space="preserve"> durch Verweis </w:t>
             </w:r>
             <w:r>
               <w:t>per</w:t>
@@ -10820,6 +12188,7 @@
               <w:rPr>
                 <w:b/>
               </w:rPr>
+              <w:lastRenderedPageBreak/>
               <w:t>Datum und Tagesendstände (TAF 6)</w:t>
             </w:r>
             <w:r>
@@ -10978,8 +12347,8 @@
     <w:p/>
     <w:p/>
     <w:sectPr>
-      <w:headerReference w:type="default" r:id="rId45"/>
-      <w:footerReference w:type="default" r:id="rId46"/>
+      <w:headerReference w:type="default" r:id="rId40"/>
+      <w:footerReference w:type="default" r:id="rId41"/>
       <w:pgSz w:w="11907" w:h="16839" w:code="9"/>
       <w:pgMar w:top="2678" w:right="1512" w:bottom="1913" w:left="1512" w:header="918" w:footer="709" w:gutter="0"/>
       <w:pgNumType w:start="1"/>
@@ -10991,7 +12360,7 @@
 </file>
 
 <file path=word/endnotes.xml><?xml version="1.0" encoding="utf-8"?>
-<w:endnotes xmlns:wpc="http://schemas.microsoft.com/office/word/2010/wordprocessingCanvas" xmlns:cx="http://schemas.microsoft.com/office/drawing/2014/chartex" xmlns:cx1="http://schemas.microsoft.com/office/drawing/2015/9/8/chartex" xmlns:cx2="http://schemas.microsoft.com/office/drawing/2015/10/21/chartex" xmlns:cx3="http://schemas.microsoft.com/office/drawing/2016/5/9/chartex" xmlns:cx4="http://schemas.microsoft.com/office/drawing/2016/5/10/chartex" xmlns:cx5="http://schemas.microsoft.com/office/drawing/2016/5/11/chartex" xmlns:cx6="http://schemas.microsoft.com/office/drawing/2016/5/12/chartex" xmlns:cx7="http://schemas.microsoft.com/office/drawing/2016/5/13/chartex" xmlns:cx8="http://schemas.microsoft.com/office/drawing/2016/5/14/chartex" xmlns:mc="http://schemas.openxmlformats.org/markup-compatibility/2006" xmlns:aink="http://schemas.microsoft.com/office/drawing/2016/ink" xmlns:am3d="http://schemas.microsoft.com/office/drawing/2017/model3d" xmlns:o="urn:schemas-microsoft-com:office:office" xmlns:r="http://schemas.openxmlformats.org/officeDocument/2006/relationships" xmlns:m="http://schemas.openxmlformats.org/officeDocument/2006/math" xmlns:v="urn:schemas-microsoft-com:vml" xmlns:wp14="http://schemas.microsoft.com/office/word/2010/wordprocessingDrawing" xmlns:wp="http://schemas.openxmlformats.org/drawingml/2006/wordprocessingDrawing" xmlns:w10="urn:schemas-microsoft-com:office:word" xmlns:w="http://schemas.openxmlformats.org/wordprocessingml/2006/main" xmlns:w14="http://schemas.microsoft.com/office/word/2010/wordml" xmlns:w15="http://schemas.microsoft.com/office/word/2012/wordml" xmlns:w16cid="http://schemas.microsoft.com/office/word/2016/wordml/cid" xmlns:w16se="http://schemas.microsoft.com/office/word/2015/wordml/symex" xmlns:wpg="http://schemas.microsoft.com/office/word/2010/wordprocessingGroup" xmlns:wpi="http://schemas.microsoft.com/office/word/2010/wordprocessingInk" xmlns:wne="http://schemas.microsoft.com/office/word/2006/wordml" xmlns:wps="http://schemas.microsoft.com/office/word/2010/wordprocessingShape" mc:Ignorable="w14 w15 w16se w16cid wp14">
+<w:endnotes xmlns:wpc="http://schemas.microsoft.com/office/word/2010/wordprocessingCanvas" xmlns:cx="http://schemas.microsoft.com/office/drawing/2014/chartex" xmlns:cx1="http://schemas.microsoft.com/office/drawing/2015/9/8/chartex" xmlns:cx2="http://schemas.microsoft.com/office/drawing/2015/10/21/chartex" xmlns:cx3="http://schemas.microsoft.com/office/drawing/2016/5/9/chartex" xmlns:cx4="http://schemas.microsoft.com/office/drawing/2016/5/10/chartex" xmlns:cx5="http://schemas.microsoft.com/office/drawing/2016/5/11/chartex" xmlns:cx6="http://schemas.microsoft.com/office/drawing/2016/5/12/chartex" xmlns:cx7="http://schemas.microsoft.com/office/drawing/2016/5/13/chartex" xmlns:cx8="http://schemas.microsoft.com/office/drawing/2016/5/14/chartex" xmlns:mc="http://schemas.openxmlformats.org/markup-compatibility/2006" xmlns:aink="http://schemas.microsoft.com/office/drawing/2016/ink" xmlns:am3d="http://schemas.microsoft.com/office/drawing/2017/model3d" xmlns:o="urn:schemas-microsoft-com:office:office" xmlns:r="http://schemas.openxmlformats.org/officeDocument/2006/relationships" xmlns:m="http://schemas.openxmlformats.org/officeDocument/2006/math" xmlns:v="urn:schemas-microsoft-com:vml" xmlns:wp14="http://schemas.microsoft.com/office/word/2010/wordprocessingDrawing" xmlns:wp="http://schemas.openxmlformats.org/drawingml/2006/wordprocessingDrawing" xmlns:w10="urn:schemas-microsoft-com:office:word" xmlns:w="http://schemas.openxmlformats.org/wordprocessingml/2006/main" xmlns:w14="http://schemas.microsoft.com/office/word/2010/wordml" xmlns:w15="http://schemas.microsoft.com/office/word/2012/wordml" xmlns:w16cex="http://schemas.microsoft.com/office/word/2018/wordml/cex" xmlns:w16cid="http://schemas.microsoft.com/office/word/2016/wordml/cid" xmlns:w16="http://schemas.microsoft.com/office/word/2018/wordml" xmlns:w16sdtdh="http://schemas.microsoft.com/office/word/2020/wordml/sdtdatahash" xmlns:w16se="http://schemas.microsoft.com/office/word/2015/wordml/symex" xmlns:wpg="http://schemas.microsoft.com/office/word/2010/wordprocessingGroup" xmlns:wpi="http://schemas.microsoft.com/office/word/2010/wordprocessingInk" xmlns:wne="http://schemas.microsoft.com/office/word/2006/wordml" xmlns:wps="http://schemas.microsoft.com/office/word/2010/wordprocessingShape" mc:Ignorable="w14 w15 w16se w16cid w16 w16cex w16sdtdh wp14">
   <w:endnote w:type="separator" w:id="-1">
     <w:p>
       <w:pPr>
@@ -11016,7 +12385,7 @@
 </file>
 
 <file path=word/footer1.xml><?xml version="1.0" encoding="utf-8"?>
-<w:ftr xmlns:wpc="http://schemas.microsoft.com/office/word/2010/wordprocessingCanvas" xmlns:cx="http://schemas.microsoft.com/office/drawing/2014/chartex" xmlns:cx1="http://schemas.microsoft.com/office/drawing/2015/9/8/chartex" xmlns:cx2="http://schemas.microsoft.com/office/drawing/2015/10/21/chartex" xmlns:cx3="http://schemas.microsoft.com/office/drawing/2016/5/9/chartex" xmlns:cx4="http://schemas.microsoft.com/office/drawing/2016/5/10/chartex" xmlns:cx5="http://schemas.microsoft.com/office/drawing/2016/5/11/chartex" xmlns:cx6="http://schemas.microsoft.com/office/drawing/2016/5/12/chartex" xmlns:cx7="http://schemas.microsoft.com/office/drawing/2016/5/13/chartex" xmlns:cx8="http://schemas.microsoft.com/office/drawing/2016/5/14/chartex" xmlns:mc="http://schemas.openxmlformats.org/markup-compatibility/2006" xmlns:aink="http://schemas.microsoft.com/office/drawing/2016/ink" xmlns:am3d="http://schemas.microsoft.com/office/drawing/2017/model3d" xmlns:o="urn:schemas-microsoft-com:office:office" xmlns:r="http://schemas.openxmlformats.org/officeDocument/2006/relationships" xmlns:m="http://schemas.openxmlformats.org/officeDocument/2006/math" xmlns:v="urn:schemas-microsoft-com:vml" xmlns:wp14="http://schemas.microsoft.com/office/word/2010/wordprocessingDrawing" xmlns:wp="http://schemas.openxmlformats.org/drawingml/2006/wordprocessingDrawing" xmlns:w10="urn:schemas-microsoft-com:office:word" xmlns:w="http://schemas.openxmlformats.org/wordprocessingml/2006/main" xmlns:w14="http://schemas.microsoft.com/office/word/2010/wordml" xmlns:w15="http://schemas.microsoft.com/office/word/2012/wordml" xmlns:w16cid="http://schemas.microsoft.com/office/word/2016/wordml/cid" xmlns:w16se="http://schemas.microsoft.com/office/word/2015/wordml/symex" xmlns:wpg="http://schemas.microsoft.com/office/word/2010/wordprocessingGroup" xmlns:wpi="http://schemas.microsoft.com/office/word/2010/wordprocessingInk" xmlns:wne="http://schemas.microsoft.com/office/word/2006/wordml" xmlns:wps="http://schemas.microsoft.com/office/word/2010/wordprocessingShape" mc:Ignorable="w14 w15 w16se w16cid wp14">
+<w:ftr xmlns:wpc="http://schemas.microsoft.com/office/word/2010/wordprocessingCanvas" xmlns:cx="http://schemas.microsoft.com/office/drawing/2014/chartex" xmlns:cx1="http://schemas.microsoft.com/office/drawing/2015/9/8/chartex" xmlns:cx2="http://schemas.microsoft.com/office/drawing/2015/10/21/chartex" xmlns:cx3="http://schemas.microsoft.com/office/drawing/2016/5/9/chartex" xmlns:cx4="http://schemas.microsoft.com/office/drawing/2016/5/10/chartex" xmlns:cx5="http://schemas.microsoft.com/office/drawing/2016/5/11/chartex" xmlns:cx6="http://schemas.microsoft.com/office/drawing/2016/5/12/chartex" xmlns:cx7="http://schemas.microsoft.com/office/drawing/2016/5/13/chartex" xmlns:cx8="http://schemas.microsoft.com/office/drawing/2016/5/14/chartex" xmlns:mc="http://schemas.openxmlformats.org/markup-compatibility/2006" xmlns:aink="http://schemas.microsoft.com/office/drawing/2016/ink" xmlns:am3d="http://schemas.microsoft.com/office/drawing/2017/model3d" xmlns:o="urn:schemas-microsoft-com:office:office" xmlns:r="http://schemas.openxmlformats.org/officeDocument/2006/relationships" xmlns:m="http://schemas.openxmlformats.org/officeDocument/2006/math" xmlns:v="urn:schemas-microsoft-com:vml" xmlns:wp14="http://schemas.microsoft.com/office/word/2010/wordprocessingDrawing" xmlns:wp="http://schemas.openxmlformats.org/drawingml/2006/wordprocessingDrawing" xmlns:w10="urn:schemas-microsoft-com:office:word" xmlns:w="http://schemas.openxmlformats.org/wordprocessingml/2006/main" xmlns:w14="http://schemas.microsoft.com/office/word/2010/wordml" xmlns:w15="http://schemas.microsoft.com/office/word/2012/wordml" xmlns:w16cex="http://schemas.microsoft.com/office/word/2018/wordml/cex" xmlns:w16cid="http://schemas.microsoft.com/office/word/2016/wordml/cid" xmlns:w16="http://schemas.microsoft.com/office/word/2018/wordml" xmlns:w16sdtdh="http://schemas.microsoft.com/office/word/2020/wordml/sdtdatahash" xmlns:w16se="http://schemas.microsoft.com/office/word/2015/wordml/symex" xmlns:wpg="http://schemas.microsoft.com/office/word/2010/wordprocessingGroup" xmlns:wpi="http://schemas.microsoft.com/office/word/2010/wordprocessingInk" xmlns:wne="http://schemas.microsoft.com/office/word/2006/wordml" xmlns:wps="http://schemas.microsoft.com/office/word/2010/wordprocessingShape" mc:Ignorable="w14 w15 w16se w16cid w16 w16cex w16sdtdh wp14">
   <w:p>
     <w:pPr>
       <w:pStyle w:val="Fuzeile1"/>
@@ -11047,7 +12416,7 @@
 </file>
 
 <file path=word/footer2.xml><?xml version="1.0" encoding="utf-8"?>
-<w:ftr xmlns:wpc="http://schemas.microsoft.com/office/word/2010/wordprocessingCanvas" xmlns:cx="http://schemas.microsoft.com/office/drawing/2014/chartex" xmlns:cx1="http://schemas.microsoft.com/office/drawing/2015/9/8/chartex" xmlns:cx2="http://schemas.microsoft.com/office/drawing/2015/10/21/chartex" xmlns:cx3="http://schemas.microsoft.com/office/drawing/2016/5/9/chartex" xmlns:cx4="http://schemas.microsoft.com/office/drawing/2016/5/10/chartex" xmlns:cx5="http://schemas.microsoft.com/office/drawing/2016/5/11/chartex" xmlns:cx6="http://schemas.microsoft.com/office/drawing/2016/5/12/chartex" xmlns:cx7="http://schemas.microsoft.com/office/drawing/2016/5/13/chartex" xmlns:cx8="http://schemas.microsoft.com/office/drawing/2016/5/14/chartex" xmlns:mc="http://schemas.openxmlformats.org/markup-compatibility/2006" xmlns:aink="http://schemas.microsoft.com/office/drawing/2016/ink" xmlns:am3d="http://schemas.microsoft.com/office/drawing/2017/model3d" xmlns:o="urn:schemas-microsoft-com:office:office" xmlns:r="http://schemas.openxmlformats.org/officeDocument/2006/relationships" xmlns:m="http://schemas.openxmlformats.org/officeDocument/2006/math" xmlns:v="urn:schemas-microsoft-com:vml" xmlns:wp14="http://schemas.microsoft.com/office/word/2010/wordprocessingDrawing" xmlns:wp="http://schemas.openxmlformats.org/drawingml/2006/wordprocessingDrawing" xmlns:w10="urn:schemas-microsoft-com:office:word" xmlns:w="http://schemas.openxmlformats.org/wordprocessingml/2006/main" xmlns:w14="http://schemas.microsoft.com/office/word/2010/wordml" xmlns:w15="http://schemas.microsoft.com/office/word/2012/wordml" xmlns:w16cid="http://schemas.microsoft.com/office/word/2016/wordml/cid" xmlns:w16se="http://schemas.microsoft.com/office/word/2015/wordml/symex" xmlns:wpg="http://schemas.microsoft.com/office/word/2010/wordprocessingGroup" xmlns:wpi="http://schemas.microsoft.com/office/word/2010/wordprocessingInk" xmlns:wne="http://schemas.microsoft.com/office/word/2006/wordml" xmlns:wps="http://schemas.microsoft.com/office/word/2010/wordprocessingShape" mc:Ignorable="w14 w15 w16se w16cid wp14">
+<w:ftr xmlns:wpc="http://schemas.microsoft.com/office/word/2010/wordprocessingCanvas" xmlns:cx="http://schemas.microsoft.com/office/drawing/2014/chartex" xmlns:cx1="http://schemas.microsoft.com/office/drawing/2015/9/8/chartex" xmlns:cx2="http://schemas.microsoft.com/office/drawing/2015/10/21/chartex" xmlns:cx3="http://schemas.microsoft.com/office/drawing/2016/5/9/chartex" xmlns:cx4="http://schemas.microsoft.com/office/drawing/2016/5/10/chartex" xmlns:cx5="http://schemas.microsoft.com/office/drawing/2016/5/11/chartex" xmlns:cx6="http://schemas.microsoft.com/office/drawing/2016/5/12/chartex" xmlns:cx7="http://schemas.microsoft.com/office/drawing/2016/5/13/chartex" xmlns:cx8="http://schemas.microsoft.com/office/drawing/2016/5/14/chartex" xmlns:mc="http://schemas.openxmlformats.org/markup-compatibility/2006" xmlns:aink="http://schemas.microsoft.com/office/drawing/2016/ink" xmlns:am3d="http://schemas.microsoft.com/office/drawing/2017/model3d" xmlns:o="urn:schemas-microsoft-com:office:office" xmlns:r="http://schemas.openxmlformats.org/officeDocument/2006/relationships" xmlns:m="http://schemas.openxmlformats.org/officeDocument/2006/math" xmlns:v="urn:schemas-microsoft-com:vml" xmlns:wp14="http://schemas.microsoft.com/office/word/2010/wordprocessingDrawing" xmlns:wp="http://schemas.openxmlformats.org/drawingml/2006/wordprocessingDrawing" xmlns:w10="urn:schemas-microsoft-com:office:word" xmlns:w="http://schemas.openxmlformats.org/wordprocessingml/2006/main" xmlns:w14="http://schemas.microsoft.com/office/word/2010/wordml" xmlns:w15="http://schemas.microsoft.com/office/word/2012/wordml" xmlns:w16cex="http://schemas.microsoft.com/office/word/2018/wordml/cex" xmlns:w16cid="http://schemas.microsoft.com/office/word/2016/wordml/cid" xmlns:w16="http://schemas.microsoft.com/office/word/2018/wordml" xmlns:w16sdtdh="http://schemas.microsoft.com/office/word/2020/wordml/sdtdatahash" xmlns:w16se="http://schemas.microsoft.com/office/word/2015/wordml/symex" xmlns:wpg="http://schemas.microsoft.com/office/word/2010/wordprocessingGroup" xmlns:wpi="http://schemas.microsoft.com/office/word/2010/wordprocessingInk" xmlns:wne="http://schemas.microsoft.com/office/word/2006/wordml" xmlns:wps="http://schemas.microsoft.com/office/word/2010/wordprocessingShape" mc:Ignorable="w14 w15 w16se w16cid w16 w16cex w16sdtdh wp14">
   <w:p>
     <w:pPr>
       <w:pStyle w:val="Fuzeile1"/>
@@ -11078,7 +12447,7 @@
 </file>
 
 <file path=word/footnotes.xml><?xml version="1.0" encoding="utf-8"?>
-<w:footnotes xmlns:wpc="http://schemas.microsoft.com/office/word/2010/wordprocessingCanvas" xmlns:cx="http://schemas.microsoft.com/office/drawing/2014/chartex" xmlns:cx1="http://schemas.microsoft.com/office/drawing/2015/9/8/chartex" xmlns:cx2="http://schemas.microsoft.com/office/drawing/2015/10/21/chartex" xmlns:cx3="http://schemas.microsoft.com/office/drawing/2016/5/9/chartex" xmlns:cx4="http://schemas.microsoft.com/office/drawing/2016/5/10/chartex" xmlns:cx5="http://schemas.microsoft.com/office/drawing/2016/5/11/chartex" xmlns:cx6="http://schemas.microsoft.com/office/drawing/2016/5/12/chartex" xmlns:cx7="http://schemas.microsoft.com/office/drawing/2016/5/13/chartex" xmlns:cx8="http://schemas.microsoft.com/office/drawing/2016/5/14/chartex" xmlns:mc="http://schemas.openxmlformats.org/markup-compatibility/2006" xmlns:aink="http://schemas.microsoft.com/office/drawing/2016/ink" xmlns:am3d="http://schemas.microsoft.com/office/drawing/2017/model3d" xmlns:o="urn:schemas-microsoft-com:office:office" xmlns:r="http://schemas.openxmlformats.org/officeDocument/2006/relationships" xmlns:m="http://schemas.openxmlformats.org/officeDocument/2006/math" xmlns:v="urn:schemas-microsoft-com:vml" xmlns:wp14="http://schemas.microsoft.com/office/word/2010/wordprocessingDrawing" xmlns:wp="http://schemas.openxmlformats.org/drawingml/2006/wordprocessingDrawing" xmlns:w10="urn:schemas-microsoft-com:office:word" xmlns:w="http://schemas.openxmlformats.org/wordprocessingml/2006/main" xmlns:w14="http://schemas.microsoft.com/office/word/2010/wordml" xmlns:w15="http://schemas.microsoft.com/office/word/2012/wordml" xmlns:w16cid="http://schemas.microsoft.com/office/word/2016/wordml/cid" xmlns:w16se="http://schemas.microsoft.com/office/word/2015/wordml/symex" xmlns:wpg="http://schemas.microsoft.com/office/word/2010/wordprocessingGroup" xmlns:wpi="http://schemas.microsoft.com/office/word/2010/wordprocessingInk" xmlns:wne="http://schemas.microsoft.com/office/word/2006/wordml" xmlns:wps="http://schemas.microsoft.com/office/word/2010/wordprocessingShape" mc:Ignorable="w14 w15 w16se w16cid wp14">
+<w:footnotes xmlns:wpc="http://schemas.microsoft.com/office/word/2010/wordprocessingCanvas" xmlns:cx="http://schemas.microsoft.com/office/drawing/2014/chartex" xmlns:cx1="http://schemas.microsoft.com/office/drawing/2015/9/8/chartex" xmlns:cx2="http://schemas.microsoft.com/office/drawing/2015/10/21/chartex" xmlns:cx3="http://schemas.microsoft.com/office/drawing/2016/5/9/chartex" xmlns:cx4="http://schemas.microsoft.com/office/drawing/2016/5/10/chartex" xmlns:cx5="http://schemas.microsoft.com/office/drawing/2016/5/11/chartex" xmlns:cx6="http://schemas.microsoft.com/office/drawing/2016/5/12/chartex" xmlns:cx7="http://schemas.microsoft.com/office/drawing/2016/5/13/chartex" xmlns:cx8="http://schemas.microsoft.com/office/drawing/2016/5/14/chartex" xmlns:mc="http://schemas.openxmlformats.org/markup-compatibility/2006" xmlns:aink="http://schemas.microsoft.com/office/drawing/2016/ink" xmlns:am3d="http://schemas.microsoft.com/office/drawing/2017/model3d" xmlns:o="urn:schemas-microsoft-com:office:office" xmlns:r="http://schemas.openxmlformats.org/officeDocument/2006/relationships" xmlns:m="http://schemas.openxmlformats.org/officeDocument/2006/math" xmlns:v="urn:schemas-microsoft-com:vml" xmlns:wp14="http://schemas.microsoft.com/office/word/2010/wordprocessingDrawing" xmlns:wp="http://schemas.openxmlformats.org/drawingml/2006/wordprocessingDrawing" xmlns:w10="urn:schemas-microsoft-com:office:word" xmlns:w="http://schemas.openxmlformats.org/wordprocessingml/2006/main" xmlns:w14="http://schemas.microsoft.com/office/word/2010/wordml" xmlns:w15="http://schemas.microsoft.com/office/word/2012/wordml" xmlns:w16cex="http://schemas.microsoft.com/office/word/2018/wordml/cex" xmlns:w16cid="http://schemas.microsoft.com/office/word/2016/wordml/cid" xmlns:w16="http://schemas.microsoft.com/office/word/2018/wordml" xmlns:w16sdtdh="http://schemas.microsoft.com/office/word/2020/wordml/sdtdatahash" xmlns:w16se="http://schemas.microsoft.com/office/word/2015/wordml/symex" xmlns:wpg="http://schemas.microsoft.com/office/word/2010/wordprocessingGroup" xmlns:wpi="http://schemas.microsoft.com/office/word/2010/wordprocessingInk" xmlns:wne="http://schemas.microsoft.com/office/word/2006/wordml" xmlns:wps="http://schemas.microsoft.com/office/word/2010/wordprocessingShape" mc:Ignorable="w14 w15 w16se w16cid w16 w16cex w16sdtdh wp14">
   <w:footnote w:type="separator" w:id="-1">
     <w:p>
       <w:pPr>
@@ -11237,7 +12606,7 @@
 </file>
 
 <file path=word/header1.xml><?xml version="1.0" encoding="utf-8"?>
-<w:hdr xmlns:wpc="http://schemas.microsoft.com/office/word/2010/wordprocessingCanvas" xmlns:cx="http://schemas.microsoft.com/office/drawing/2014/chartex" xmlns:cx1="http://schemas.microsoft.com/office/drawing/2015/9/8/chartex" xmlns:cx2="http://schemas.microsoft.com/office/drawing/2015/10/21/chartex" xmlns:cx3="http://schemas.microsoft.com/office/drawing/2016/5/9/chartex" xmlns:cx4="http://schemas.microsoft.com/office/drawing/2016/5/10/chartex" xmlns:cx5="http://schemas.microsoft.com/office/drawing/2016/5/11/chartex" xmlns:cx6="http://schemas.microsoft.com/office/drawing/2016/5/12/chartex" xmlns:cx7="http://schemas.microsoft.com/office/drawing/2016/5/13/chartex" xmlns:cx8="http://schemas.microsoft.com/office/drawing/2016/5/14/chartex" xmlns:mc="http://schemas.openxmlformats.org/markup-compatibility/2006" xmlns:aink="http://schemas.microsoft.com/office/drawing/2016/ink" xmlns:am3d="http://schemas.microsoft.com/office/drawing/2017/model3d" xmlns:o="urn:schemas-microsoft-com:office:office" xmlns:r="http://schemas.openxmlformats.org/officeDocument/2006/relationships" xmlns:m="http://schemas.openxmlformats.org/officeDocument/2006/math" xmlns:v="urn:schemas-microsoft-com:vml" xmlns:wp14="http://schemas.microsoft.com/office/word/2010/wordprocessingDrawing" xmlns:wp="http://schemas.openxmlformats.org/drawingml/2006/wordprocessingDrawing" xmlns:w10="urn:schemas-microsoft-com:office:word" xmlns:w="http://schemas.openxmlformats.org/wordprocessingml/2006/main" xmlns:w14="http://schemas.microsoft.com/office/word/2010/wordml" xmlns:w15="http://schemas.microsoft.com/office/word/2012/wordml" xmlns:w16cid="http://schemas.microsoft.com/office/word/2016/wordml/cid" xmlns:w16se="http://schemas.microsoft.com/office/word/2015/wordml/symex" xmlns:wpg="http://schemas.microsoft.com/office/word/2010/wordprocessingGroup" xmlns:wpi="http://schemas.microsoft.com/office/word/2010/wordprocessingInk" xmlns:wne="http://schemas.microsoft.com/office/word/2006/wordml" xmlns:wps="http://schemas.microsoft.com/office/word/2010/wordprocessingShape" mc:Ignorable="w14 w15 w16se w16cid wp14">
+<w:hdr xmlns:wpc="http://schemas.microsoft.com/office/word/2010/wordprocessingCanvas" xmlns:cx="http://schemas.microsoft.com/office/drawing/2014/chartex" xmlns:cx1="http://schemas.microsoft.com/office/drawing/2015/9/8/chartex" xmlns:cx2="http://schemas.microsoft.com/office/drawing/2015/10/21/chartex" xmlns:cx3="http://schemas.microsoft.com/office/drawing/2016/5/9/chartex" xmlns:cx4="http://schemas.microsoft.com/office/drawing/2016/5/10/chartex" xmlns:cx5="http://schemas.microsoft.com/office/drawing/2016/5/11/chartex" xmlns:cx6="http://schemas.microsoft.com/office/drawing/2016/5/12/chartex" xmlns:cx7="http://schemas.microsoft.com/office/drawing/2016/5/13/chartex" xmlns:cx8="http://schemas.microsoft.com/office/drawing/2016/5/14/chartex" xmlns:mc="http://schemas.openxmlformats.org/markup-compatibility/2006" xmlns:aink="http://schemas.microsoft.com/office/drawing/2016/ink" xmlns:am3d="http://schemas.microsoft.com/office/drawing/2017/model3d" xmlns:o="urn:schemas-microsoft-com:office:office" xmlns:r="http://schemas.openxmlformats.org/officeDocument/2006/relationships" xmlns:m="http://schemas.openxmlformats.org/officeDocument/2006/math" xmlns:v="urn:schemas-microsoft-com:vml" xmlns:wp14="http://schemas.microsoft.com/office/word/2010/wordprocessingDrawing" xmlns:wp="http://schemas.openxmlformats.org/drawingml/2006/wordprocessingDrawing" xmlns:w10="urn:schemas-microsoft-com:office:word" xmlns:w="http://schemas.openxmlformats.org/wordprocessingml/2006/main" xmlns:w14="http://schemas.microsoft.com/office/word/2010/wordml" xmlns:w15="http://schemas.microsoft.com/office/word/2012/wordml" xmlns:w16cex="http://schemas.microsoft.com/office/word/2018/wordml/cex" xmlns:w16cid="http://schemas.microsoft.com/office/word/2016/wordml/cid" xmlns:w16="http://schemas.microsoft.com/office/word/2018/wordml" xmlns:w16sdtdh="http://schemas.microsoft.com/office/word/2020/wordml/sdtdatahash" xmlns:w16se="http://schemas.microsoft.com/office/word/2015/wordml/symex" xmlns:wpg="http://schemas.microsoft.com/office/word/2010/wordprocessingGroup" xmlns:wpi="http://schemas.microsoft.com/office/word/2010/wordprocessingInk" xmlns:wne="http://schemas.microsoft.com/office/word/2006/wordml" xmlns:wps="http://schemas.microsoft.com/office/word/2010/wordprocessingShape" mc:Ignorable="w14 w15 w16se w16cid w16 w16cex w16sdtdh wp14">
   <w:p>
     <w:pPr>
       <w:pStyle w:val="Kopfzeileschattiert"/>
@@ -11366,7 +12735,7 @@
 </file>
 
 <file path=word/numbering.xml><?xml version="1.0" encoding="utf-8"?>
-<w:numbering xmlns:wpc="http://schemas.microsoft.com/office/word/2010/wordprocessingCanvas" xmlns:cx="http://schemas.microsoft.com/office/drawing/2014/chartex" xmlns:cx1="http://schemas.microsoft.com/office/drawing/2015/9/8/chartex" xmlns:cx2="http://schemas.microsoft.com/office/drawing/2015/10/21/chartex" xmlns:cx3="http://schemas.microsoft.com/office/drawing/2016/5/9/chartex" xmlns:cx4="http://schemas.microsoft.com/office/drawing/2016/5/10/chartex" xmlns:cx5="http://schemas.microsoft.com/office/drawing/2016/5/11/chartex" xmlns:cx6="http://schemas.microsoft.com/office/drawing/2016/5/12/chartex" xmlns:cx7="http://schemas.microsoft.com/office/drawing/2016/5/13/chartex" xmlns:cx8="http://schemas.microsoft.com/office/drawing/2016/5/14/chartex" xmlns:mc="http://schemas.openxmlformats.org/markup-compatibility/2006" xmlns:aink="http://schemas.microsoft.com/office/drawing/2016/ink" xmlns:am3d="http://schemas.microsoft.com/office/drawing/2017/model3d" xmlns:o="urn:schemas-microsoft-com:office:office" xmlns:r="http://schemas.openxmlformats.org/officeDocument/2006/relationships" xmlns:m="http://schemas.openxmlformats.org/officeDocument/2006/math" xmlns:v="urn:schemas-microsoft-com:vml" xmlns:wp14="http://schemas.microsoft.com/office/word/2010/wordprocessingDrawing" xmlns:wp="http://schemas.openxmlformats.org/drawingml/2006/wordprocessingDrawing" xmlns:w10="urn:schemas-microsoft-com:office:word" xmlns:w="http://schemas.openxmlformats.org/wordprocessingml/2006/main" xmlns:w14="http://schemas.microsoft.com/office/word/2010/wordml" xmlns:w15="http://schemas.microsoft.com/office/word/2012/wordml" xmlns:w16cid="http://schemas.microsoft.com/office/word/2016/wordml/cid" xmlns:w16se="http://schemas.microsoft.com/office/word/2015/wordml/symex" xmlns:wpg="http://schemas.microsoft.com/office/word/2010/wordprocessingGroup" xmlns:wpi="http://schemas.microsoft.com/office/word/2010/wordprocessingInk" xmlns:wne="http://schemas.microsoft.com/office/word/2006/wordml" xmlns:wps="http://schemas.microsoft.com/office/word/2010/wordprocessingShape" mc:Ignorable="w14 w15 w16se w16cid wp14">
+<w:numbering xmlns:wpc="http://schemas.microsoft.com/office/word/2010/wordprocessingCanvas" xmlns:cx="http://schemas.microsoft.com/office/drawing/2014/chartex" xmlns:cx1="http://schemas.microsoft.com/office/drawing/2015/9/8/chartex" xmlns:cx2="http://schemas.microsoft.com/office/drawing/2015/10/21/chartex" xmlns:cx3="http://schemas.microsoft.com/office/drawing/2016/5/9/chartex" xmlns:cx4="http://schemas.microsoft.com/office/drawing/2016/5/10/chartex" xmlns:cx5="http://schemas.microsoft.com/office/drawing/2016/5/11/chartex" xmlns:cx6="http://schemas.microsoft.com/office/drawing/2016/5/12/chartex" xmlns:cx7="http://schemas.microsoft.com/office/drawing/2016/5/13/chartex" xmlns:cx8="http://schemas.microsoft.com/office/drawing/2016/5/14/chartex" xmlns:mc="http://schemas.openxmlformats.org/markup-compatibility/2006" xmlns:aink="http://schemas.microsoft.com/office/drawing/2016/ink" xmlns:am3d="http://schemas.microsoft.com/office/drawing/2017/model3d" xmlns:o="urn:schemas-microsoft-com:office:office" xmlns:r="http://schemas.openxmlformats.org/officeDocument/2006/relationships" xmlns:m="http://schemas.openxmlformats.org/officeDocument/2006/math" xmlns:v="urn:schemas-microsoft-com:vml" xmlns:wp14="http://schemas.microsoft.com/office/word/2010/wordprocessingDrawing" xmlns:wp="http://schemas.openxmlformats.org/drawingml/2006/wordprocessingDrawing" xmlns:w10="urn:schemas-microsoft-com:office:word" xmlns:w="http://schemas.openxmlformats.org/wordprocessingml/2006/main" xmlns:w14="http://schemas.microsoft.com/office/word/2010/wordml" xmlns:w15="http://schemas.microsoft.com/office/word/2012/wordml" xmlns:w16cex="http://schemas.microsoft.com/office/word/2018/wordml/cex" xmlns:w16cid="http://schemas.microsoft.com/office/word/2016/wordml/cid" xmlns:w16="http://schemas.microsoft.com/office/word/2018/wordml" xmlns:w16sdtdh="http://schemas.microsoft.com/office/word/2020/wordml/sdtdatahash" xmlns:w16se="http://schemas.microsoft.com/office/word/2015/wordml/symex" xmlns:wpg="http://schemas.microsoft.com/office/word/2010/wordprocessingGroup" xmlns:wpi="http://schemas.microsoft.com/office/word/2010/wordprocessingInk" xmlns:wne="http://schemas.microsoft.com/office/word/2006/wordml" xmlns:wps="http://schemas.microsoft.com/office/word/2010/wordprocessingShape" mc:Ignorable="w14 w15 w16se w16cid w16 w16cex w16sdtdh wp14">
   <w:abstractNum w:abstractNumId="0" w15:restartNumberingAfterBreak="0">
     <w:nsid w:val="FFFFFF7C"/>
     <w:multiLevelType w:val="singleLevel"/>
@@ -11858,6 +13227,119 @@
     </w:lvl>
   </w:abstractNum>
   <w:abstractNum w:abstractNumId="14" w15:restartNumberingAfterBreak="0">
+    <w:nsid w:val="2ECF6B9A"/>
+    <w:multiLevelType w:val="hybridMultilevel"/>
+    <w:tmpl w:val="651C56D8"/>
+    <w:lvl w:ilvl="0" w:tplc="04070001">
+      <w:start w:val="1"/>
+      <w:numFmt w:val="bullet"/>
+      <w:lvlText w:val=""/>
+      <w:lvlJc w:val="left"/>
+      <w:pPr>
+        <w:ind w:left="720" w:hanging="360"/>
+      </w:pPr>
+      <w:rPr>
+        <w:rFonts w:ascii="Symbol" w:hAnsi="Symbol" w:hint="default"/>
+      </w:rPr>
+    </w:lvl>
+    <w:lvl w:ilvl="1" w:tplc="04070003" w:tentative="1">
+      <w:start w:val="1"/>
+      <w:numFmt w:val="bullet"/>
+      <w:lvlText w:val="o"/>
+      <w:lvlJc w:val="left"/>
+      <w:pPr>
+        <w:ind w:left="1440" w:hanging="360"/>
+      </w:pPr>
+      <w:rPr>
+        <w:rFonts w:ascii="Courier New" w:hAnsi="Courier New" w:cs="Courier New" w:hint="default"/>
+      </w:rPr>
+    </w:lvl>
+    <w:lvl w:ilvl="2" w:tplc="04070005" w:tentative="1">
+      <w:start w:val="1"/>
+      <w:numFmt w:val="bullet"/>
+      <w:lvlText w:val=""/>
+      <w:lvlJc w:val="left"/>
+      <w:pPr>
+        <w:ind w:left="2160" w:hanging="360"/>
+      </w:pPr>
+      <w:rPr>
+        <w:rFonts w:ascii="Wingdings" w:hAnsi="Wingdings" w:hint="default"/>
+      </w:rPr>
+    </w:lvl>
+    <w:lvl w:ilvl="3" w:tplc="04070001" w:tentative="1">
+      <w:start w:val="1"/>
+      <w:numFmt w:val="bullet"/>
+      <w:lvlText w:val=""/>
+      <w:lvlJc w:val="left"/>
+      <w:pPr>
+        <w:ind w:left="2880" w:hanging="360"/>
+      </w:pPr>
+      <w:rPr>
+        <w:rFonts w:ascii="Symbol" w:hAnsi="Symbol" w:hint="default"/>
+      </w:rPr>
+    </w:lvl>
+    <w:lvl w:ilvl="4" w:tplc="04070003" w:tentative="1">
+      <w:start w:val="1"/>
+      <w:numFmt w:val="bullet"/>
+      <w:lvlText w:val="o"/>
+      <w:lvlJc w:val="left"/>
+      <w:pPr>
+        <w:ind w:left="3600" w:hanging="360"/>
+      </w:pPr>
+      <w:rPr>
+        <w:rFonts w:ascii="Courier New" w:hAnsi="Courier New" w:cs="Courier New" w:hint="default"/>
+      </w:rPr>
+    </w:lvl>
+    <w:lvl w:ilvl="5" w:tplc="04070005" w:tentative="1">
+      <w:start w:val="1"/>
+      <w:numFmt w:val="bullet"/>
+      <w:lvlText w:val=""/>
+      <w:lvlJc w:val="left"/>
+      <w:pPr>
+        <w:ind w:left="4320" w:hanging="360"/>
+      </w:pPr>
+      <w:rPr>
+        <w:rFonts w:ascii="Wingdings" w:hAnsi="Wingdings" w:hint="default"/>
+      </w:rPr>
+    </w:lvl>
+    <w:lvl w:ilvl="6" w:tplc="04070001" w:tentative="1">
+      <w:start w:val="1"/>
+      <w:numFmt w:val="bullet"/>
+      <w:lvlText w:val=""/>
+      <w:lvlJc w:val="left"/>
+      <w:pPr>
+        <w:ind w:left="5040" w:hanging="360"/>
+      </w:pPr>
+      <w:rPr>
+        <w:rFonts w:ascii="Symbol" w:hAnsi="Symbol" w:hint="default"/>
+      </w:rPr>
+    </w:lvl>
+    <w:lvl w:ilvl="7" w:tplc="04070003" w:tentative="1">
+      <w:start w:val="1"/>
+      <w:numFmt w:val="bullet"/>
+      <w:lvlText w:val="o"/>
+      <w:lvlJc w:val="left"/>
+      <w:pPr>
+        <w:ind w:left="5760" w:hanging="360"/>
+      </w:pPr>
+      <w:rPr>
+        <w:rFonts w:ascii="Courier New" w:hAnsi="Courier New" w:cs="Courier New" w:hint="default"/>
+      </w:rPr>
+    </w:lvl>
+    <w:lvl w:ilvl="8" w:tplc="04070005" w:tentative="1">
+      <w:start w:val="1"/>
+      <w:numFmt w:val="bullet"/>
+      <w:lvlText w:val=""/>
+      <w:lvlJc w:val="left"/>
+      <w:pPr>
+        <w:ind w:left="6480" w:hanging="360"/>
+      </w:pPr>
+      <w:rPr>
+        <w:rFonts w:ascii="Wingdings" w:hAnsi="Wingdings" w:hint="default"/>
+      </w:rPr>
+    </w:lvl>
+  </w:abstractNum>
+  <w:abstractNum w:abstractNumId="15" w15:restartNumberingAfterBreak="0">
     <w:nsid w:val="3619179F"/>
     <w:multiLevelType w:val="hybridMultilevel"/>
     <w:tmpl w:val="D764ACD2"/>
@@ -11973,7 +13455,7 @@
       </w:rPr>
     </w:lvl>
   </w:abstractNum>
-  <w:abstractNum w:abstractNumId="15" w15:restartNumberingAfterBreak="0">
+  <w:abstractNum w:abstractNumId="16" w15:restartNumberingAfterBreak="0">
     <w:nsid w:val="367F6A45"/>
     <w:multiLevelType w:val="multilevel"/>
     <w:tmpl w:val="80C0D6D2"/>
@@ -12092,7 +13574,7 @@
       </w:rPr>
     </w:lvl>
   </w:abstractNum>
-  <w:abstractNum w:abstractNumId="16" w15:restartNumberingAfterBreak="0">
+  <w:abstractNum w:abstractNumId="17" w15:restartNumberingAfterBreak="0">
     <w:nsid w:val="392C7C7E"/>
     <w:multiLevelType w:val="hybridMultilevel"/>
     <w:tmpl w:val="482C1BCA"/>
@@ -12181,7 +13663,120 @@
       </w:pPr>
     </w:lvl>
   </w:abstractNum>
-  <w:abstractNum w:abstractNumId="17" w15:restartNumberingAfterBreak="0">
+  <w:abstractNum w:abstractNumId="18" w15:restartNumberingAfterBreak="0">
+    <w:nsid w:val="39B50A2E"/>
+    <w:multiLevelType w:val="hybridMultilevel"/>
+    <w:tmpl w:val="7834DCAE"/>
+    <w:lvl w:ilvl="0" w:tplc="04070001">
+      <w:start w:val="1"/>
+      <w:numFmt w:val="bullet"/>
+      <w:lvlText w:val=""/>
+      <w:lvlJc w:val="left"/>
+      <w:pPr>
+        <w:ind w:left="720" w:hanging="360"/>
+      </w:pPr>
+      <w:rPr>
+        <w:rFonts w:ascii="Symbol" w:hAnsi="Symbol" w:hint="default"/>
+      </w:rPr>
+    </w:lvl>
+    <w:lvl w:ilvl="1" w:tplc="04070003" w:tentative="1">
+      <w:start w:val="1"/>
+      <w:numFmt w:val="bullet"/>
+      <w:lvlText w:val="o"/>
+      <w:lvlJc w:val="left"/>
+      <w:pPr>
+        <w:ind w:left="1440" w:hanging="360"/>
+      </w:pPr>
+      <w:rPr>
+        <w:rFonts w:ascii="Courier New" w:hAnsi="Courier New" w:cs="Courier New" w:hint="default"/>
+      </w:rPr>
+    </w:lvl>
+    <w:lvl w:ilvl="2" w:tplc="04070005" w:tentative="1">
+      <w:start w:val="1"/>
+      <w:numFmt w:val="bullet"/>
+      <w:lvlText w:val=""/>
+      <w:lvlJc w:val="left"/>
+      <w:pPr>
+        <w:ind w:left="2160" w:hanging="360"/>
+      </w:pPr>
+      <w:rPr>
+        <w:rFonts w:ascii="Wingdings" w:hAnsi="Wingdings" w:hint="default"/>
+      </w:rPr>
+    </w:lvl>
+    <w:lvl w:ilvl="3" w:tplc="04070001" w:tentative="1">
+      <w:start w:val="1"/>
+      <w:numFmt w:val="bullet"/>
+      <w:lvlText w:val=""/>
+      <w:lvlJc w:val="left"/>
+      <w:pPr>
+        <w:ind w:left="2880" w:hanging="360"/>
+      </w:pPr>
+      <w:rPr>
+        <w:rFonts w:ascii="Symbol" w:hAnsi="Symbol" w:hint="default"/>
+      </w:rPr>
+    </w:lvl>
+    <w:lvl w:ilvl="4" w:tplc="04070003" w:tentative="1">
+      <w:start w:val="1"/>
+      <w:numFmt w:val="bullet"/>
+      <w:lvlText w:val="o"/>
+      <w:lvlJc w:val="left"/>
+      <w:pPr>
+        <w:ind w:left="3600" w:hanging="360"/>
+      </w:pPr>
+      <w:rPr>
+        <w:rFonts w:ascii="Courier New" w:hAnsi="Courier New" w:cs="Courier New" w:hint="default"/>
+      </w:rPr>
+    </w:lvl>
+    <w:lvl w:ilvl="5" w:tplc="04070005" w:tentative="1">
+      <w:start w:val="1"/>
+      <w:numFmt w:val="bullet"/>
+      <w:lvlText w:val=""/>
+      <w:lvlJc w:val="left"/>
+      <w:pPr>
+        <w:ind w:left="4320" w:hanging="360"/>
+      </w:pPr>
+      <w:rPr>
+        <w:rFonts w:ascii="Wingdings" w:hAnsi="Wingdings" w:hint="default"/>
+      </w:rPr>
+    </w:lvl>
+    <w:lvl w:ilvl="6" w:tplc="04070001" w:tentative="1">
+      <w:start w:val="1"/>
+      <w:numFmt w:val="bullet"/>
+      <w:lvlText w:val=""/>
+      <w:lvlJc w:val="left"/>
+      <w:pPr>
+        <w:ind w:left="5040" w:hanging="360"/>
+      </w:pPr>
+      <w:rPr>
+        <w:rFonts w:ascii="Symbol" w:hAnsi="Symbol" w:hint="default"/>
+      </w:rPr>
+    </w:lvl>
+    <w:lvl w:ilvl="7" w:tplc="04070003" w:tentative="1">
+      <w:start w:val="1"/>
+      <w:numFmt w:val="bullet"/>
+      <w:lvlText w:val="o"/>
+      <w:lvlJc w:val="left"/>
+      <w:pPr>
+        <w:ind w:left="5760" w:hanging="360"/>
+      </w:pPr>
+      <w:rPr>
+        <w:rFonts w:ascii="Courier New" w:hAnsi="Courier New" w:cs="Courier New" w:hint="default"/>
+      </w:rPr>
+    </w:lvl>
+    <w:lvl w:ilvl="8" w:tplc="04070005" w:tentative="1">
+      <w:start w:val="1"/>
+      <w:numFmt w:val="bullet"/>
+      <w:lvlText w:val=""/>
+      <w:lvlJc w:val="left"/>
+      <w:pPr>
+        <w:ind w:left="6480" w:hanging="360"/>
+      </w:pPr>
+      <w:rPr>
+        <w:rFonts w:ascii="Wingdings" w:hAnsi="Wingdings" w:hint="default"/>
+      </w:rPr>
+    </w:lvl>
+  </w:abstractNum>
+  <w:abstractNum w:abstractNumId="19" w15:restartNumberingAfterBreak="0">
     <w:nsid w:val="48AD68DF"/>
     <w:multiLevelType w:val="multilevel"/>
     <w:tmpl w:val="0407001F"/>
@@ -12267,7 +13862,7 @@
       </w:pPr>
     </w:lvl>
   </w:abstractNum>
-  <w:abstractNum w:abstractNumId="18" w15:restartNumberingAfterBreak="0">
+  <w:abstractNum w:abstractNumId="20" w15:restartNumberingAfterBreak="0">
     <w:nsid w:val="59322693"/>
     <w:multiLevelType w:val="hybridMultilevel"/>
     <w:tmpl w:val="E3FA8594"/>
@@ -12379,7 +13974,120 @@
       </w:rPr>
     </w:lvl>
   </w:abstractNum>
-  <w:abstractNum w:abstractNumId="19" w15:restartNumberingAfterBreak="0">
+  <w:abstractNum w:abstractNumId="21" w15:restartNumberingAfterBreak="0">
+    <w:nsid w:val="5B8E2CAC"/>
+    <w:multiLevelType w:val="hybridMultilevel"/>
+    <w:tmpl w:val="0C94D7CE"/>
+    <w:lvl w:ilvl="0" w:tplc="04070001">
+      <w:start w:val="1"/>
+      <w:numFmt w:val="bullet"/>
+      <w:lvlText w:val=""/>
+      <w:lvlJc w:val="left"/>
+      <w:pPr>
+        <w:ind w:left="720" w:hanging="360"/>
+      </w:pPr>
+      <w:rPr>
+        <w:rFonts w:ascii="Symbol" w:hAnsi="Symbol" w:hint="default"/>
+      </w:rPr>
+    </w:lvl>
+    <w:lvl w:ilvl="1" w:tplc="04070003" w:tentative="1">
+      <w:start w:val="1"/>
+      <w:numFmt w:val="bullet"/>
+      <w:lvlText w:val="o"/>
+      <w:lvlJc w:val="left"/>
+      <w:pPr>
+        <w:ind w:left="1440" w:hanging="360"/>
+      </w:pPr>
+      <w:rPr>
+        <w:rFonts w:ascii="Courier New" w:hAnsi="Courier New" w:cs="Courier New" w:hint="default"/>
+      </w:rPr>
+    </w:lvl>
+    <w:lvl w:ilvl="2" w:tplc="04070005" w:tentative="1">
+      <w:start w:val="1"/>
+      <w:numFmt w:val="bullet"/>
+      <w:lvlText w:val=""/>
+      <w:lvlJc w:val="left"/>
+      <w:pPr>
+        <w:ind w:left="2160" w:hanging="360"/>
+      </w:pPr>
+      <w:rPr>
+        <w:rFonts w:ascii="Wingdings" w:hAnsi="Wingdings" w:hint="default"/>
+      </w:rPr>
+    </w:lvl>
+    <w:lvl w:ilvl="3" w:tplc="04070001" w:tentative="1">
+      <w:start w:val="1"/>
+      <w:numFmt w:val="bullet"/>
+      <w:lvlText w:val=""/>
+      <w:lvlJc w:val="left"/>
+      <w:pPr>
+        <w:ind w:left="2880" w:hanging="360"/>
+      </w:pPr>
+      <w:rPr>
+        <w:rFonts w:ascii="Symbol" w:hAnsi="Symbol" w:hint="default"/>
+      </w:rPr>
+    </w:lvl>
+    <w:lvl w:ilvl="4" w:tplc="04070003" w:tentative="1">
+      <w:start w:val="1"/>
+      <w:numFmt w:val="bullet"/>
+      <w:lvlText w:val="o"/>
+      <w:lvlJc w:val="left"/>
+      <w:pPr>
+        <w:ind w:left="3600" w:hanging="360"/>
+      </w:pPr>
+      <w:rPr>
+        <w:rFonts w:ascii="Courier New" w:hAnsi="Courier New" w:cs="Courier New" w:hint="default"/>
+      </w:rPr>
+    </w:lvl>
+    <w:lvl w:ilvl="5" w:tplc="04070005" w:tentative="1">
+      <w:start w:val="1"/>
+      <w:numFmt w:val="bullet"/>
+      <w:lvlText w:val=""/>
+      <w:lvlJc w:val="left"/>
+      <w:pPr>
+        <w:ind w:left="4320" w:hanging="360"/>
+      </w:pPr>
+      <w:rPr>
+        <w:rFonts w:ascii="Wingdings" w:hAnsi="Wingdings" w:hint="default"/>
+      </w:rPr>
+    </w:lvl>
+    <w:lvl w:ilvl="6" w:tplc="04070001" w:tentative="1">
+      <w:start w:val="1"/>
+      <w:numFmt w:val="bullet"/>
+      <w:lvlText w:val=""/>
+      <w:lvlJc w:val="left"/>
+      <w:pPr>
+        <w:ind w:left="5040" w:hanging="360"/>
+      </w:pPr>
+      <w:rPr>
+        <w:rFonts w:ascii="Symbol" w:hAnsi="Symbol" w:hint="default"/>
+      </w:rPr>
+    </w:lvl>
+    <w:lvl w:ilvl="7" w:tplc="04070003" w:tentative="1">
+      <w:start w:val="1"/>
+      <w:numFmt w:val="bullet"/>
+      <w:lvlText w:val="o"/>
+      <w:lvlJc w:val="left"/>
+      <w:pPr>
+        <w:ind w:left="5760" w:hanging="360"/>
+      </w:pPr>
+      <w:rPr>
+        <w:rFonts w:ascii="Courier New" w:hAnsi="Courier New" w:cs="Courier New" w:hint="default"/>
+      </w:rPr>
+    </w:lvl>
+    <w:lvl w:ilvl="8" w:tplc="04070005" w:tentative="1">
+      <w:start w:val="1"/>
+      <w:numFmt w:val="bullet"/>
+      <w:lvlText w:val=""/>
+      <w:lvlJc w:val="left"/>
+      <w:pPr>
+        <w:ind w:left="6480" w:hanging="360"/>
+      </w:pPr>
+      <w:rPr>
+        <w:rFonts w:ascii="Wingdings" w:hAnsi="Wingdings" w:hint="default"/>
+      </w:rPr>
+    </w:lvl>
+  </w:abstractNum>
+  <w:abstractNum w:abstractNumId="22" w15:restartNumberingAfterBreak="0">
     <w:nsid w:val="5FB27CE5"/>
     <w:multiLevelType w:val="multilevel"/>
     <w:tmpl w:val="0409001D"/>
@@ -12496,7 +14204,7 @@
     <w:abstractNumId w:val="0"/>
   </w:num>
   <w:num w:numId="11">
-    <w:abstractNumId w:val="14"/>
+    <w:abstractNumId w:val="15"/>
   </w:num>
   <w:num w:numId="12">
     <w:abstractNumId w:val="9"/>
@@ -12520,7 +14228,7 @@
     <w:abstractNumId w:val="12"/>
   </w:num>
   <w:num w:numId="16">
-    <w:abstractNumId w:val="19"/>
+    <w:abstractNumId w:val="22"/>
   </w:num>
   <w:num w:numId="17">
     <w:abstractNumId w:val="11"/>
@@ -12529,7 +14237,7 @@
     <w:abstractNumId w:val="10"/>
   </w:num>
   <w:num w:numId="19">
-    <w:abstractNumId w:val="15"/>
+    <w:abstractNumId w:val="16"/>
   </w:num>
   <w:num w:numId="20">
     <w:abstractNumId w:val="9"/>
@@ -12550,22 +14258,31 @@
     </w:lvlOverride>
   </w:num>
   <w:num w:numId="24">
-    <w:abstractNumId w:val="17"/>
+    <w:abstractNumId w:val="19"/>
   </w:num>
   <w:num w:numId="25">
     <w:abstractNumId w:val="13"/>
   </w:num>
   <w:num w:numId="26">
-    <w:abstractNumId w:val="16"/>
+    <w:abstractNumId w:val="17"/>
   </w:num>
   <w:num w:numId="27">
+    <w:abstractNumId w:val="20"/>
+  </w:num>
+  <w:num w:numId="28">
+    <w:abstractNumId w:val="14"/>
+  </w:num>
+  <w:num w:numId="29">
     <w:abstractNumId w:val="18"/>
+  </w:num>
+  <w:num w:numId="30">
+    <w:abstractNumId w:val="21"/>
   </w:num>
 </w:numbering>
 </file>
 
 <file path=word/styles.xml><?xml version="1.0" encoding="utf-8"?>
-<w:styles xmlns:mc="http://schemas.openxmlformats.org/markup-compatibility/2006" xmlns:r="http://schemas.openxmlformats.org/officeDocument/2006/relationships" xmlns:w="http://schemas.openxmlformats.org/wordprocessingml/2006/main" xmlns:w14="http://schemas.microsoft.com/office/word/2010/wordml" xmlns:w15="http://schemas.microsoft.com/office/word/2012/wordml" xmlns:w16cid="http://schemas.microsoft.com/office/word/2016/wordml/cid" xmlns:w16se="http://schemas.microsoft.com/office/word/2015/wordml/symex" mc:Ignorable="w14 w15 w16se w16cid">
+<w:styles xmlns:mc="http://schemas.openxmlformats.org/markup-compatibility/2006" xmlns:r="http://schemas.openxmlformats.org/officeDocument/2006/relationships" xmlns:w="http://schemas.openxmlformats.org/wordprocessingml/2006/main" xmlns:w14="http://schemas.microsoft.com/office/word/2010/wordml" xmlns:w15="http://schemas.microsoft.com/office/word/2012/wordml" xmlns:w16cex="http://schemas.microsoft.com/office/word/2018/wordml/cex" xmlns:w16cid="http://schemas.microsoft.com/office/word/2016/wordml/cid" xmlns:w16="http://schemas.microsoft.com/office/word/2018/wordml" xmlns:w16sdtdh="http://schemas.microsoft.com/office/word/2020/wordml/sdtdatahash" xmlns:w16se="http://schemas.microsoft.com/office/word/2015/wordml/symex" mc:Ignorable="w14 w15 w16se w16cid w16 w16cex w16sdtdh">
   <w:docDefaults>
     <w:rPrDefault>
       <w:rPr>
@@ -12580,7 +14297,7 @@
       </w:pPr>
     </w:pPrDefault>
   </w:docDefaults>
-  <w:latentStyles w:defLockedState="0" w:defUIPriority="99" w:defSemiHidden="0" w:defUnhideWhenUsed="0" w:defQFormat="0" w:count="375">
+  <w:latentStyles w:defLockedState="0" w:defUIPriority="99" w:defSemiHidden="0" w:defUnhideWhenUsed="0" w:defQFormat="0" w:count="376">
     <w:lsdException w:name="Normal" w:uiPriority="0" w:qFormat="1"/>
     <w:lsdException w:name="heading 1" w:uiPriority="0" w:qFormat="1"/>
     <w:lsdException w:name="heading 2" w:semiHidden="1" w:uiPriority="0" w:unhideWhenUsed="1" w:qFormat="1"/>
@@ -12956,6 +14673,7 @@
     <w:lsdException w:name="Smart Hyperlink" w:semiHidden="1" w:unhideWhenUsed="1"/>
     <w:lsdException w:name="Hashtag" w:semiHidden="1" w:unhideWhenUsed="1"/>
     <w:lsdException w:name="Unresolved Mention" w:semiHidden="1" w:unhideWhenUsed="1"/>
+    <w:lsdException w:name="Smart Link" w:semiHidden="1" w:unhideWhenUsed="1"/>
   </w:latentStyles>
   <w:style w:type="paragraph" w:default="1" w:styleId="Standard">
     <w:name w:val="Normal"/>
@@ -34601,7 +36319,7 @@
 </file>
 
 <file path=word/glossary/document.xml><?xml version="1.0" encoding="utf-8"?>
-<w:glossaryDocument xmlns:wpc="http://schemas.microsoft.com/office/word/2010/wordprocessingCanvas" xmlns:cx="http://schemas.microsoft.com/office/drawing/2014/chartex" xmlns:cx1="http://schemas.microsoft.com/office/drawing/2015/9/8/chartex" xmlns:cx2="http://schemas.microsoft.com/office/drawing/2015/10/21/chartex" xmlns:cx3="http://schemas.microsoft.com/office/drawing/2016/5/9/chartex" xmlns:cx4="http://schemas.microsoft.com/office/drawing/2016/5/10/chartex" xmlns:cx5="http://schemas.microsoft.com/office/drawing/2016/5/11/chartex" xmlns:cx6="http://schemas.microsoft.com/office/drawing/2016/5/12/chartex" xmlns:cx7="http://schemas.microsoft.com/office/drawing/2016/5/13/chartex" xmlns:cx8="http://schemas.microsoft.com/office/drawing/2016/5/14/chartex" xmlns:mc="http://schemas.openxmlformats.org/markup-compatibility/2006" xmlns:aink="http://schemas.microsoft.com/office/drawing/2016/ink" xmlns:am3d="http://schemas.microsoft.com/office/drawing/2017/model3d" xmlns:o="urn:schemas-microsoft-com:office:office" xmlns:r="http://schemas.openxmlformats.org/officeDocument/2006/relationships" xmlns:m="http://schemas.openxmlformats.org/officeDocument/2006/math" xmlns:v="urn:schemas-microsoft-com:vml" xmlns:wp14="http://schemas.microsoft.com/office/word/2010/wordprocessingDrawing" xmlns:wp="http://schemas.openxmlformats.org/drawingml/2006/wordprocessingDrawing" xmlns:w10="urn:schemas-microsoft-com:office:word" xmlns:w="http://schemas.openxmlformats.org/wordprocessingml/2006/main" xmlns:w14="http://schemas.microsoft.com/office/word/2010/wordml" xmlns:w15="http://schemas.microsoft.com/office/word/2012/wordml" xmlns:w16cid="http://schemas.microsoft.com/office/word/2016/wordml/cid" xmlns:w16se="http://schemas.microsoft.com/office/word/2015/wordml/symex" xmlns:wpg="http://schemas.microsoft.com/office/word/2010/wordprocessingGroup" xmlns:wpi="http://schemas.microsoft.com/office/word/2010/wordprocessingInk" xmlns:wne="http://schemas.microsoft.com/office/word/2006/wordml" xmlns:wps="http://schemas.microsoft.com/office/word/2010/wordprocessingShape" mc:Ignorable="w14 w15 w16se w16cid wp14">
+<w:glossaryDocument xmlns:wpc="http://schemas.microsoft.com/office/word/2010/wordprocessingCanvas" xmlns:cx="http://schemas.microsoft.com/office/drawing/2014/chartex" xmlns:cx1="http://schemas.microsoft.com/office/drawing/2015/9/8/chartex" xmlns:cx2="http://schemas.microsoft.com/office/drawing/2015/10/21/chartex" xmlns:cx3="http://schemas.microsoft.com/office/drawing/2016/5/9/chartex" xmlns:cx4="http://schemas.microsoft.com/office/drawing/2016/5/10/chartex" xmlns:cx5="http://schemas.microsoft.com/office/drawing/2016/5/11/chartex" xmlns:cx6="http://schemas.microsoft.com/office/drawing/2016/5/12/chartex" xmlns:cx7="http://schemas.microsoft.com/office/drawing/2016/5/13/chartex" xmlns:cx8="http://schemas.microsoft.com/office/drawing/2016/5/14/chartex" xmlns:mc="http://schemas.openxmlformats.org/markup-compatibility/2006" xmlns:aink="http://schemas.microsoft.com/office/drawing/2016/ink" xmlns:am3d="http://schemas.microsoft.com/office/drawing/2017/model3d" xmlns:o="urn:schemas-microsoft-com:office:office" xmlns:r="http://schemas.openxmlformats.org/officeDocument/2006/relationships" xmlns:m="http://schemas.openxmlformats.org/officeDocument/2006/math" xmlns:v="urn:schemas-microsoft-com:vml" xmlns:wp14="http://schemas.microsoft.com/office/word/2010/wordprocessingDrawing" xmlns:wp="http://schemas.openxmlformats.org/drawingml/2006/wordprocessingDrawing" xmlns:w10="urn:schemas-microsoft-com:office:word" xmlns:w="http://schemas.openxmlformats.org/wordprocessingml/2006/main" xmlns:w14="http://schemas.microsoft.com/office/word/2010/wordml" xmlns:w15="http://schemas.microsoft.com/office/word/2012/wordml" xmlns:w16cex="http://schemas.microsoft.com/office/word/2018/wordml/cex" xmlns:w16cid="http://schemas.microsoft.com/office/word/2016/wordml/cid" xmlns:w16="http://schemas.microsoft.com/office/word/2018/wordml" xmlns:w16sdtdh="http://schemas.microsoft.com/office/word/2020/wordml/sdtdatahash" xmlns:w16se="http://schemas.microsoft.com/office/word/2015/wordml/symex" xmlns:wpg="http://schemas.microsoft.com/office/word/2010/wordprocessingGroup" xmlns:wpi="http://schemas.microsoft.com/office/word/2010/wordprocessingInk" xmlns:wne="http://schemas.microsoft.com/office/word/2006/wordml" xmlns:wps="http://schemas.microsoft.com/office/word/2010/wordprocessingShape" mc:Ignorable="w14 w15 w16se w16cid w16 w16cex w16sdtdh wp14">
   <w:docParts>
     <w:docPart>
       <w:docPartPr>
@@ -34689,7 +36407,7 @@
 </file>
 
 <file path=word/glossary/fontTable.xml><?xml version="1.0" encoding="utf-8"?>
-<w:fonts xmlns:mc="http://schemas.openxmlformats.org/markup-compatibility/2006" xmlns:r="http://schemas.openxmlformats.org/officeDocument/2006/relationships" xmlns:w="http://schemas.openxmlformats.org/wordprocessingml/2006/main" xmlns:w14="http://schemas.microsoft.com/office/word/2010/wordml" xmlns:w15="http://schemas.microsoft.com/office/word/2012/wordml" xmlns:w16cid="http://schemas.microsoft.com/office/word/2016/wordml/cid" xmlns:w16se="http://schemas.microsoft.com/office/word/2015/wordml/symex" mc:Ignorable="w14 w15 w16se w16cid">
+<w:fonts xmlns:mc="http://schemas.openxmlformats.org/markup-compatibility/2006" xmlns:r="http://schemas.openxmlformats.org/officeDocument/2006/relationships" xmlns:w="http://schemas.openxmlformats.org/wordprocessingml/2006/main" xmlns:w14="http://schemas.microsoft.com/office/word/2010/wordml" xmlns:w15="http://schemas.microsoft.com/office/word/2012/wordml" xmlns:w16cex="http://schemas.microsoft.com/office/word/2018/wordml/cex" xmlns:w16cid="http://schemas.microsoft.com/office/word/2016/wordml/cid" xmlns:w16="http://schemas.microsoft.com/office/word/2018/wordml" xmlns:w16sdtdh="http://schemas.microsoft.com/office/word/2020/wordml/sdtdatahash" xmlns:w16se="http://schemas.microsoft.com/office/word/2015/wordml/symex" mc:Ignorable="w14 w15 w16se w16cid w16 w16cex w16sdtdh">
   <w:font w:name="Symbol">
     <w:panose1 w:val="05050102010706020507"/>
     <w:charset w:val="02"/>
@@ -34730,7 +36448,7 @@
     <w:charset w:val="00"/>
     <w:family w:val="swiss"/>
     <w:pitch w:val="variable"/>
-    <w:sig w:usb0="E0002AFF" w:usb1="C000247B" w:usb2="00000009" w:usb3="00000000" w:csb0="000001FF" w:csb1="00000000"/>
+    <w:sig w:usb0="E4002EFF" w:usb1="C000247B" w:usb2="00000009" w:usb3="00000000" w:csb0="000001FF" w:csb1="00000000"/>
   </w:font>
   <w:font w:name="Arial">
     <w:panose1 w:val="020B0604020202020204"/>
@@ -34758,13 +36476,13 @@
     <w:charset w:val="00"/>
     <w:family w:val="swiss"/>
     <w:pitch w:val="variable"/>
-    <w:sig w:usb0="E0002AFF" w:usb1="C000247B" w:usb2="00000009" w:usb3="00000000" w:csb0="000001FF" w:csb1="00000000"/>
+    <w:sig w:usb0="E4002EFF" w:usb1="C000247B" w:usb2="00000009" w:usb3="00000000" w:csb0="000001FF" w:csb1="00000000"/>
   </w:font>
 </w:fonts>
 </file>
 
 <file path=word/glossary/numbering.xml><?xml version="1.0" encoding="utf-8"?>
-<w:numbering xmlns:wpc="http://schemas.microsoft.com/office/word/2010/wordprocessingCanvas" xmlns:cx="http://schemas.microsoft.com/office/drawing/2014/chartex" xmlns:cx1="http://schemas.microsoft.com/office/drawing/2015/9/8/chartex" xmlns:cx2="http://schemas.microsoft.com/office/drawing/2015/10/21/chartex" xmlns:cx3="http://schemas.microsoft.com/office/drawing/2016/5/9/chartex" xmlns:cx4="http://schemas.microsoft.com/office/drawing/2016/5/10/chartex" xmlns:cx5="http://schemas.microsoft.com/office/drawing/2016/5/11/chartex" xmlns:cx6="http://schemas.microsoft.com/office/drawing/2016/5/12/chartex" xmlns:cx7="http://schemas.microsoft.com/office/drawing/2016/5/13/chartex" xmlns:cx8="http://schemas.microsoft.com/office/drawing/2016/5/14/chartex" xmlns:mc="http://schemas.openxmlformats.org/markup-compatibility/2006" xmlns:aink="http://schemas.microsoft.com/office/drawing/2016/ink" xmlns:am3d="http://schemas.microsoft.com/office/drawing/2017/model3d" xmlns:o="urn:schemas-microsoft-com:office:office" xmlns:r="http://schemas.openxmlformats.org/officeDocument/2006/relationships" xmlns:m="http://schemas.openxmlformats.org/officeDocument/2006/math" xmlns:v="urn:schemas-microsoft-com:vml" xmlns:wp14="http://schemas.microsoft.com/office/word/2010/wordprocessingDrawing" xmlns:wp="http://schemas.openxmlformats.org/drawingml/2006/wordprocessingDrawing" xmlns:w10="urn:schemas-microsoft-com:office:word" xmlns:w="http://schemas.openxmlformats.org/wordprocessingml/2006/main" xmlns:w14="http://schemas.microsoft.com/office/word/2010/wordml" xmlns:w15="http://schemas.microsoft.com/office/word/2012/wordml" xmlns:w16cid="http://schemas.microsoft.com/office/word/2016/wordml/cid" xmlns:w16se="http://schemas.microsoft.com/office/word/2015/wordml/symex" xmlns:wpg="http://schemas.microsoft.com/office/word/2010/wordprocessingGroup" xmlns:wpi="http://schemas.microsoft.com/office/word/2010/wordprocessingInk" xmlns:wne="http://schemas.microsoft.com/office/word/2006/wordml" xmlns:wps="http://schemas.microsoft.com/office/word/2010/wordprocessingShape" mc:Ignorable="w14 w15 w16se w16cid wp14">
+<w:numbering xmlns:wpc="http://schemas.microsoft.com/office/word/2010/wordprocessingCanvas" xmlns:cx="http://schemas.microsoft.com/office/drawing/2014/chartex" xmlns:cx1="http://schemas.microsoft.com/office/drawing/2015/9/8/chartex" xmlns:cx2="http://schemas.microsoft.com/office/drawing/2015/10/21/chartex" xmlns:cx3="http://schemas.microsoft.com/office/drawing/2016/5/9/chartex" xmlns:cx4="http://schemas.microsoft.com/office/drawing/2016/5/10/chartex" xmlns:cx5="http://schemas.microsoft.com/office/drawing/2016/5/11/chartex" xmlns:cx6="http://schemas.microsoft.com/office/drawing/2016/5/12/chartex" xmlns:cx7="http://schemas.microsoft.com/office/drawing/2016/5/13/chartex" xmlns:cx8="http://schemas.microsoft.com/office/drawing/2016/5/14/chartex" xmlns:mc="http://schemas.openxmlformats.org/markup-compatibility/2006" xmlns:aink="http://schemas.microsoft.com/office/drawing/2016/ink" xmlns:am3d="http://schemas.microsoft.com/office/drawing/2017/model3d" xmlns:o="urn:schemas-microsoft-com:office:office" xmlns:r="http://schemas.openxmlformats.org/officeDocument/2006/relationships" xmlns:m="http://schemas.openxmlformats.org/officeDocument/2006/math" xmlns:v="urn:schemas-microsoft-com:vml" xmlns:wp14="http://schemas.microsoft.com/office/word/2010/wordprocessingDrawing" xmlns:wp="http://schemas.openxmlformats.org/drawingml/2006/wordprocessingDrawing" xmlns:w10="urn:schemas-microsoft-com:office:word" xmlns:w="http://schemas.openxmlformats.org/wordprocessingml/2006/main" xmlns:w14="http://schemas.microsoft.com/office/word/2010/wordml" xmlns:w15="http://schemas.microsoft.com/office/word/2012/wordml" xmlns:w16cex="http://schemas.microsoft.com/office/word/2018/wordml/cex" xmlns:w16cid="http://schemas.microsoft.com/office/word/2016/wordml/cid" xmlns:w16="http://schemas.microsoft.com/office/word/2018/wordml" xmlns:w16sdtdh="http://schemas.microsoft.com/office/word/2020/wordml/sdtdatahash" xmlns:w16se="http://schemas.microsoft.com/office/word/2015/wordml/symex" xmlns:wpg="http://schemas.microsoft.com/office/word/2010/wordprocessingGroup" xmlns:wpi="http://schemas.microsoft.com/office/word/2010/wordprocessingInk" xmlns:wne="http://schemas.microsoft.com/office/word/2006/wordml" xmlns:wps="http://schemas.microsoft.com/office/word/2010/wordprocessingShape" mc:Ignorable="w14 w15 w16se w16cid w16 w16cex w16sdtdh wp14">
   <w:abstractNum w:abstractNumId="0" w15:restartNumberingAfterBreak="0">
     <w:nsid w:val="FFFFFF89"/>
     <w:multiLevelType w:val="singleLevel"/>
@@ -34772,7 +36490,6 @@
     <w:lvl w:ilvl="0">
       <w:start w:val="1"/>
       <w:numFmt w:val="bullet"/>
-      <w:pStyle w:val="Aufzhlungszeichen1"/>
       <w:lvlText w:val="•"/>
       <w:lvlJc w:val="left"/>
       <w:pPr>
@@ -34791,7 +36508,7 @@
 </file>
 
 <file path=word/glossary/settings.xml><?xml version="1.0" encoding="utf-8"?>
-<w:settings xmlns:mc="http://schemas.openxmlformats.org/markup-compatibility/2006" xmlns:o="urn:schemas-microsoft-com:office:office" xmlns:r="http://schemas.openxmlformats.org/officeDocument/2006/relationships" xmlns:m="http://schemas.openxmlformats.org/officeDocument/2006/math" xmlns:v="urn:schemas-microsoft-com:vml" xmlns:w10="urn:schemas-microsoft-com:office:word" xmlns:w="http://schemas.openxmlformats.org/wordprocessingml/2006/main" xmlns:w14="http://schemas.microsoft.com/office/word/2010/wordml" xmlns:w15="http://schemas.microsoft.com/office/word/2012/wordml" xmlns:w16cid="http://schemas.microsoft.com/office/word/2016/wordml/cid" xmlns:w16se="http://schemas.microsoft.com/office/word/2015/wordml/symex" xmlns:sl="http://schemas.openxmlformats.org/schemaLibrary/2006/main" mc:Ignorable="w14 w15 w16se w16cid">
+<w:settings xmlns:mc="http://schemas.openxmlformats.org/markup-compatibility/2006" xmlns:o="urn:schemas-microsoft-com:office:office" xmlns:r="http://schemas.openxmlformats.org/officeDocument/2006/relationships" xmlns:m="http://schemas.openxmlformats.org/officeDocument/2006/math" xmlns:v="urn:schemas-microsoft-com:vml" xmlns:w10="urn:schemas-microsoft-com:office:word" xmlns:w="http://schemas.openxmlformats.org/wordprocessingml/2006/main" xmlns:w14="http://schemas.microsoft.com/office/word/2010/wordml" xmlns:w15="http://schemas.microsoft.com/office/word/2012/wordml" xmlns:w16cex="http://schemas.microsoft.com/office/word/2018/wordml/cex" xmlns:w16cid="http://schemas.microsoft.com/office/word/2016/wordml/cid" xmlns:w16="http://schemas.microsoft.com/office/word/2018/wordml" xmlns:w16sdtdh="http://schemas.microsoft.com/office/word/2020/wordml/sdtdatahash" xmlns:w16se="http://schemas.microsoft.com/office/word/2015/wordml/symex" xmlns:sl="http://schemas.openxmlformats.org/schemaLibrary/2006/main" mc:Ignorable="w14 w15 w16se w16cid w16 w16cex w16sdtdh">
   <w:view w:val="normal"/>
   <w:defaultTabStop w:val="708"/>
   <w:hyphenationZone w:val="425"/>
@@ -34807,18 +36524,38 @@
   </w:compat>
   <w:rsids>
     <w:rsidRoot w:val="00347419"/>
+    <w:rsid w:val="00040AC7"/>
     <w:rsid w:val="000B09FB"/>
+    <w:rsid w:val="00164B7B"/>
+    <w:rsid w:val="00187B43"/>
+    <w:rsid w:val="001B3EBE"/>
     <w:rsid w:val="00250D45"/>
+    <w:rsid w:val="002E1547"/>
+    <w:rsid w:val="00344FF1"/>
     <w:rsid w:val="00347419"/>
     <w:rsid w:val="003C42DC"/>
     <w:rsid w:val="00485A6A"/>
     <w:rsid w:val="004A393C"/>
+    <w:rsid w:val="004C2785"/>
     <w:rsid w:val="005D4851"/>
     <w:rsid w:val="00681448"/>
+    <w:rsid w:val="007115CF"/>
+    <w:rsid w:val="007B6356"/>
+    <w:rsid w:val="007E10EA"/>
+    <w:rsid w:val="00800207"/>
+    <w:rsid w:val="00824E1A"/>
     <w:rsid w:val="00865E47"/>
+    <w:rsid w:val="008A0BA6"/>
+    <w:rsid w:val="009B1EBB"/>
     <w:rsid w:val="00A33484"/>
+    <w:rsid w:val="00A8296F"/>
     <w:rsid w:val="00B15133"/>
+    <w:rsid w:val="00B2066A"/>
+    <w:rsid w:val="00BF107D"/>
     <w:rsid w:val="00D066E6"/>
+    <w:rsid w:val="00DC2F2A"/>
+    <w:rsid w:val="00ED65D3"/>
+    <w:rsid w:val="00FB7CA4"/>
   </w:rsids>
   <m:mathPr>
     <m:mathFont m:val="Cambria Math"/>
@@ -34842,7 +36579,7 @@
 </file>
 
 <file path=word/glossary/styles.xml><?xml version="1.0" encoding="utf-8"?>
-<w:styles xmlns:mc="http://schemas.openxmlformats.org/markup-compatibility/2006" xmlns:r="http://schemas.openxmlformats.org/officeDocument/2006/relationships" xmlns:w="http://schemas.openxmlformats.org/wordprocessingml/2006/main" xmlns:w14="http://schemas.microsoft.com/office/word/2010/wordml" xmlns:w15="http://schemas.microsoft.com/office/word/2012/wordml" xmlns:w16cid="http://schemas.microsoft.com/office/word/2016/wordml/cid" xmlns:w16se="http://schemas.microsoft.com/office/word/2015/wordml/symex" mc:Ignorable="w14 w15 w16se w16cid">
+<w:styles xmlns:mc="http://schemas.openxmlformats.org/markup-compatibility/2006" xmlns:r="http://schemas.openxmlformats.org/officeDocument/2006/relationships" xmlns:w="http://schemas.openxmlformats.org/wordprocessingml/2006/main" xmlns:w14="http://schemas.microsoft.com/office/word/2010/wordml" xmlns:w15="http://schemas.microsoft.com/office/word/2012/wordml" xmlns:w16cex="http://schemas.microsoft.com/office/word/2018/wordml/cex" xmlns:w16cid="http://schemas.microsoft.com/office/word/2016/wordml/cid" xmlns:w16="http://schemas.microsoft.com/office/word/2018/wordml" xmlns:w16sdtdh="http://schemas.microsoft.com/office/word/2020/wordml/sdtdatahash" xmlns:w16se="http://schemas.microsoft.com/office/word/2015/wordml/symex" mc:Ignorable="w14 w15 w16se w16cid w16 w16cex w16sdtdh">
   <w:docDefaults>
     <w:rPrDefault>
       <w:rPr>
@@ -34858,7 +36595,7 @@
       </w:pPr>
     </w:pPrDefault>
   </w:docDefaults>
-  <w:latentStyles w:defLockedState="0" w:defUIPriority="99" w:defSemiHidden="0" w:defUnhideWhenUsed="0" w:defQFormat="0" w:count="375">
+  <w:latentStyles w:defLockedState="0" w:defUIPriority="99" w:defSemiHidden="0" w:defUnhideWhenUsed="0" w:defQFormat="0" w:count="376">
     <w:lsdException w:name="Normal" w:uiPriority="0" w:qFormat="1"/>
     <w:lsdException w:name="heading 1" w:uiPriority="9" w:qFormat="1"/>
     <w:lsdException w:name="heading 2" w:semiHidden="1" w:uiPriority="9" w:unhideWhenUsed="1" w:qFormat="1"/>
@@ -35234,6 +36971,7 @@
     <w:lsdException w:name="Smart Hyperlink" w:semiHidden="1" w:unhideWhenUsed="1"/>
     <w:lsdException w:name="Hashtag" w:semiHidden="1" w:unhideWhenUsed="1"/>
     <w:lsdException w:name="Unresolved Mention" w:semiHidden="1" w:unhideWhenUsed="1"/>
+    <w:lsdException w:name="Smart Link" w:semiHidden="1" w:unhideWhenUsed="1"/>
   </w:latentStyles>
   <w:style w:type="paragraph" w:default="1" w:styleId="Standard">
     <w:name w:val="Normal"/>
@@ -35266,110 +37004,11 @@
     <w:semiHidden/>
     <w:unhideWhenUsed/>
   </w:style>
-  <w:style w:type="paragraph" w:customStyle="1" w:styleId="C7258A641B0249709FC9F66127A832AE">
-    <w:name w:val="C7258A641B0249709FC9F66127A832AE"/>
-  </w:style>
-  <w:style w:type="paragraph" w:customStyle="1" w:styleId="EB54E431A4774648A699A69DA0B613DC">
-    <w:name w:val="EB54E431A4774648A699A69DA0B613DC"/>
-  </w:style>
-  <w:style w:type="paragraph" w:customStyle="1" w:styleId="FB24544D0A8E453C992F4630CCDBF9B0">
-    <w:name w:val="FB24544D0A8E453C992F4630CCDBF9B0"/>
-  </w:style>
-  <w:style w:type="paragraph" w:customStyle="1" w:styleId="D99DA0352A4E4A50A45DFADACFD39528">
-    <w:name w:val="D99DA0352A4E4A50A45DFADACFD39528"/>
-  </w:style>
-  <w:style w:type="paragraph" w:customStyle="1" w:styleId="847B6DA1B8D346A2A8F4D07BBCB9E8B9">
-    <w:name w:val="847B6DA1B8D346A2A8F4D07BBCB9E8B9"/>
-  </w:style>
-  <w:style w:type="paragraph" w:customStyle="1" w:styleId="F8302D11331F4D4D8F88653E3DF6B734">
-    <w:name w:val="F8302D11331F4D4D8F88653E3DF6B734"/>
-  </w:style>
-  <w:style w:type="paragraph" w:customStyle="1" w:styleId="3D7025878624454D91AF4EA88787D610">
-    <w:name w:val="3D7025878624454D91AF4EA88787D610"/>
-  </w:style>
-  <w:style w:type="paragraph" w:customStyle="1" w:styleId="Aufzhlungszeichen1">
-    <w:name w:val="Aufzählungszeichen1"/>
-    <w:basedOn w:val="Standard"/>
-    <w:uiPriority w:val="1"/>
-    <w:unhideWhenUsed/>
-    <w:qFormat/>
-    <w:pPr>
-      <w:numPr>
-        <w:numId w:val="1"/>
-      </w:numPr>
-      <w:spacing w:before="40" w:after="40" w:line="288" w:lineRule="auto"/>
-    </w:pPr>
-    <w:rPr>
-      <w:rFonts w:eastAsiaTheme="minorHAnsi"/>
-      <w:color w:val="595959" w:themeColor="text1" w:themeTint="A6"/>
-      <w:kern w:val="20"/>
-      <w:sz w:val="20"/>
-      <w:szCs w:val="20"/>
-      <w:lang w:eastAsia="en-US"/>
-    </w:rPr>
-  </w:style>
-  <w:style w:type="paragraph" w:customStyle="1" w:styleId="EE3412FBC8374BB0893B8076D388BCF6">
-    <w:name w:val="EE3412FBC8374BB0893B8076D388BCF6"/>
-  </w:style>
-  <w:style w:type="paragraph" w:customStyle="1" w:styleId="3973400A070C4285B62E1ADCA4B6C9BF">
-    <w:name w:val="3973400A070C4285B62E1ADCA4B6C9BF"/>
-  </w:style>
-  <w:style w:type="paragraph" w:customStyle="1" w:styleId="AD6D69AA68A748748B922006EEC93323">
-    <w:name w:val="AD6D69AA68A748748B922006EEC93323"/>
-  </w:style>
-  <w:style w:type="paragraph" w:customStyle="1" w:styleId="FF5657B5908E4355BB2FDA26E6A37D91">
-    <w:name w:val="FF5657B5908E4355BB2FDA26E6A37D91"/>
-  </w:style>
-  <w:style w:type="paragraph" w:customStyle="1" w:styleId="C1580612D78B4195979699E334DF89C1">
-    <w:name w:val="C1580612D78B4195979699E334DF89C1"/>
-  </w:style>
-  <w:style w:type="paragraph" w:customStyle="1" w:styleId="A260A4426B244C1D9949DC2CE66CC9AF">
-    <w:name w:val="A260A4426B244C1D9949DC2CE66CC9AF"/>
-  </w:style>
-  <w:style w:type="paragraph" w:customStyle="1" w:styleId="7D5879D43FB24D00BB3306C6B039EEED">
-    <w:name w:val="7D5879D43FB24D00BB3306C6B039EEED"/>
-  </w:style>
-  <w:style w:type="paragraph" w:customStyle="1" w:styleId="EC42A545BA56403798E1CE8766B053AE">
-    <w:name w:val="EC42A545BA56403798E1CE8766B053AE"/>
-  </w:style>
-  <w:style w:type="paragraph" w:customStyle="1" w:styleId="996CE5D272A14D8CBF11A66E97DBF9E0">
-    <w:name w:val="996CE5D272A14D8CBF11A66E97DBF9E0"/>
-  </w:style>
-  <w:style w:type="paragraph" w:customStyle="1" w:styleId="D44E809700ED4587AE04D2C22D9C1D19">
-    <w:name w:val="D44E809700ED4587AE04D2C22D9C1D19"/>
-  </w:style>
-  <w:style w:type="paragraph" w:customStyle="1" w:styleId="FC6F00F1457746CAA7787EA1C9C9615F">
-    <w:name w:val="FC6F00F1457746CAA7787EA1C9C9615F"/>
-  </w:style>
-  <w:style w:type="paragraph" w:customStyle="1" w:styleId="5D3783F124424B38BBC19C240435FD8E">
-    <w:name w:val="5D3783F124424B38BBC19C240435FD8E"/>
-  </w:style>
-  <w:style w:type="paragraph" w:customStyle="1" w:styleId="7D66762DFE79437F9D78F1503C60F2BD">
-    <w:name w:val="7D66762DFE79437F9D78F1503C60F2BD"/>
-  </w:style>
-  <w:style w:type="paragraph" w:customStyle="1" w:styleId="A6A82BE5A1A04D749E45B879604C25C7">
-    <w:name w:val="A6A82BE5A1A04D749E45B879604C25C7"/>
-  </w:style>
-  <w:style w:type="paragraph" w:customStyle="1" w:styleId="335CC4BE00854BDFAD096366119C3122">
-    <w:name w:val="335CC4BE00854BDFAD096366119C3122"/>
-  </w:style>
-  <w:style w:type="paragraph" w:customStyle="1" w:styleId="23F722C4C33F44F1A831DFD12D6A6D24">
-    <w:name w:val="23F722C4C33F44F1A831DFD12D6A6D24"/>
-  </w:style>
-  <w:style w:type="paragraph" w:customStyle="1" w:styleId="8FF7B7DE9A6944479EA2C204D3E77D5A">
-    <w:name w:val="8FF7B7DE9A6944479EA2C204D3E77D5A"/>
-  </w:style>
   <w:style w:type="paragraph" w:customStyle="1" w:styleId="0E38BA189D69455586AA06608F98D7C3">
     <w:name w:val="0E38BA189D69455586AA06608F98D7C3"/>
   </w:style>
   <w:style w:type="paragraph" w:customStyle="1" w:styleId="97D3B644256040ECAABD30CBF4C5E7D7">
     <w:name w:val="97D3B644256040ECAABD30CBF4C5E7D7"/>
-  </w:style>
-  <w:style w:type="paragraph" w:customStyle="1" w:styleId="6BEB638FE4974AEA93996F77EF9F25B4">
-    <w:name w:val="6BEB638FE4974AEA93996F77EF9F25B4"/>
-  </w:style>
-  <w:style w:type="paragraph" w:customStyle="1" w:styleId="054F285535CD4F33992BC550C882D4EC">
-    <w:name w:val="054F285535CD4F33992BC550C882D4EC"/>
   </w:style>
   <w:style w:type="paragraph" w:customStyle="1" w:styleId="KeinLeerraum1">
     <w:name w:val="Kein Leerraum1"/>
@@ -35407,7 +37046,7 @@
 </file>
 
 <file path=word/glossary/webSettings.xml><?xml version="1.0" encoding="utf-8"?>
-<w:webSettings xmlns:mc="http://schemas.openxmlformats.org/markup-compatibility/2006" xmlns:r="http://schemas.openxmlformats.org/officeDocument/2006/relationships" xmlns:w="http://schemas.openxmlformats.org/wordprocessingml/2006/main" xmlns:w14="http://schemas.microsoft.com/office/word/2010/wordml" xmlns:w15="http://schemas.microsoft.com/office/word/2012/wordml" xmlns:w16cid="http://schemas.microsoft.com/office/word/2016/wordml/cid" xmlns:w16se="http://schemas.microsoft.com/office/word/2015/wordml/symex" mc:Ignorable="w14 w15 w16se w16cid">
+<w:webSettings xmlns:mc="http://schemas.openxmlformats.org/markup-compatibility/2006" xmlns:r="http://schemas.openxmlformats.org/officeDocument/2006/relationships" xmlns:w="http://schemas.openxmlformats.org/wordprocessingml/2006/main" xmlns:w14="http://schemas.microsoft.com/office/word/2010/wordml" xmlns:w15="http://schemas.microsoft.com/office/word/2012/wordml" xmlns:w16cex="http://schemas.microsoft.com/office/word/2018/wordml/cex" xmlns:w16cid="http://schemas.microsoft.com/office/word/2016/wordml/cid" xmlns:w16="http://schemas.microsoft.com/office/word/2018/wordml" xmlns:w16sdtdh="http://schemas.microsoft.com/office/word/2020/wordml/sdtdatahash" xmlns:w16se="http://schemas.microsoft.com/office/word/2015/wordml/symex" mc:Ignorable="w14 w15 w16se w16cid w16 w16cex w16sdtdh">
   <w:optimizeForBrowser/>
   <w:allowPNG/>
 </w:webSettings>
@@ -35711,22 +37350,22 @@
 </file>
 
 <file path=customXml/item2.xml><?xml version="1.0" encoding="utf-8"?>
+<mappings xmlns="http://schemas.microsoft.com/pics">
+  <picture>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</picture>
+</mappings>
+</file>
+
+<file path=customXml/item3.xml><?xml version="1.0" encoding="utf-8"?>
+<b:Sources xmlns:b="http://schemas.openxmlformats.org/officeDocument/2006/bibliography" SelectedStyle="\APA.XSL" StyleName="APA"/>
+</file>
+
+<file path=customXml/item4.xml><?xml version="1.0" encoding="utf-8"?>
 <?mso-contentType ?>
 <FormTemplates xmlns="http://schemas.microsoft.com/sharepoint/v3/contenttype/forms">
   <Display>DocumentLibraryForm</Display>
   <Edit>AssetEditForm</Edit>
   <New>DocumentLibraryForm</New>
 </FormTemplates>
-</file>
-
-<file path=customXml/item3.xml><?xml version="1.0" encoding="utf-8"?>
-<mappings xmlns="http://schemas.microsoft.com/pics">
-  <picture>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</picture>
-</mappings>
-</file>
-
-<file path=customXml/item4.xml><?xml version="1.0" encoding="utf-8"?>
-<b:Sources xmlns:b="http://schemas.openxmlformats.org/officeDocument/2006/bibliography" SelectedStyle="\APA.XSL" StyleName="APA"/>
 </file>
 
 <file path=customXml/itemProps1.xml><?xml version="1.0" encoding="utf-8"?>
@@ -35738,14 +37377,6 @@
 </file>
 
 <file path=customXml/itemProps2.xml><?xml version="1.0" encoding="utf-8"?>
-<ds:datastoreItem xmlns:ds="http://schemas.openxmlformats.org/officeDocument/2006/customXml" ds:itemID="{794FC27F-ACD1-43CD-9462-095134B3AEBE}">
-  <ds:schemaRefs>
-    <ds:schemaRef ds:uri="http://schemas.microsoft.com/sharepoint/v3/contenttype/forms"/>
-  </ds:schemaRefs>
-</ds:datastoreItem>
-</file>
-
-<file path=customXml/itemProps3.xml><?xml version="1.0" encoding="utf-8"?>
 <ds:datastoreItem xmlns:ds="http://schemas.openxmlformats.org/officeDocument/2006/customXml" ds:itemID="{F679E4D8-73D9-412D-B716-777944E71373}">
   <ds:schemaRefs>
     <ds:schemaRef ds:uri="http://schemas.microsoft.com/pics"/>
@@ -35753,10 +37384,18 @@
 </ds:datastoreItem>
 </file>
 
-<file path=customXml/itemProps4.xml><?xml version="1.0" encoding="utf-8"?>
-<ds:datastoreItem xmlns:ds="http://schemas.openxmlformats.org/officeDocument/2006/customXml" ds:itemID="{93658F5B-9690-40B1-AD69-CED88A08099E}">
+<file path=customXml/itemProps3.xml><?xml version="1.0" encoding="utf-8"?>
+<ds:datastoreItem xmlns:ds="http://schemas.openxmlformats.org/officeDocument/2006/customXml" ds:itemID="{20B70536-BD23-4992-AB4C-79BF5F7D3AE3}">
   <ds:schemaRefs>
     <ds:schemaRef ds:uri="http://schemas.openxmlformats.org/officeDocument/2006/bibliography"/>
   </ds:schemaRefs>
 </ds:datastoreItem>
+</file>
+
+<file path=customXml/itemProps4.xml><?xml version="1.0" encoding="utf-8"?>
+<ds:datastoreItem xmlns:ds="http://schemas.openxmlformats.org/officeDocument/2006/customXml" ds:itemID="{794FC27F-ACD1-43CD-9462-095134B3AEBE}">
+  <ds:schemaRefs>
+    <ds:schemaRef ds:uri="http://schemas.microsoft.com/sharepoint/v3/contenttype/forms"/>
+  </ds:schemaRefs>
+</ds:datastoreItem>
 </file>
</xml_diff>